<commit_message>
Remove Lawphil from repositories column in Assignment 2
Co-Authored-By: Claude Opus 5.5 <noreply@anthropic.com>
Claude-Session: https://claude.ai/code/session_01A1TMNGTya859Bt4g6Da5kK
</commit_message>
<xml_diff>
--- a/BORJA_Assignment 2.docx
+++ b/BORJA_Assignment 2.docx
@@ -838,7 +838,7 @@
                 <w:sz w:val="28"/>
                 <w:szCs w:val="28"/>
               </w:rPr>
-              <w:t xml:space="preserve">Official Gazette; Lawphil Project; Supreme Court E-Library</w:t>
+              <w:t xml:space="preserve">Official Gazette; Supreme Court E-Library</w:t>
             </w:r>
           </w:p>
         </w:tc>
@@ -942,7 +942,7 @@
                 <w:sz w:val="28"/>
                 <w:szCs w:val="28"/>
               </w:rPr>
-              <w:t xml:space="preserve">Official Gazette; Lawphil Project; Supreme Court E-Library</w:t>
+              <w:t xml:space="preserve">Official Gazette; Supreme Court E-Library</w:t>
             </w:r>
           </w:p>
         </w:tc>
@@ -1046,7 +1046,7 @@
                 <w:sz w:val="28"/>
                 <w:szCs w:val="28"/>
               </w:rPr>
-              <w:t xml:space="preserve">Official Gazette; Lawphil Project; Supreme Court E-Library</w:t>
+              <w:t xml:space="preserve">Official Gazette; Supreme Court E-Library</w:t>
             </w:r>
           </w:p>
         </w:tc>
@@ -1150,7 +1150,7 @@
                 <w:sz w:val="28"/>
                 <w:szCs w:val="28"/>
               </w:rPr>
-              <w:t xml:space="preserve">Official Gazette; Lawphil Project; Supreme Court E-Library</w:t>
+              <w:t xml:space="preserve">Official Gazette; Supreme Court E-Library</w:t>
             </w:r>
           </w:p>
         </w:tc>
@@ -1290,7 +1290,7 @@
                 <w:sz w:val="28"/>
                 <w:szCs w:val="28"/>
               </w:rPr>
-              <w:t xml:space="preserve">Official Gazette; Lawphil Project; Supreme Court E-Library</w:t>
+              <w:t xml:space="preserve">Official Gazette; Supreme Court E-Library</w:t>
             </w:r>
           </w:p>
         </w:tc>
@@ -1430,7 +1430,7 @@
                 <w:sz w:val="28"/>
                 <w:szCs w:val="28"/>
               </w:rPr>
-              <w:t xml:space="preserve">Official Gazette; Lawphil Project; Supreme Court E-Library</w:t>
+              <w:t xml:space="preserve">Official Gazette; Supreme Court E-Library</w:t>
             </w:r>
           </w:p>
         </w:tc>
@@ -1534,7 +1534,7 @@
                 <w:sz w:val="28"/>
                 <w:szCs w:val="28"/>
               </w:rPr>
-              <w:t xml:space="preserve">Official Gazette; Lawphil Project; Supreme Court E-Library</w:t>
+              <w:t xml:space="preserve">Official Gazette; Supreme Court E-Library</w:t>
             </w:r>
           </w:p>
         </w:tc>
@@ -1638,7 +1638,7 @@
                 <w:sz w:val="28"/>
                 <w:szCs w:val="28"/>
               </w:rPr>
-              <w:t xml:space="preserve">Official Gazette; Lawphil Project; Supreme Court E-Library</w:t>
+              <w:t xml:space="preserve">Official Gazette; Supreme Court E-Library</w:t>
             </w:r>
           </w:p>
         </w:tc>
@@ -1760,7 +1760,7 @@
                 <w:sz w:val="28"/>
                 <w:szCs w:val="28"/>
               </w:rPr>
-              <w:t xml:space="preserve">Official Gazette; Lawphil Project; Supreme Court E-Library</w:t>
+              <w:t xml:space="preserve">Official Gazette; Supreme Court E-Library</w:t>
             </w:r>
           </w:p>
         </w:tc>
@@ -1864,7 +1864,7 @@
                 <w:sz w:val="28"/>
                 <w:szCs w:val="28"/>
               </w:rPr>
-              <w:t xml:space="preserve">Official Gazette; Lawphil Project; Supreme Court E-Library</w:t>
+              <w:t xml:space="preserve">Official Gazette; Supreme Court E-Library</w:t>
             </w:r>
           </w:p>
         </w:tc>
@@ -2059,7 +2059,7 @@
                 <w:sz w:val="28"/>
                 <w:szCs w:val="28"/>
               </w:rPr>
-              <w:t xml:space="preserve">Official Gazette; Lawphil Project; Supreme Court E-Library</w:t>
+              <w:t xml:space="preserve">Official Gazette; Supreme Court E-Library</w:t>
             </w:r>
           </w:p>
         </w:tc>
@@ -2181,7 +2181,7 @@
                 <w:sz w:val="28"/>
                 <w:szCs w:val="28"/>
               </w:rPr>
-              <w:t xml:space="preserve">Official Gazette; Lawphil Project; Supreme Court E-Library</w:t>
+              <w:t xml:space="preserve">Official Gazette; Supreme Court E-Library</w:t>
             </w:r>
           </w:p>
         </w:tc>
@@ -2285,7 +2285,7 @@
                 <w:sz w:val="28"/>
                 <w:szCs w:val="28"/>
               </w:rPr>
-              <w:t xml:space="preserve">Official Gazette; Lawphil Project; Supreme Court E-Library</w:t>
+              <w:t xml:space="preserve">Official Gazette; Supreme Court E-Library</w:t>
             </w:r>
           </w:p>
         </w:tc>
@@ -2425,7 +2425,7 @@
                 <w:sz w:val="28"/>
                 <w:szCs w:val="28"/>
               </w:rPr>
-              <w:t xml:space="preserve">Official Gazette; Lawphil Project; Supreme Court E-Library</w:t>
+              <w:t xml:space="preserve">Official Gazette; Supreme Court E-Library</w:t>
             </w:r>
           </w:p>
         </w:tc>
@@ -2547,7 +2547,7 @@
                 <w:sz w:val="28"/>
                 <w:szCs w:val="28"/>
               </w:rPr>
-              <w:t xml:space="preserve">Official Gazette; Lawphil Project; Supreme Court E-Library</w:t>
+              <w:t xml:space="preserve">Official Gazette; Supreme Court E-Library</w:t>
             </w:r>
           </w:p>
         </w:tc>
@@ -2669,7 +2669,7 @@
                 <w:sz w:val="28"/>
                 <w:szCs w:val="28"/>
               </w:rPr>
-              <w:t xml:space="preserve">Official Gazette; Lawphil Project; Supreme Court E-Library</w:t>
+              <w:t xml:space="preserve">Official Gazette; Supreme Court E-Library</w:t>
             </w:r>
           </w:p>
         </w:tc>
@@ -2773,7 +2773,7 @@
                 <w:sz w:val="28"/>
                 <w:szCs w:val="28"/>
               </w:rPr>
-              <w:t xml:space="preserve">Official Gazette; Lawphil Project; Supreme Court E-Library</w:t>
+              <w:t xml:space="preserve">Official Gazette; Supreme Court E-Library</w:t>
             </w:r>
           </w:p>
         </w:tc>
@@ -2877,7 +2877,7 @@
                 <w:sz w:val="28"/>
                 <w:szCs w:val="28"/>
               </w:rPr>
-              <w:t xml:space="preserve">Official Gazette; Lawphil Project; Supreme Court E-Library</w:t>
+              <w:t xml:space="preserve">Official Gazette; Supreme Court E-Library</w:t>
             </w:r>
           </w:p>
         </w:tc>
@@ -2981,7 +2981,7 @@
                 <w:sz w:val="28"/>
                 <w:szCs w:val="28"/>
               </w:rPr>
-              <w:t xml:space="preserve">Official Gazette; Lawphil Project; Supreme Court E-Library</w:t>
+              <w:t xml:space="preserve">Official Gazette; Supreme Court E-Library</w:t>
             </w:r>
           </w:p>
         </w:tc>
@@ -3085,7 +3085,7 @@
                 <w:sz w:val="28"/>
                 <w:szCs w:val="28"/>
               </w:rPr>
-              <w:t xml:space="preserve">Official Gazette; Lawphil Project; Supreme Court E-Library</w:t>
+              <w:t xml:space="preserve">Official Gazette; Supreme Court E-Library</w:t>
             </w:r>
           </w:p>
         </w:tc>
@@ -3180,7 +3180,7 @@
                 <w:sz w:val="28"/>
                 <w:szCs w:val="28"/>
               </w:rPr>
-              <w:t xml:space="preserve">Official Gazette; Lawphil Project; Supreme Court E-Library</w:t>
+              <w:t xml:space="preserve">Official Gazette; Supreme Court E-Library</w:t>
             </w:r>
           </w:p>
         </w:tc>
@@ -3275,7 +3275,7 @@
                 <w:sz w:val="28"/>
                 <w:szCs w:val="28"/>
               </w:rPr>
-              <w:t xml:space="preserve">Official Gazette; Lawphil Project; Supreme Court E-Library</w:t>
+              <w:t xml:space="preserve">Official Gazette; Supreme Court E-Library</w:t>
             </w:r>
           </w:p>
         </w:tc>
@@ -3370,7 +3370,7 @@
                 <w:sz w:val="28"/>
                 <w:szCs w:val="28"/>
               </w:rPr>
-              <w:t xml:space="preserve">Official Gazette; Lawphil Project; Supreme Court E-Library</w:t>
+              <w:t xml:space="preserve">Official Gazette; Supreme Court E-Library</w:t>
             </w:r>
           </w:p>
         </w:tc>
@@ -3465,7 +3465,7 @@
                 <w:sz w:val="28"/>
                 <w:szCs w:val="28"/>
               </w:rPr>
-              <w:t xml:space="preserve">Official Gazette; Lawphil Project; Supreme Court E-Library</w:t>
+              <w:t xml:space="preserve">Official Gazette; Supreme Court E-Library</w:t>
             </w:r>
           </w:p>
         </w:tc>
@@ -3560,7 +3560,7 @@
                 <w:sz w:val="28"/>
                 <w:szCs w:val="28"/>
               </w:rPr>
-              <w:t xml:space="preserve">Official Gazette; Lawphil Project; Supreme Court E-Library</w:t>
+              <w:t xml:space="preserve">Official Gazette; Supreme Court E-Library</w:t>
             </w:r>
           </w:p>
         </w:tc>
@@ -3655,7 +3655,7 @@
                 <w:sz w:val="28"/>
                 <w:szCs w:val="28"/>
               </w:rPr>
-              <w:t xml:space="preserve">Official Gazette; Lawphil Project; Supreme Court E-Library</w:t>
+              <w:t xml:space="preserve">Official Gazette; Supreme Court E-Library</w:t>
             </w:r>
           </w:p>
         </w:tc>
@@ -3768,7 +3768,7 @@
                 <w:sz w:val="28"/>
                 <w:szCs w:val="28"/>
               </w:rPr>
-              <w:t xml:space="preserve">Official Gazette; Lawphil Project; Supreme Court E-Library</w:t>
+              <w:t xml:space="preserve">Official Gazette; Supreme Court E-Library</w:t>
             </w:r>
           </w:p>
         </w:tc>
@@ -5808,7 +5808,7 @@
                 <w:sz w:val="28"/>
                 <w:szCs w:val="28"/>
               </w:rPr>
-              <w:t xml:space="preserve">Supreme Court E-Library; Supreme Court website (sc.judiciary.gov.ph); Lawphil Project</w:t>
+              <w:t xml:space="preserve">Supreme Court E-Library; Supreme Court website (sc.judiciary.gov.ph)</w:t>
             </w:r>
           </w:p>
         </w:tc>
@@ -5921,7 +5921,7 @@
                 <w:sz w:val="28"/>
                 <w:szCs w:val="28"/>
               </w:rPr>
-              <w:t xml:space="preserve">Supreme Court E-Library; Supreme Court website (sc.judiciary.gov.ph); Lawphil Project</w:t>
+              <w:t xml:space="preserve">Supreme Court E-Library; Supreme Court website (sc.judiciary.gov.ph)</w:t>
             </w:r>
           </w:p>
         </w:tc>
@@ -6034,7 +6034,7 @@
                 <w:sz w:val="28"/>
                 <w:szCs w:val="28"/>
               </w:rPr>
-              <w:t xml:space="preserve">Philippine Reports, vol. 632; Supreme Court E-Library; Lawphil Project</w:t>
+              <w:t xml:space="preserve">Philippine Reports, vol. 632; Supreme Court E-Library</w:t>
             </w:r>
           </w:p>
         </w:tc>
@@ -6129,7 +6129,7 @@
                 <w:sz w:val="28"/>
                 <w:szCs w:val="28"/>
               </w:rPr>
-              <w:t xml:space="preserve">Philippine Reports, vols. 455 &amp; 525; Supreme Court E-Library; Lawphil Project</w:t>
+              <w:t xml:space="preserve">Philippine Reports, vols. 455 &amp; 525; Supreme Court E-Library</w:t>
             </w:r>
           </w:p>
         </w:tc>
@@ -6224,7 +6224,7 @@
                 <w:sz w:val="28"/>
                 <w:szCs w:val="28"/>
               </w:rPr>
-              <w:t xml:space="preserve">Philippine Reports, vol. 35; Supreme Court E-Library; Lawphil Project</w:t>
+              <w:t xml:space="preserve">Philippine Reports, vol. 35; Supreme Court E-Library</w:t>
             </w:r>
           </w:p>
         </w:tc>
@@ -6319,7 +6319,7 @@
                 <w:sz w:val="28"/>
                 <w:szCs w:val="28"/>
               </w:rPr>
-              <w:t xml:space="preserve">Supreme Court E-Library; Supreme Court website (sc.judiciary.gov.ph); Lawphil Project</w:t>
+              <w:t xml:space="preserve">Supreme Court E-Library; Supreme Court website (sc.judiciary.gov.ph)</w:t>
             </w:r>
           </w:p>
         </w:tc>
@@ -6414,7 +6414,7 @@
                 <w:sz w:val="28"/>
                 <w:szCs w:val="28"/>
               </w:rPr>
-              <w:t xml:space="preserve">Supreme Court E-Library; Supreme Court website (sc.judiciary.gov.ph); Lawphil Project</w:t>
+              <w:t xml:space="preserve">Supreme Court E-Library; Supreme Court website (sc.judiciary.gov.ph)</w:t>
             </w:r>
           </w:p>
         </w:tc>
@@ -6527,7 +6527,7 @@
                 <w:sz w:val="28"/>
                 <w:szCs w:val="28"/>
               </w:rPr>
-              <w:t xml:space="preserve">Supreme Court E-Library; Supreme Court website (sc.judiciary.gov.ph); Lawphil Project</w:t>
+              <w:t xml:space="preserve">Supreme Court E-Library; Supreme Court website (sc.judiciary.gov.ph)</w:t>
             </w:r>
           </w:p>
         </w:tc>
@@ -6622,7 +6622,7 @@
                 <w:sz w:val="28"/>
                 <w:szCs w:val="28"/>
               </w:rPr>
-              <w:t xml:space="preserve">Supreme Court E-Library; Supreme Court website (sc.judiciary.gov.ph); Lawphil Project</w:t>
+              <w:t xml:space="preserve">Supreme Court E-Library; Supreme Court website (sc.judiciary.gov.ph)</w:t>
             </w:r>
           </w:p>
         </w:tc>
@@ -6717,7 +6717,7 @@
                 <w:sz w:val="28"/>
                 <w:szCs w:val="28"/>
               </w:rPr>
-              <w:t xml:space="preserve">Philippine Reports, vol. 586; Supreme Court E-Library; Lawphil Project</w:t>
+              <w:t xml:space="preserve">Philippine Reports, vol. 586; Supreme Court E-Library</w:t>
             </w:r>
           </w:p>
         </w:tc>
@@ -6830,7 +6830,7 @@
                 <w:sz w:val="28"/>
                 <w:szCs w:val="28"/>
               </w:rPr>
-              <w:t xml:space="preserve">Supreme Court E-Library; Supreme Court website (sc.judiciary.gov.ph); Lawphil Project</w:t>
+              <w:t xml:space="preserve">Supreme Court E-Library; Supreme Court website (sc.judiciary.gov.ph)</w:t>
             </w:r>
           </w:p>
         </w:tc>
@@ -6925,7 +6925,7 @@
                 <w:sz w:val="28"/>
                 <w:szCs w:val="28"/>
               </w:rPr>
-              <w:t xml:space="preserve">Philippine Reports, vol. 562; Supreme Court E-Library; Lawphil Project</w:t>
+              <w:t xml:space="preserve">Philippine Reports, vol. 562; Supreme Court E-Library</w:t>
             </w:r>
           </w:p>
         </w:tc>

</xml_diff>

<commit_message>
Fix links and re-verified citations in Assignment 2
Make every URL a real hyperlink so wrapped links stay clickable in the
PDF, replace the Cebuano-language CHR page with the English statement
(July 4, 2023), add the RG Cruz byline to the May 10, 2023 ABS-CBN
article, and paraphrase the Australian marriage definition.

Co-Authored-By: Claude Opus 5.5 <noreply@anthropic.com>
Claude-Session: https://claude.ai/code/session_01A1TMNGTya859Bt4g6Da5kK
</commit_message>
<xml_diff>
--- a/BORJA_Assignment 2.docx
+++ b/BORJA_Assignment 2.docx
@@ -10997,7 +10997,7 @@
                 <w:sz w:val="28"/>
                 <w:szCs w:val="28"/>
               </w:rPr>
-              <w:t xml:space="preserve">Redefined marriage as “the union of 2 people to the exclusion of all others,” enacted after a national postal survey, with protections for religious celebrants.</w:t>
+              <w:t xml:space="preserve">Redefined marriage in the Marriage Act 1961 as a union of two people rather than of a man and a woman, following a national postal survey, while allowing religious celebrants to decline to solemnize same-sex marriages.</w:t>
             </w:r>
           </w:p>
         </w:tc>
@@ -13784,7 +13784,25 @@
                 <w:sz w:val="28"/>
                 <w:szCs w:val="28"/>
               </w:rPr>
-              <w:t xml:space="preserve"> https://ateneolj.com/archive/article/930.</w:t>
+              <w:t xml:space="preserve"> </w:t>
+            </w:r>
+            <w:hyperlink r:id="rId10">
+              <w:r>
+                <w:rPr>
+                  <w:rFonts w:ascii="Times New Roman" w:hAnsi="Times New Roman" w:cs="Times New Roman" w:eastAsia="Times New Roman"/>
+                  <w:sz w:val="28"/>
+                  <w:szCs w:val="28"/>
+                </w:rPr>
+                <w:t xml:space="preserve">https://ateneolj.com/archive/article/930</w:t>
+              </w:r>
+            </w:hyperlink>
+            <w:r>
+              <w:rPr>
+                <w:rFonts w:ascii="Times New Roman" w:hAnsi="Times New Roman" w:cs="Times New Roman" w:eastAsia="Times New Roman"/>
+                <w:sz w:val="28"/>
+                <w:szCs w:val="28"/>
+              </w:rPr>
+              <w:t xml:space="preserve">.</w:t>
             </w:r>
           </w:p>
           <w:p>
@@ -15123,7 +15141,25 @@
                 <w:sz w:val="28"/>
                 <w:szCs w:val="28"/>
               </w:rPr>
-              <w:t xml:space="preserve"> (Spring 2026 ed.), https://plato.stanford.edu/archives/spr2026/entries/marriage/.</w:t>
+              <w:t xml:space="preserve"> (Spring 2026 ed.), </w:t>
+            </w:r>
+            <w:hyperlink r:id="rId11">
+              <w:r>
+                <w:rPr>
+                  <w:rFonts w:ascii="Times New Roman" w:hAnsi="Times New Roman" w:cs="Times New Roman" w:eastAsia="Times New Roman"/>
+                  <w:sz w:val="28"/>
+                  <w:szCs w:val="28"/>
+                </w:rPr>
+                <w:t xml:space="preserve">https://plato.stanford.edu/archives/spr2026/entries/marriage/</w:t>
+              </w:r>
+            </w:hyperlink>
+            <w:r>
+              <w:rPr>
+                <w:rFonts w:ascii="Times New Roman" w:hAnsi="Times New Roman" w:cs="Times New Roman" w:eastAsia="Times New Roman"/>
+                <w:sz w:val="28"/>
+                <w:szCs w:val="28"/>
+              </w:rPr>
+              <w:t xml:space="preserve">.</w:t>
             </w:r>
           </w:p>
           <w:p>
@@ -15812,7 +15848,25 @@
                 <w:sz w:val="28"/>
                 <w:szCs w:val="28"/>
               </w:rPr>
-              <w:t xml:space="preserve"> https://law.upd.edu.ph/wp-content/uploads/2020/06/Finding-Fault-Falcis.pdf.</w:t>
+              <w:t xml:space="preserve"> </w:t>
+            </w:r>
+            <w:hyperlink r:id="rId12">
+              <w:r>
+                <w:rPr>
+                  <w:rFonts w:ascii="Times New Roman" w:hAnsi="Times New Roman" w:cs="Times New Roman" w:eastAsia="Times New Roman"/>
+                  <w:sz w:val="28"/>
+                  <w:szCs w:val="28"/>
+                </w:rPr>
+                <w:t xml:space="preserve">https://law.upd.edu.ph/wp-content/uploads/2020/06/Finding-Fault-Falcis.pdf</w:t>
+              </w:r>
+            </w:hyperlink>
+            <w:r>
+              <w:rPr>
+                <w:rFonts w:ascii="Times New Roman" w:hAnsi="Times New Roman" w:cs="Times New Roman" w:eastAsia="Times New Roman"/>
+                <w:sz w:val="28"/>
+                <w:szCs w:val="28"/>
+              </w:rPr>
+              <w:t xml:space="preserve">.</w:t>
             </w:r>
           </w:p>
           <w:p>
@@ -15953,7 +16007,25 @@
                 <w:sz w:val="28"/>
                 <w:szCs w:val="28"/>
               </w:rPr>
-              <w:t xml:space="preserve"> https://law.upd.edu.ph/wp-content/uploads/2026/07/Josef-v-Ursua-Proceedings.pdf.</w:t>
+              <w:t xml:space="preserve"> </w:t>
+            </w:r>
+            <w:hyperlink r:id="rId13">
+              <w:r>
+                <w:rPr>
+                  <w:rFonts w:ascii="Times New Roman" w:hAnsi="Times New Roman" w:cs="Times New Roman" w:eastAsia="Times New Roman"/>
+                  <w:sz w:val="28"/>
+                  <w:szCs w:val="28"/>
+                </w:rPr>
+                <w:t xml:space="preserve">https://law.upd.edu.ph/wp-content/uploads/2026/07/Josef-v-Ursua-Proceedings.pdf</w:t>
+              </w:r>
+            </w:hyperlink>
+            <w:r>
+              <w:rPr>
+                <w:rFonts w:ascii="Times New Roman" w:hAnsi="Times New Roman" w:cs="Times New Roman" w:eastAsia="Times New Roman"/>
+                <w:sz w:val="28"/>
+                <w:szCs w:val="28"/>
+              </w:rPr>
+              <w:t xml:space="preserve">.</w:t>
             </w:r>
           </w:p>
           <w:p>
@@ -16076,7 +16148,25 @@
                 <w:sz w:val="28"/>
                 <w:szCs w:val="28"/>
               </w:rPr>
-              <w:t xml:space="preserve"> (2022), https://chr.gov.ph/2022/statements/statement-of-the-commission-on-human-rights-on-the-rejection-of-the-philippine-delegation-of-the-recommendation-during-the-universal-periodic-review-to-pass-the-sogie-equality-bill/.</w:t>
+              <w:t xml:space="preserve"> (2022), </w:t>
+            </w:r>
+            <w:hyperlink r:id="rId14">
+              <w:r>
+                <w:rPr>
+                  <w:rFonts w:ascii="Times New Roman" w:hAnsi="Times New Roman" w:cs="Times New Roman" w:eastAsia="Times New Roman"/>
+                  <w:sz w:val="28"/>
+                  <w:szCs w:val="28"/>
+                </w:rPr>
+                <w:t xml:space="preserve">https://chr.gov.ph/2022/statements/statement-of-the-commission-on-human-rights-on-the-rejection-of-the-philippine-delegation-of-the-recommendation-during-the-universal-periodic-review-to-pass-the-sogie-equality-bill/</w:t>
+              </w:r>
+            </w:hyperlink>
+            <w:r>
+              <w:rPr>
+                <w:rFonts w:ascii="Times New Roman" w:hAnsi="Times New Roman" w:cs="Times New Roman" w:eastAsia="Times New Roman"/>
+                <w:sz w:val="28"/>
+                <w:szCs w:val="28"/>
+              </w:rPr>
+              <w:t xml:space="preserve">.</w:t>
             </w:r>
           </w:p>
           <w:p>
@@ -16181,7 +16271,25 @@
                 <w:sz w:val="28"/>
                 <w:szCs w:val="28"/>
               </w:rPr>
-              <w:t xml:space="preserve"> (2023), https://chr.gov.ph/cb/2023/statements/press-statement/statement-of-the-commission-on-human-rights-lauding-quezon-citys-initiative-to-launch-the-right-to-care-card.</w:t>
+              <w:t xml:space="preserve"> (July 4, 2023), </w:t>
+            </w:r>
+            <w:hyperlink r:id="rId15">
+              <w:r>
+                <w:rPr>
+                  <w:rFonts w:ascii="Times New Roman" w:hAnsi="Times New Roman" w:cs="Times New Roman" w:eastAsia="Times New Roman"/>
+                  <w:sz w:val="28"/>
+                  <w:szCs w:val="28"/>
+                </w:rPr>
+                <w:t xml:space="preserve">https://chr.gov.ph/statement-of-the-commission-on-human-rights-lauding-quezon-citys-initiative-to-launch-the-right-to-care-card/</w:t>
+              </w:r>
+            </w:hyperlink>
+            <w:r>
+              <w:rPr>
+                <w:rFonts w:ascii="Times New Roman" w:hAnsi="Times New Roman" w:cs="Times New Roman" w:eastAsia="Times New Roman"/>
+                <w:sz w:val="28"/>
+                <w:szCs w:val="28"/>
+              </w:rPr>
+              <w:t xml:space="preserve">.</w:t>
             </w:r>
           </w:p>
           <w:p>
@@ -16813,7 +16921,25 @@
                 <w:sz w:val="28"/>
                 <w:szCs w:val="28"/>
               </w:rPr>
-              <w:t xml:space="preserve"> https://www.ejournals.ph/article.php?id=14302.</w:t>
+              <w:t xml:space="preserve"> </w:t>
+            </w:r>
+            <w:hyperlink r:id="rId16">
+              <w:r>
+                <w:rPr>
+                  <w:rFonts w:ascii="Times New Roman" w:hAnsi="Times New Roman" w:cs="Times New Roman" w:eastAsia="Times New Roman"/>
+                  <w:sz w:val="28"/>
+                  <w:szCs w:val="28"/>
+                </w:rPr>
+                <w:t xml:space="preserve">https://www.ejournals.ph/article.php?id=14302</w:t>
+              </w:r>
+            </w:hyperlink>
+            <w:r>
+              <w:rPr>
+                <w:rFonts w:ascii="Times New Roman" w:hAnsi="Times New Roman" w:cs="Times New Roman" w:eastAsia="Times New Roman"/>
+                <w:sz w:val="28"/>
+                <w:szCs w:val="28"/>
+              </w:rPr>
+              <w:t xml:space="preserve">.</w:t>
             </w:r>
           </w:p>
           <w:p>
@@ -17265,7 +17391,25 @@
                 <w:sz w:val="28"/>
                 <w:szCs w:val="28"/>
               </w:rPr>
-              <w:t xml:space="preserve"> (June 22, 2017), https://www.hrw.org/report/2017/06/22/just-let-us-be/discrimination-against-lgbt-students-philippines.</w:t>
+              <w:t xml:space="preserve"> (June 22, 2017), </w:t>
+            </w:r>
+            <w:hyperlink r:id="rId17">
+              <w:r>
+                <w:rPr>
+                  <w:rFonts w:ascii="Times New Roman" w:hAnsi="Times New Roman" w:cs="Times New Roman" w:eastAsia="Times New Roman"/>
+                  <w:sz w:val="28"/>
+                  <w:szCs w:val="28"/>
+                </w:rPr>
+                <w:t xml:space="preserve">https://www.hrw.org/report/2017/06/22/just-let-us-be/discrimination-against-lgbt-students-philippines</w:t>
+              </w:r>
+            </w:hyperlink>
+            <w:r>
+              <w:rPr>
+                <w:rFonts w:ascii="Times New Roman" w:hAnsi="Times New Roman" w:cs="Times New Roman" w:eastAsia="Times New Roman"/>
+                <w:sz w:val="28"/>
+                <w:szCs w:val="28"/>
+              </w:rPr>
+              <w:t xml:space="preserve">.</w:t>
             </w:r>
           </w:p>
           <w:p>
@@ -17370,7 +17514,25 @@
                 <w:sz w:val="28"/>
                 <w:szCs w:val="28"/>
               </w:rPr>
-              <w:t xml:space="preserve"> (February 17, 2026), https://www.hrw.org/news/2026/02/17/philippine-supreme-court-grants-property-rights-to-same-sex-couples.</w:t>
+              <w:t xml:space="preserve"> (February 17, 2026), </w:t>
+            </w:r>
+            <w:hyperlink r:id="rId18">
+              <w:r>
+                <w:rPr>
+                  <w:rFonts w:ascii="Times New Roman" w:hAnsi="Times New Roman" w:cs="Times New Roman" w:eastAsia="Times New Roman"/>
+                  <w:sz w:val="28"/>
+                  <w:szCs w:val="28"/>
+                </w:rPr>
+                <w:t xml:space="preserve">https://www.hrw.org/news/2026/02/17/philippine-supreme-court-grants-property-rights-to-same-sex-couples</w:t>
+              </w:r>
+            </w:hyperlink>
+            <w:r>
+              <w:rPr>
+                <w:rFonts w:ascii="Times New Roman" w:hAnsi="Times New Roman" w:cs="Times New Roman" w:eastAsia="Times New Roman"/>
+                <w:sz w:val="28"/>
+                <w:szCs w:val="28"/>
+              </w:rPr>
+              <w:t xml:space="preserve">.</w:t>
             </w:r>
           </w:p>
           <w:p>
@@ -17493,7 +17655,25 @@
                 <w:sz w:val="28"/>
                 <w:szCs w:val="28"/>
               </w:rPr>
-              <w:t xml:space="preserve"> (June 25, 2020), https://www.pewresearch.org/global/2020/06/25/global-divide-on-homosexuality-persists/.</w:t>
+              <w:t xml:space="preserve"> (June 25, 2020), </w:t>
+            </w:r>
+            <w:hyperlink r:id="rId19">
+              <w:r>
+                <w:rPr>
+                  <w:rFonts w:ascii="Times New Roman" w:hAnsi="Times New Roman" w:cs="Times New Roman" w:eastAsia="Times New Roman"/>
+                  <w:sz w:val="28"/>
+                  <w:szCs w:val="28"/>
+                </w:rPr>
+                <w:t xml:space="preserve">https://www.pewresearch.org/global/2020/06/25/global-divide-on-homosexuality-persists/</w:t>
+              </w:r>
+            </w:hyperlink>
+            <w:r>
+              <w:rPr>
+                <w:rFonts w:ascii="Times New Roman" w:hAnsi="Times New Roman" w:cs="Times New Roman" w:eastAsia="Times New Roman"/>
+                <w:sz w:val="28"/>
+                <w:szCs w:val="28"/>
+              </w:rPr>
+              <w:t xml:space="preserve">.</w:t>
             </w:r>
           </w:p>
           <w:p>
@@ -17680,7 +17860,25 @@
                 <w:sz w:val="28"/>
                 <w:szCs w:val="28"/>
               </w:rPr>
-              <w:t xml:space="preserve">, February 10, 2026, https://www.philstar.com/headlines/2026/02/10/2507065/supreme-court-same-sex-couples-can-be-recognized-property-co-owners.</w:t>
+              <w:t xml:space="preserve">, February 10, 2026, </w:t>
+            </w:r>
+            <w:hyperlink r:id="rId20">
+              <w:r>
+                <w:rPr>
+                  <w:rFonts w:ascii="Times New Roman" w:hAnsi="Times New Roman" w:cs="Times New Roman" w:eastAsia="Times New Roman"/>
+                  <w:sz w:val="28"/>
+                  <w:szCs w:val="28"/>
+                </w:rPr>
+                <w:t xml:space="preserve">https://www.philstar.com/headlines/2026/02/10/2507065/supreme-court-same-sex-couples-can-be-recognized-property-co-owners</w:t>
+              </w:r>
+            </w:hyperlink>
+            <w:r>
+              <w:rPr>
+                <w:rFonts w:ascii="Times New Roman" w:hAnsi="Times New Roman" w:cs="Times New Roman" w:eastAsia="Times New Roman"/>
+                <w:sz w:val="28"/>
+                <w:szCs w:val="28"/>
+              </w:rPr>
+              <w:t xml:space="preserve">.</w:t>
             </w:r>
           </w:p>
           <w:p>
@@ -17812,7 +18010,25 @@
                 <w:sz w:val="28"/>
                 <w:szCs w:val="28"/>
               </w:rPr>
-              <w:t xml:space="preserve">, July 16, 2025, https://www.philstar.com/headlines/2025/07/16/2458169/supreme-court-hiding-homosexuality-valid-ground-annulment.</w:t>
+              <w:t xml:space="preserve">, July 16, 2025, </w:t>
+            </w:r>
+            <w:hyperlink r:id="rId21">
+              <w:r>
+                <w:rPr>
+                  <w:rFonts w:ascii="Times New Roman" w:hAnsi="Times New Roman" w:cs="Times New Roman" w:eastAsia="Times New Roman"/>
+                  <w:sz w:val="28"/>
+                  <w:szCs w:val="28"/>
+                </w:rPr>
+                <w:t xml:space="preserve">https://www.philstar.com/headlines/2025/07/16/2458169/supreme-court-hiding-homosexuality-valid-ground-annulment</w:t>
+              </w:r>
+            </w:hyperlink>
+            <w:r>
+              <w:rPr>
+                <w:rFonts w:ascii="Times New Roman" w:hAnsi="Times New Roman" w:cs="Times New Roman" w:eastAsia="Times New Roman"/>
+                <w:sz w:val="28"/>
+                <w:szCs w:val="28"/>
+              </w:rPr>
+              <w:t xml:space="preserve">.</w:t>
             </w:r>
           </w:p>
           <w:p>
@@ -17944,7 +18160,25 @@
                 <w:sz w:val="28"/>
                 <w:szCs w:val="28"/>
               </w:rPr>
-              <w:t xml:space="preserve">, April 15, 2024, https://news.abs-cbn.com/news/2024/4/15/house-lawmaker-renews-push-for-same-sex-civil-partnerships-940.</w:t>
+              <w:t xml:space="preserve">, April 15, 2024, </w:t>
+            </w:r>
+            <w:hyperlink r:id="rId22">
+              <w:r>
+                <w:rPr>
+                  <w:rFonts w:ascii="Times New Roman" w:hAnsi="Times New Roman" w:cs="Times New Roman" w:eastAsia="Times New Roman"/>
+                  <w:sz w:val="28"/>
+                  <w:szCs w:val="28"/>
+                </w:rPr>
+                <w:t xml:space="preserve">https://news.abs-cbn.com/news/2024/4/15/house-lawmaker-renews-push-for-same-sex-civil-partnerships-940</w:t>
+              </w:r>
+            </w:hyperlink>
+            <w:r>
+              <w:rPr>
+                <w:rFonts w:ascii="Times New Roman" w:hAnsi="Times New Roman" w:cs="Times New Roman" w:eastAsia="Times New Roman"/>
+                <w:sz w:val="28"/>
+                <w:szCs w:val="28"/>
+              </w:rPr>
+              <w:t xml:space="preserve">.</w:t>
             </w:r>
           </w:p>
           <w:p>
@@ -18058,7 +18292,25 @@
                 <w:sz w:val="28"/>
                 <w:szCs w:val="28"/>
               </w:rPr>
-              <w:t xml:space="preserve">, December 21, 2023, https://philippines.licas.news/2023/12/21/cbcp-endorses-vatican-document-allowing-pastoral-blessings-for-same-sex-couples/.</w:t>
+              <w:t xml:space="preserve">, December 21, 2023, </w:t>
+            </w:r>
+            <w:hyperlink r:id="rId23">
+              <w:r>
+                <w:rPr>
+                  <w:rFonts w:ascii="Times New Roman" w:hAnsi="Times New Roman" w:cs="Times New Roman" w:eastAsia="Times New Roman"/>
+                  <w:sz w:val="28"/>
+                  <w:szCs w:val="28"/>
+                </w:rPr>
+                <w:t xml:space="preserve">https://philippines.licas.news/2023/12/21/cbcp-endorses-vatican-document-allowing-pastoral-blessings-for-same-sex-couples/</w:t>
+              </w:r>
+            </w:hyperlink>
+            <w:r>
+              <w:rPr>
+                <w:rFonts w:ascii="Times New Roman" w:hAnsi="Times New Roman" w:cs="Times New Roman" w:eastAsia="Times New Roman"/>
+                <w:sz w:val="28"/>
+                <w:szCs w:val="28"/>
+              </w:rPr>
+              <w:t xml:space="preserve">.</w:t>
             </w:r>
           </w:p>
           <w:p>
@@ -18160,6 +18412,14 @@
             <w:r>
               <w:rPr>
                 <w:rFonts w:ascii="Times New Roman" w:hAnsi="Times New Roman" w:cs="Times New Roman" w:eastAsia="Times New Roman"/>
+                <w:sz w:val="28"/>
+                <w:szCs w:val="28"/>
+              </w:rPr>
+              <w:t xml:space="preserve">RG Cruz, </w:t>
+            </w:r>
+            <w:r>
+              <w:rPr>
+                <w:rFonts w:ascii="Times New Roman" w:hAnsi="Times New Roman" w:cs="Times New Roman" w:eastAsia="Times New Roman"/>
                 <w:i/>
                 <w:iCs/>
                 <w:sz w:val="28"/>
@@ -18190,7 +18450,25 @@
                 <w:sz w:val="28"/>
                 <w:szCs w:val="28"/>
               </w:rPr>
-              <w:t xml:space="preserve">, May 10, 2023, https://www.abs-cbn.com/news/05/10/23/house-begins-tackling-civil-partnership-bills.</w:t>
+              <w:t xml:space="preserve">, May 10, 2023, </w:t>
+            </w:r>
+            <w:hyperlink r:id="rId24">
+              <w:r>
+                <w:rPr>
+                  <w:rFonts w:ascii="Times New Roman" w:hAnsi="Times New Roman" w:cs="Times New Roman" w:eastAsia="Times New Roman"/>
+                  <w:sz w:val="28"/>
+                  <w:szCs w:val="28"/>
+                </w:rPr>
+                <w:t xml:space="preserve">https://www.abs-cbn.com/news/05/10/23/house-begins-tackling-civil-partnership-bills</w:t>
+              </w:r>
+            </w:hyperlink>
+            <w:r>
+              <w:rPr>
+                <w:rFonts w:ascii="Times New Roman" w:hAnsi="Times New Roman" w:cs="Times New Roman" w:eastAsia="Times New Roman"/>
+                <w:sz w:val="28"/>
+                <w:szCs w:val="28"/>
+              </w:rPr>
+              <w:t xml:space="preserve">.</w:t>
             </w:r>
           </w:p>
           <w:p>
@@ -18304,7 +18582,25 @@
                 <w:sz w:val="28"/>
                 <w:szCs w:val="28"/>
               </w:rPr>
-              <w:t xml:space="preserve">, August 13, 2022, https://www.philstar.com/headlines/2022/08/13/2202445/same-sex-civil-unions-philippines-what-you-need-know.</w:t>
+              <w:t xml:space="preserve">, August 13, 2022, </w:t>
+            </w:r>
+            <w:hyperlink r:id="rId25">
+              <w:r>
+                <w:rPr>
+                  <w:rFonts w:ascii="Times New Roman" w:hAnsi="Times New Roman" w:cs="Times New Roman" w:eastAsia="Times New Roman"/>
+                  <w:sz w:val="28"/>
+                  <w:szCs w:val="28"/>
+                </w:rPr>
+                <w:t xml:space="preserve">https://www.philstar.com/headlines/2022/08/13/2202445/same-sex-civil-unions-philippines-what-you-need-know</w:t>
+              </w:r>
+            </w:hyperlink>
+            <w:r>
+              <w:rPr>
+                <w:rFonts w:ascii="Times New Roman" w:hAnsi="Times New Roman" w:cs="Times New Roman" w:eastAsia="Times New Roman"/>
+                <w:sz w:val="28"/>
+                <w:szCs w:val="28"/>
+              </w:rPr>
+              <w:t xml:space="preserve">.</w:t>
             </w:r>
           </w:p>
           <w:p>
@@ -18418,7 +18714,25 @@
                 <w:sz w:val="28"/>
                 <w:szCs w:val="28"/>
               </w:rPr>
-              <w:t xml:space="preserve">, August 11, 2022, https://www.philstar.com/headlines/2022/08/11/2201984/padilla-seeks-equal-rights-same-sex-couples-civil-union-bill.</w:t>
+              <w:t xml:space="preserve">, August 11, 2022, </w:t>
+            </w:r>
+            <w:hyperlink r:id="rId26">
+              <w:r>
+                <w:rPr>
+                  <w:rFonts w:ascii="Times New Roman" w:hAnsi="Times New Roman" w:cs="Times New Roman" w:eastAsia="Times New Roman"/>
+                  <w:sz w:val="28"/>
+                  <w:szCs w:val="28"/>
+                </w:rPr>
+                <w:t xml:space="preserve">https://www.philstar.com/headlines/2022/08/11/2201984/padilla-seeks-equal-rights-same-sex-couples-civil-union-bill</w:t>
+              </w:r>
+            </w:hyperlink>
+            <w:r>
+              <w:rPr>
+                <w:rFonts w:ascii="Times New Roman" w:hAnsi="Times New Roman" w:cs="Times New Roman" w:eastAsia="Times New Roman"/>
+                <w:sz w:val="28"/>
+                <w:szCs w:val="28"/>
+              </w:rPr>
+              <w:t xml:space="preserve">.</w:t>
             </w:r>
           </w:p>
           <w:p>
@@ -18532,7 +18846,25 @@
                 <w:sz w:val="28"/>
                 <w:szCs w:val="28"/>
               </w:rPr>
-              <w:t xml:space="preserve">, October 22, 2020, https://www.philstar.com/headlines/2020/10/22/2051522/headlines.</w:t>
+              <w:t xml:space="preserve">, October 22, 2020, </w:t>
+            </w:r>
+            <w:hyperlink r:id="rId27">
+              <w:r>
+                <w:rPr>
+                  <w:rFonts w:ascii="Times New Roman" w:hAnsi="Times New Roman" w:cs="Times New Roman" w:eastAsia="Times New Roman"/>
+                  <w:sz w:val="28"/>
+                  <w:szCs w:val="28"/>
+                </w:rPr>
+                <w:t xml:space="preserve">https://www.philstar.com/headlines/2020/10/22/2051522/headlines</w:t>
+              </w:r>
+            </w:hyperlink>
+            <w:r>
+              <w:rPr>
+                <w:rFonts w:ascii="Times New Roman" w:hAnsi="Times New Roman" w:cs="Times New Roman" w:eastAsia="Times New Roman"/>
+                <w:sz w:val="28"/>
+                <w:szCs w:val="28"/>
+              </w:rPr>
+              <w:t xml:space="preserve">.</w:t>
             </w:r>
           </w:p>
           <w:p>
@@ -18646,7 +18978,25 @@
                 <w:sz w:val="28"/>
                 <w:szCs w:val="28"/>
               </w:rPr>
-              <w:t xml:space="preserve">, January 6, 2020, https://news.abs-cbn.com/news/01/06/20/sc-junks-same-sex-marriage-petition-with-finality.</w:t>
+              <w:t xml:space="preserve">, January 6, 2020, </w:t>
+            </w:r>
+            <w:hyperlink r:id="rId28">
+              <w:r>
+                <w:rPr>
+                  <w:rFonts w:ascii="Times New Roman" w:hAnsi="Times New Roman" w:cs="Times New Roman" w:eastAsia="Times New Roman"/>
+                  <w:sz w:val="28"/>
+                  <w:szCs w:val="28"/>
+                </w:rPr>
+                <w:t xml:space="preserve">https://news.abs-cbn.com/news/01/06/20/sc-junks-same-sex-marriage-petition-with-finality</w:t>
+              </w:r>
+            </w:hyperlink>
+            <w:r>
+              <w:rPr>
+                <w:rFonts w:ascii="Times New Roman" w:hAnsi="Times New Roman" w:cs="Times New Roman" w:eastAsia="Times New Roman"/>
+                <w:sz w:val="28"/>
+                <w:szCs w:val="28"/>
+              </w:rPr>
+              <w:t xml:space="preserve">.</w:t>
             </w:r>
           </w:p>
           <w:p>
@@ -18778,7 +19128,25 @@
                 <w:sz w:val="28"/>
                 <w:szCs w:val="28"/>
               </w:rPr>
-              <w:t xml:space="preserve">, July 1, 2018, https://www.pressreader.com/philippines/sunstar-cagayan-de-oro/20180701/281509341929204.</w:t>
+              <w:t xml:space="preserve">, July 1, 2018, </w:t>
+            </w:r>
+            <w:hyperlink r:id="rId29">
+              <w:r>
+                <w:rPr>
+                  <w:rFonts w:ascii="Times New Roman" w:hAnsi="Times New Roman" w:cs="Times New Roman" w:eastAsia="Times New Roman"/>
+                  <w:sz w:val="28"/>
+                  <w:szCs w:val="28"/>
+                </w:rPr>
+                <w:t xml:space="preserve">https://www.pressreader.com/philippines/sunstar-cagayan-de-oro/20180701/281509341929204</w:t>
+              </w:r>
+            </w:hyperlink>
+            <w:r>
+              <w:rPr>
+                <w:rFonts w:ascii="Times New Roman" w:hAnsi="Times New Roman" w:cs="Times New Roman" w:eastAsia="Times New Roman"/>
+                <w:sz w:val="28"/>
+                <w:szCs w:val="28"/>
+              </w:rPr>
+              <w:t xml:space="preserve">.</w:t>
             </w:r>
           </w:p>
           <w:p>
@@ -18892,7 +19260,25 @@
                 <w:sz w:val="28"/>
                 <w:szCs w:val="28"/>
               </w:rPr>
-              <w:t xml:space="preserve">, September 20, 2017, https://interaksyon.philstar.com/breaking-news/2017/09/20/98551/house-okays-sogie-bill-on-3rd-and-final-reading/.</w:t>
+              <w:t xml:space="preserve">, September 20, 2017, </w:t>
+            </w:r>
+            <w:hyperlink r:id="rId30">
+              <w:r>
+                <w:rPr>
+                  <w:rFonts w:ascii="Times New Roman" w:hAnsi="Times New Roman" w:cs="Times New Roman" w:eastAsia="Times New Roman"/>
+                  <w:sz w:val="28"/>
+                  <w:szCs w:val="28"/>
+                </w:rPr>
+                <w:t xml:space="preserve">https://interaksyon.philstar.com/breaking-news/2017/09/20/98551/house-okays-sogie-bill-on-3rd-and-final-reading/</w:t>
+              </w:r>
+            </w:hyperlink>
+            <w:r>
+              <w:rPr>
+                <w:rFonts w:ascii="Times New Roman" w:hAnsi="Times New Roman" w:cs="Times New Roman" w:eastAsia="Times New Roman"/>
+                <w:sz w:val="28"/>
+                <w:szCs w:val="28"/>
+              </w:rPr>
+              <w:t xml:space="preserve">.</w:t>
             </w:r>
           </w:p>
           <w:p>
@@ -18953,7 +19339,7 @@
       </w:pPr>
     </w:p>
     <w:sectPr>
-      <w:footerReference w:type="default" r:id="rId10"/>
+      <w:footerReference w:type="default" r:id="rId31"/>
       <w:pgSz w:w="20160" w:h="12240" w:orient="landscape"/>
       <w:pgMar w:top="1440" w:right="1440" w:bottom="1440" w:left="1440" w:header="708" w:footer="708" w:gutter="0"/>
       <w:cols w:space="708"/>

</xml_diff>

<commit_message>
Group international law under statutes heading in Assignment 2
Statutes (items 1-17) are followed by international law (items 18-29)
under a single "Statutes and International Law" heading; later
primary-source headings are relettered.

Co-Authored-By: Claude Opus 5.5 <noreply@anthropic.com>
Claude-Session: https://claude.ai/code/session_01A1TMNGTya859Bt4g6Da5kK
</commit_message>
<xml_diff>
--- a/BORJA_Assignment 2.docx
+++ b/BORJA_Assignment 2.docx
@@ -1913,7 +1913,7 @@
                 <w:sz w:val="28"/>
                 <w:szCs w:val="28"/>
               </w:rPr>
-              <w:t xml:space="preserve">STATUTES (CODES, PRESIDENTIAL DECREES, AND REPUBLIC ACTS)</w:t>
+              <w:t xml:space="preserve">STATUTES AND INTERNATIONAL LAW</w:t>
             </w:r>
           </w:p>
         </w:tc>
@@ -3783,19 +3783,16 @@
           </w:tcPr>
           <w:p>
             <w:pPr>
-              <w:keepNext/>
-              <w:spacing w:before="0" w:after="0" w:line="240" w:lineRule="auto"/>
-              <w:jc w:val="left"/>
-            </w:pPr>
-            <w:r>
-              <w:rPr>
-                <w:rFonts w:ascii="Times New Roman" w:hAnsi="Times New Roman" w:cs="Times New Roman" w:eastAsia="Times New Roman"/>
-                <w:b/>
-                <w:bCs/>
-                <w:sz w:val="28"/>
-                <w:szCs w:val="28"/>
-              </w:rPr>
-              <w:t xml:space="preserve">C.</w:t>
+              <w:spacing w:before="0" w:after="0" w:line="240" w:lineRule="auto"/>
+              <w:jc w:val="left"/>
+            </w:pPr>
+            <w:r>
+              <w:rPr>
+                <w:rFonts w:ascii="Times New Roman" w:hAnsi="Times New Roman" w:cs="Times New Roman" w:eastAsia="Times New Roman"/>
+                <w:sz w:val="28"/>
+                <w:szCs w:val="28"/>
+              </w:rPr>
+              <w:t xml:space="preserve">18.</w:t>
             </w:r>
           </w:p>
         </w:tc>
@@ -3805,19 +3802,48 @@
           </w:tcPr>
           <w:p>
             <w:pPr>
-              <w:keepNext/>
-              <w:spacing w:before="0" w:after="0" w:line="240" w:lineRule="auto"/>
-              <w:jc w:val="left"/>
-            </w:pPr>
-            <w:r>
-              <w:rPr>
-                <w:rFonts w:ascii="Times New Roman" w:hAnsi="Times New Roman" w:cs="Times New Roman" w:eastAsia="Times New Roman"/>
-                <w:b/>
-                <w:bCs/>
-                <w:sz w:val="28"/>
-                <w:szCs w:val="28"/>
-              </w:rPr>
-              <w:t xml:space="preserve">CONGRESSIONAL BILLS, RESOLUTIONS, AND COMMITTEE REPORTS</w:t>
+              <w:spacing w:before="0" w:after="0" w:line="240" w:lineRule="auto"/>
+              <w:jc w:val="left"/>
+            </w:pPr>
+            <w:r>
+              <w:rPr>
+                <w:rFonts w:ascii="Times New Roman" w:hAnsi="Times New Roman" w:cs="Times New Roman" w:eastAsia="Times New Roman"/>
+                <w:sz w:val="28"/>
+                <w:szCs w:val="28"/>
+              </w:rPr>
+              <w:t xml:space="preserve">International Covenant on Civil and Political Rights, December 19, 1966 (1976), 999 U.N.T.S. 171, art. 23.</w:t>
+            </w:r>
+          </w:p>
+          <w:p>
+            <w:pPr>
+              <w:spacing w:before="60" w:after="0" w:line="240" w:lineRule="auto"/>
+              <w:jc w:val="both"/>
+            </w:pPr>
+            <w:r>
+              <w:rPr>
+                <w:rFonts w:ascii="Times New Roman" w:hAnsi="Times New Roman" w:cs="Times New Roman" w:eastAsia="Times New Roman"/>
+                <w:sz w:val="28"/>
+                <w:szCs w:val="28"/>
+              </w:rPr>
+              <w:t xml:space="preserve">Protects the family and recognizes “the right of men and women of marriageable age to marry,” gendered wording that the Human Rights Committee in </w:t>
+            </w:r>
+            <w:r>
+              <w:rPr>
+                <w:rFonts w:ascii="Times New Roman" w:hAnsi="Times New Roman" w:cs="Times New Roman" w:eastAsia="Times New Roman"/>
+                <w:i/>
+                <w:iCs/>
+                <w:sz w:val="28"/>
+                <w:szCs w:val="28"/>
+              </w:rPr>
+              <w:t xml:space="preserve">Joslin</w:t>
+            </w:r>
+            <w:r>
+              <w:rPr>
+                <w:rFonts w:ascii="Times New Roman" w:hAnsi="Times New Roman" w:cs="Times New Roman" w:eastAsia="Times New Roman"/>
+                <w:sz w:val="28"/>
+                <w:szCs w:val="28"/>
+              </w:rPr>
+              <w:t xml:space="preserve"> read as not requiring States to open marriage to same-sex couples.</w:t>
             </w:r>
           </w:p>
         </w:tc>
@@ -3827,10 +3853,17 @@
           </w:tcPr>
           <w:p>
             <w:pPr>
-              <w:keepNext/>
-              <w:spacing w:before="0" w:after="0" w:line="240" w:lineRule="auto"/>
-              <w:jc w:val="left"/>
-            </w:pPr>
+              <w:spacing w:before="0" w:after="0" w:line="240" w:lineRule="auto"/>
+              <w:jc w:val="left"/>
+            </w:pPr>
+            <w:r>
+              <w:rPr>
+                <w:rFonts w:ascii="Times New Roman" w:hAnsi="Times New Roman" w:cs="Times New Roman" w:eastAsia="Times New Roman"/>
+                <w:sz w:val="28"/>
+                <w:szCs w:val="28"/>
+              </w:rPr>
+              <w:t xml:space="preserve">Mandatory</w:t>
+            </w:r>
           </w:p>
         </w:tc>
         <w:tc>
@@ -3839,10 +3872,17 @@
           </w:tcPr>
           <w:p>
             <w:pPr>
-              <w:keepNext/>
-              <w:spacing w:before="0" w:after="0" w:line="240" w:lineRule="auto"/>
-              <w:jc w:val="left"/>
-            </w:pPr>
+              <w:spacing w:before="0" w:after="0" w:line="240" w:lineRule="auto"/>
+              <w:jc w:val="left"/>
+            </w:pPr>
+            <w:r>
+              <w:rPr>
+                <w:rFonts w:ascii="Times New Roman" w:hAnsi="Times New Roman" w:cs="Times New Roman" w:eastAsia="Times New Roman"/>
+                <w:sz w:val="28"/>
+                <w:szCs w:val="28"/>
+              </w:rPr>
+              <w:t xml:space="preserve">United Nations Treaty Collection (treaties.un.org); OHCHR website (ohchr.org)</w:t>
+            </w:r>
           </w:p>
         </w:tc>
       </w:tr>
@@ -3865,7 +3905,7 @@
                 <w:sz w:val="28"/>
                 <w:szCs w:val="28"/>
               </w:rPr>
-              <w:t xml:space="preserve">1.</w:t>
+              <w:t xml:space="preserve">19.</w:t>
             </w:r>
           </w:p>
         </w:tc>
@@ -3884,7 +3924,7 @@
                 <w:sz w:val="28"/>
                 <w:szCs w:val="28"/>
               </w:rPr>
-              <w:t xml:space="preserve">S. No. 1600, 19th Cong., 1st Sess. (2022).</w:t>
+              <w:t xml:space="preserve">International Covenant on Civil and Political Rights, December 19, 1966 (1976), 999 U.N.T.S. 171, arts. 2 (1), 17, 26.</w:t>
             </w:r>
           </w:p>
           <w:p>
@@ -3898,7 +3938,7 @@
                 <w:sz w:val="28"/>
                 <w:szCs w:val="28"/>
               </w:rPr>
-              <w:t xml:space="preserve">The Senate’s consolidated “SOGIESC Equality Act,” which would penalize discrimination on the basis of sexual orientation, gender identity or expression, and sex characteristics, but which was never approved in plenary.</w:t>
+              <w:t xml:space="preserve">Guarantees non-discrimination, equality before the law, and protection against interference with privacy and family, which the Human Rights Committee has read to prohibit discrimination based on sexual orientation.</w:t>
             </w:r>
           </w:p>
         </w:tc>
@@ -3917,7 +3957,7 @@
                 <w:sz w:val="28"/>
                 <w:szCs w:val="28"/>
               </w:rPr>
-              <w:t xml:space="preserve">Persuasive</w:t>
+              <w:t xml:space="preserve">Mandatory</w:t>
             </w:r>
           </w:p>
         </w:tc>
@@ -3936,7 +3976,7 @@
                 <w:sz w:val="28"/>
                 <w:szCs w:val="28"/>
               </w:rPr>
-              <w:t xml:space="preserve">Senate Legislative Information System (web.senate.gov.ph); Senate Legislative Reference Bureau</w:t>
+              <w:t xml:space="preserve">United Nations Treaty Collection (treaties.un.org); OHCHR website (ohchr.org)</w:t>
             </w:r>
           </w:p>
         </w:tc>
@@ -3960,7 +4000,7 @@
                 <w:sz w:val="28"/>
                 <w:szCs w:val="28"/>
               </w:rPr>
-              <w:t xml:space="preserve">2.</w:t>
+              <w:t xml:space="preserve">20.</w:t>
             </w:r>
           </w:p>
         </w:tc>
@@ -3979,7 +4019,7 @@
                 <w:sz w:val="28"/>
                 <w:szCs w:val="28"/>
               </w:rPr>
-              <w:t xml:space="preserve">Comm. on Women, Children, Family Relations and Gender Equality &amp; Comm. on Finance, S. Rpt. 15, 19th Cong., 1st Sess. (2022).</w:t>
+              <w:t xml:space="preserve">International Covenant on Economic, Social and Cultural Rights, December 19, 1966 (1976), 993 U.N.T.S. 3, art. 10 (1).</w:t>
             </w:r>
           </w:p>
           <w:p>
@@ -3993,7 +4033,7 @@
                 <w:sz w:val="28"/>
                 <w:szCs w:val="28"/>
               </w:rPr>
-              <w:t xml:space="preserve">The joint committee report recommending approval of S. No. 1600, signed by a majority of senators but referred back to the Committee on Rules after opposition from religious groups.</w:t>
+              <w:t xml:space="preserve">Accords “the widest possible protection and assistance” to the family and requires that marriage be entered into with the free consent of the intending spouses, without specifying the sex of the spouses.</w:t>
             </w:r>
           </w:p>
         </w:tc>
@@ -4012,7 +4052,7 @@
                 <w:sz w:val="28"/>
                 <w:szCs w:val="28"/>
               </w:rPr>
-              <w:t xml:space="preserve">Persuasive</w:t>
+              <w:t xml:space="preserve">Mandatory</w:t>
             </w:r>
           </w:p>
         </w:tc>
@@ -4031,7 +4071,7 @@
                 <w:sz w:val="28"/>
                 <w:szCs w:val="28"/>
               </w:rPr>
-              <w:t xml:space="preserve">Senate Legislative Information System (web.senate.gov.ph); Senate Legislative Reference Bureau</w:t>
+              <w:t xml:space="preserve">United Nations Treaty Collection (treaties.un.org); OHCHR website (ohchr.org)</w:t>
             </w:r>
           </w:p>
         </w:tc>
@@ -4055,7 +4095,7 @@
                 <w:sz w:val="28"/>
                 <w:szCs w:val="28"/>
               </w:rPr>
-              <w:t xml:space="preserve">3.</w:t>
+              <w:t xml:space="preserve">21.</w:t>
             </w:r>
           </w:p>
         </w:tc>
@@ -4074,7 +4114,7 @@
                 <w:sz w:val="28"/>
                 <w:szCs w:val="28"/>
               </w:rPr>
-              <w:t xml:space="preserve">S. No. 449, 19th Cong., 1st Sess. (2022).</w:t>
+              <w:t xml:space="preserve">Convention on the Elimination of All Forms of Discrimination against Women, July 15, 1980 (1981), 1249 U.N.T.S. 13, art. 16.</w:t>
             </w:r>
           </w:p>
           <w:p>
@@ -4088,7 +4128,7 @@
                 <w:sz w:val="28"/>
                 <w:szCs w:val="28"/>
               </w:rPr>
-              <w:t xml:space="preserve">Senator Robinhood Padilla’s bill “Institutionalizing Civil Unions of Same Sex Couples, Establishing Their Rights and Obligations,” which would grant same-sex civil partners the benefits and protections enjoyed by married couples.</w:t>
+              <w:t xml:space="preserve">Obliges States to eliminate discrimination against women in matters relating to marriage and family relations on a basis of equality of men and women, the source of the Magna Carta of Women’s marriage provisions.</w:t>
             </w:r>
           </w:p>
         </w:tc>
@@ -4107,7 +4147,7 @@
                 <w:sz w:val="28"/>
                 <w:szCs w:val="28"/>
               </w:rPr>
-              <w:t xml:space="preserve">Persuasive</w:t>
+              <w:t xml:space="preserve">Mandatory</w:t>
             </w:r>
           </w:p>
         </w:tc>
@@ -4126,7 +4166,7 @@
                 <w:sz w:val="28"/>
                 <w:szCs w:val="28"/>
               </w:rPr>
-              <w:t xml:space="preserve">Senate Legislative Information System (web.senate.gov.ph); Senate Legislative Reference Bureau</w:t>
+              <w:t xml:space="preserve">United Nations Treaty Collection (treaties.un.org); OHCHR website (ohchr.org)</w:t>
             </w:r>
           </w:p>
         </w:tc>
@@ -4150,7 +4190,7 @@
                 <w:sz w:val="28"/>
                 <w:szCs w:val="28"/>
               </w:rPr>
-              <w:t xml:space="preserve">4.</w:t>
+              <w:t xml:space="preserve">22.</w:t>
             </w:r>
           </w:p>
         </w:tc>
@@ -4169,7 +4209,7 @@
                 <w:sz w:val="28"/>
                 <w:szCs w:val="28"/>
               </w:rPr>
-              <w:t xml:space="preserve">H. No. 1015, 19th Cong., 1st Sess. (2022).</w:t>
+              <w:t xml:space="preserve">Universal Declaration of Human Rights, G.A. Res. 217 (III) A, U.N. Doc. A/RES/217(III), art. 16 (December 10, 1948).</w:t>
             </w:r>
           </w:p>
           <w:p>
@@ -4183,7 +4223,7 @@
                 <w:sz w:val="28"/>
                 <w:szCs w:val="28"/>
               </w:rPr>
-              <w:t xml:space="preserve">The “Civil Partnership Act,” which would allow couples of the same or opposite sex to enter into civil partnerships with rights such as designating partners as beneficiaries and inheriting from them by intestate succession.</w:t>
+              <w:t xml:space="preserve">Declares that “men and women of full age” have the right to marry and to found a family, the model for the marriage provisions of later human rights treaties.</w:t>
             </w:r>
           </w:p>
         </w:tc>
@@ -4221,7 +4261,7 @@
                 <w:sz w:val="28"/>
                 <w:szCs w:val="28"/>
               </w:rPr>
-              <w:t xml:space="preserve">House of Representatives Legislative Information System (congress.gov.ph)</w:t>
+              <w:t xml:space="preserve">United Nations website (un.org); UN Digital Library</w:t>
             </w:r>
           </w:p>
         </w:tc>
@@ -4245,7 +4285,7 @@
                 <w:sz w:val="28"/>
                 <w:szCs w:val="28"/>
               </w:rPr>
-              <w:t xml:space="preserve">5.</w:t>
+              <w:t xml:space="preserve">23.</w:t>
             </w:r>
           </w:p>
         </w:tc>
@@ -4264,7 +4304,7 @@
                 <w:sz w:val="28"/>
                 <w:szCs w:val="28"/>
               </w:rPr>
-              <w:t xml:space="preserve">H. No. 2264, 18th Cong., 1st Sess. (2019).</w:t>
+              <w:t xml:space="preserve">Toonen v. Australia, Communication No. 488/1992, U.N. Doc. CCPR/C/50/D/488/1992 (Human Rights Comm., March 31, 1994).</w:t>
             </w:r>
           </w:p>
           <w:p>
@@ -4278,7 +4318,7 @@
                 <w:sz w:val="28"/>
                 <w:szCs w:val="28"/>
               </w:rPr>
-              <w:t xml:space="preserve">Representative Pantaleon Alvarez’s refiled Civil Partnership bill allowing couples of the same or opposite sex to form civil partnerships, which remained pending at the committee level.</w:t>
+              <w:t xml:space="preserve">The Human Rights Committee held that the reference to “sex” in Articles 2 (1) and 26 of the ICCPR includes sexual orientation, laying the foundation for sexual-orientation equality claims under the Covenant.</w:t>
             </w:r>
           </w:p>
         </w:tc>
@@ -4316,7 +4356,7 @@
                 <w:sz w:val="28"/>
                 <w:szCs w:val="28"/>
               </w:rPr>
-              <w:t xml:space="preserve">House of Representatives Legislative Information System (congress.gov.ph)</w:t>
+              <w:t xml:space="preserve">OHCHR Jurisprudence Database (juris.ohchr.org); UN Treaty Body Database</w:t>
             </w:r>
           </w:p>
         </w:tc>
@@ -4340,7 +4380,7 @@
                 <w:sz w:val="28"/>
                 <w:szCs w:val="28"/>
               </w:rPr>
-              <w:t xml:space="preserve">6.</w:t>
+              <w:t xml:space="preserve">24.</w:t>
             </w:r>
           </w:p>
         </w:tc>
@@ -4359,7 +4399,7 @@
                 <w:sz w:val="28"/>
                 <w:szCs w:val="28"/>
               </w:rPr>
-              <w:t xml:space="preserve">H. No. 6595, 17th Cong., 2d Sess. (2017).</w:t>
+              <w:t xml:space="preserve">Joslin v. New Zealand, Communication No. 902/1999, U.N. Doc. CCPR/C/75/D/902/1999 (Human Rights Comm., July 17, 2002).</w:t>
             </w:r>
           </w:p>
           <w:p>
@@ -4373,7 +4413,7 @@
                 <w:sz w:val="28"/>
                 <w:szCs w:val="28"/>
               </w:rPr>
-              <w:t xml:space="preserve">The Civil Partnership Act filed by then Speaker Pantaleon Alvarez, proposing to extend the benefits and protections granted to spouses to same-sex and opposite-sex civil partners.</w:t>
+              <w:t xml:space="preserve">The Committee held that a State’s refusal to allow same-sex couples to marry does not violate the ICCPR because Article 23 (2) refers specifically to “men and women.”</w:t>
             </w:r>
           </w:p>
         </w:tc>
@@ -4411,7 +4451,7 @@
                 <w:sz w:val="28"/>
                 <w:szCs w:val="28"/>
               </w:rPr>
-              <w:t xml:space="preserve">House of Representatives Legislative Information System (congress.gov.ph)</w:t>
+              <w:t xml:space="preserve">OHCHR Jurisprudence Database (juris.ohchr.org); UN Treaty Body Database</w:t>
             </w:r>
           </w:p>
         </w:tc>
@@ -4435,7 +4475,7 @@
                 <w:sz w:val="28"/>
                 <w:szCs w:val="28"/>
               </w:rPr>
-              <w:t xml:space="preserve">7.</w:t>
+              <w:t xml:space="preserve">25.</w:t>
             </w:r>
           </w:p>
         </w:tc>
@@ -4454,7 +4494,7 @@
                 <w:sz w:val="28"/>
                 <w:szCs w:val="28"/>
               </w:rPr>
-              <w:t xml:space="preserve">H. No. 4982, 17th Cong., 1st Sess. (2017).</w:t>
+              <w:t xml:space="preserve">Young v. Australia, Communication No. 941/2000, U.N. Doc. CCPR/C/78/D/941/2000 (Human Rights Comm., August 6, 2003).</w:t>
             </w:r>
           </w:p>
           <w:p>
@@ -4468,7 +4508,7 @@
                 <w:sz w:val="28"/>
                 <w:szCs w:val="28"/>
               </w:rPr>
-              <w:t xml:space="preserve">The SOGIE Equality Act, approved by the House of Representatives on third reading on September 20, 2017 by a vote of 198–0, but never enacted after stalling in the Senate.</w:t>
+              <w:t xml:space="preserve">The Committee found that denying a veterans’ pension to the surviving same-sex partner of a veteran violated the equality guarantee of Article 26.</w:t>
             </w:r>
           </w:p>
         </w:tc>
@@ -4506,7 +4546,7 @@
                 <w:sz w:val="28"/>
                 <w:szCs w:val="28"/>
               </w:rPr>
-              <w:t xml:space="preserve">House of Representatives Legislative Information System (congress.gov.ph)</w:t>
+              <w:t xml:space="preserve">OHCHR Jurisprudence Database (juris.ohchr.org); UN Treaty Body Database</w:t>
             </w:r>
           </w:p>
         </w:tc>
@@ -4521,19 +4561,16 @@
           </w:tcPr>
           <w:p>
             <w:pPr>
-              <w:keepNext/>
-              <w:spacing w:before="0" w:after="0" w:line="240" w:lineRule="auto"/>
-              <w:jc w:val="left"/>
-            </w:pPr>
-            <w:r>
-              <w:rPr>
-                <w:rFonts w:ascii="Times New Roman" w:hAnsi="Times New Roman" w:cs="Times New Roman" w:eastAsia="Times New Roman"/>
-                <w:b/>
-                <w:bCs/>
-                <w:sz w:val="28"/>
-                <w:szCs w:val="28"/>
-              </w:rPr>
-              <w:t xml:space="preserve">D.</w:t>
+              <w:spacing w:before="0" w:after="0" w:line="240" w:lineRule="auto"/>
+              <w:jc w:val="left"/>
+            </w:pPr>
+            <w:r>
+              <w:rPr>
+                <w:rFonts w:ascii="Times New Roman" w:hAnsi="Times New Roman" w:cs="Times New Roman" w:eastAsia="Times New Roman"/>
+                <w:sz w:val="28"/>
+                <w:szCs w:val="28"/>
+              </w:rPr>
+              <w:t xml:space="preserve">26.</w:t>
             </w:r>
           </w:p>
         </w:tc>
@@ -4543,19 +4580,30 @@
           </w:tcPr>
           <w:p>
             <w:pPr>
-              <w:keepNext/>
-              <w:spacing w:before="0" w:after="0" w:line="240" w:lineRule="auto"/>
-              <w:jc w:val="left"/>
-            </w:pPr>
-            <w:r>
-              <w:rPr>
-                <w:rFonts w:ascii="Times New Roman" w:hAnsi="Times New Roman" w:cs="Times New Roman" w:eastAsia="Times New Roman"/>
-                <w:b/>
-                <w:bCs/>
-                <w:sz w:val="28"/>
-                <w:szCs w:val="28"/>
-              </w:rPr>
-              <w:t xml:space="preserve">EXECUTIVE AND ADMINISTRATIVE ISSUANCES (QUASI-LEGISLATIVE)</w:t>
+              <w:spacing w:before="0" w:after="0" w:line="240" w:lineRule="auto"/>
+              <w:jc w:val="left"/>
+            </w:pPr>
+            <w:r>
+              <w:rPr>
+                <w:rFonts w:ascii="Times New Roman" w:hAnsi="Times New Roman" w:cs="Times New Roman" w:eastAsia="Times New Roman"/>
+                <w:sz w:val="28"/>
+                <w:szCs w:val="28"/>
+              </w:rPr>
+              <w:t xml:space="preserve">X v. Colombia, Communication No. 1361/2005, U.N. Doc. CCPR/C/89/D/1361/2005 (Human Rights Comm., March 30, 2007).</w:t>
+            </w:r>
+          </w:p>
+          <w:p>
+            <w:pPr>
+              <w:spacing w:before="60" w:after="0" w:line="240" w:lineRule="auto"/>
+              <w:jc w:val="both"/>
+            </w:pPr>
+            <w:r>
+              <w:rPr>
+                <w:rFonts w:ascii="Times New Roman" w:hAnsi="Times New Roman" w:cs="Times New Roman" w:eastAsia="Times New Roman"/>
+                <w:sz w:val="28"/>
+                <w:szCs w:val="28"/>
+              </w:rPr>
+              <w:t xml:space="preserve">The Committee held that denying a pension to the surviving partner of a same-sex union, where unmarried heterosexual partners were entitled, was discrimination based on sexual orientation under Article 26.</w:t>
             </w:r>
           </w:p>
         </w:tc>
@@ -4565,10 +4613,17 @@
           </w:tcPr>
           <w:p>
             <w:pPr>
-              <w:keepNext/>
-              <w:spacing w:before="0" w:after="0" w:line="240" w:lineRule="auto"/>
-              <w:jc w:val="left"/>
-            </w:pPr>
+              <w:spacing w:before="0" w:after="0" w:line="240" w:lineRule="auto"/>
+              <w:jc w:val="left"/>
+            </w:pPr>
+            <w:r>
+              <w:rPr>
+                <w:rFonts w:ascii="Times New Roman" w:hAnsi="Times New Roman" w:cs="Times New Roman" w:eastAsia="Times New Roman"/>
+                <w:sz w:val="28"/>
+                <w:szCs w:val="28"/>
+              </w:rPr>
+              <w:t xml:space="preserve">Persuasive</w:t>
+            </w:r>
           </w:p>
         </w:tc>
         <w:tc>
@@ -4577,10 +4632,17 @@
           </w:tcPr>
           <w:p>
             <w:pPr>
-              <w:keepNext/>
-              <w:spacing w:before="0" w:after="0" w:line="240" w:lineRule="auto"/>
-              <w:jc w:val="left"/>
-            </w:pPr>
+              <w:spacing w:before="0" w:after="0" w:line="240" w:lineRule="auto"/>
+              <w:jc w:val="left"/>
+            </w:pPr>
+            <w:r>
+              <w:rPr>
+                <w:rFonts w:ascii="Times New Roman" w:hAnsi="Times New Roman" w:cs="Times New Roman" w:eastAsia="Times New Roman"/>
+                <w:sz w:val="28"/>
+                <w:szCs w:val="28"/>
+              </w:rPr>
+              <w:t xml:space="preserve">OHCHR Jurisprudence Database (juris.ohchr.org); UN Treaty Body Database</w:t>
+            </w:r>
           </w:p>
         </w:tc>
       </w:tr>
@@ -4603,7 +4665,7 @@
                 <w:sz w:val="28"/>
                 <w:szCs w:val="28"/>
               </w:rPr>
-              <w:t xml:space="preserve">1.</w:t>
+              <w:t xml:space="preserve">27.</w:t>
             </w:r>
           </w:p>
         </w:tc>
@@ -4622,7 +4684,7 @@
                 <w:sz w:val="28"/>
                 <w:szCs w:val="28"/>
               </w:rPr>
-              <w:t xml:space="preserve">CSC Res. No. 01-0940 (2001).</w:t>
+              <w:t xml:space="preserve">Human Rights Comm., Concluding Observations: Philippines, U.N. Doc. CCPR/C/PHL/CO/4 (November 13, 2012).</w:t>
             </w:r>
           </w:p>
           <w:p>
@@ -4636,25 +4698,7 @@
                 <w:sz w:val="28"/>
                 <w:szCs w:val="28"/>
               </w:rPr>
-              <w:t xml:space="preserve">The Administrative Disciplinary Rules on Sexual Harassment Cases classify degrading remarks or innuendoes directed at a person’s sexual orientation as an offense, a rule applied by the Supreme Court in </w:t>
-            </w:r>
-            <w:r>
-              <w:rPr>
-                <w:rFonts w:ascii="Times New Roman" w:hAnsi="Times New Roman" w:cs="Times New Roman" w:eastAsia="Times New Roman"/>
-                <w:i/>
-                <w:iCs/>
-                <w:sz w:val="28"/>
-                <w:szCs w:val="28"/>
-              </w:rPr>
-              <w:t xml:space="preserve">Espejon v. Lorredo</w:t>
-            </w:r>
-            <w:r>
-              <w:rPr>
-                <w:rFonts w:ascii="Times New Roman" w:hAnsi="Times New Roman" w:cs="Times New Roman" w:eastAsia="Times New Roman"/>
-                <w:sz w:val="28"/>
-                <w:szCs w:val="28"/>
-              </w:rPr>
-              <w:t xml:space="preserve"> to a judge’s remarks against a same-sex couple.</w:t>
+              <w:t xml:space="preserve">The Committee urged the Philippines to adopt a comprehensive anti-discrimination law that covers sexual orientation and gender identity, noting that the pending bill had not been passed.</w:t>
             </w:r>
           </w:p>
         </w:tc>
@@ -4673,7 +4717,7 @@
                 <w:sz w:val="28"/>
                 <w:szCs w:val="28"/>
               </w:rPr>
-              <w:t xml:space="preserve">Mandatory</w:t>
+              <w:t xml:space="preserve">Persuasive</w:t>
             </w:r>
           </w:p>
         </w:tc>
@@ -4692,7 +4736,7 @@
                 <w:sz w:val="28"/>
                 <w:szCs w:val="28"/>
               </w:rPr>
-              <w:t xml:space="preserve">Civil Service Commission (csc.gov.ph); Office of the National Administrative Register (ONAR), U.P. Law Center</w:t>
+              <w:t xml:space="preserve">UN Treaty Body Database (tbinternet.ohchr.org); UN Digital Library</w:t>
             </w:r>
           </w:p>
         </w:tc>
@@ -4707,19 +4751,16 @@
           </w:tcPr>
           <w:p>
             <w:pPr>
-              <w:keepNext/>
-              <w:spacing w:before="0" w:after="0" w:line="240" w:lineRule="auto"/>
-              <w:jc w:val="left"/>
-            </w:pPr>
-            <w:r>
-              <w:rPr>
-                <w:rFonts w:ascii="Times New Roman" w:hAnsi="Times New Roman" w:cs="Times New Roman" w:eastAsia="Times New Roman"/>
-                <w:b/>
-                <w:bCs/>
-                <w:sz w:val="28"/>
-                <w:szCs w:val="28"/>
-              </w:rPr>
-              <w:t xml:space="preserve">E.</w:t>
+              <w:spacing w:before="0" w:after="0" w:line="240" w:lineRule="auto"/>
+              <w:jc w:val="left"/>
+            </w:pPr>
+            <w:r>
+              <w:rPr>
+                <w:rFonts w:ascii="Times New Roman" w:hAnsi="Times New Roman" w:cs="Times New Roman" w:eastAsia="Times New Roman"/>
+                <w:sz w:val="28"/>
+                <w:szCs w:val="28"/>
+              </w:rPr>
+              <w:t xml:space="preserve">28.</w:t>
             </w:r>
           </w:p>
         </w:tc>
@@ -4729,19 +4770,30 @@
           </w:tcPr>
           <w:p>
             <w:pPr>
-              <w:keepNext/>
-              <w:spacing w:before="0" w:after="0" w:line="240" w:lineRule="auto"/>
-              <w:jc w:val="left"/>
-            </w:pPr>
-            <w:r>
-              <w:rPr>
-                <w:rFonts w:ascii="Times New Roman" w:hAnsi="Times New Roman" w:cs="Times New Roman" w:eastAsia="Times New Roman"/>
-                <w:b/>
-                <w:bCs/>
-                <w:sz w:val="28"/>
-                <w:szCs w:val="28"/>
-              </w:rPr>
-              <w:t xml:space="preserve">EXECUTIVE AND ADMINISTRATIVE DECISIONS (QUASI-JUDICIAL)</w:t>
+              <w:spacing w:before="0" w:after="0" w:line="240" w:lineRule="auto"/>
+              <w:jc w:val="left"/>
+            </w:pPr>
+            <w:r>
+              <w:rPr>
+                <w:rFonts w:ascii="Times New Roman" w:hAnsi="Times New Roman" w:cs="Times New Roman" w:eastAsia="Times New Roman"/>
+                <w:sz w:val="28"/>
+                <w:szCs w:val="28"/>
+              </w:rPr>
+              <w:t xml:space="preserve">Human Rights Council Res. 17/19, U.N. Doc. A/HRC/RES/17/19 (June 17, 2011).</w:t>
+            </w:r>
+          </w:p>
+          <w:p>
+            <w:pPr>
+              <w:spacing w:before="60" w:after="0" w:line="240" w:lineRule="auto"/>
+              <w:jc w:val="both"/>
+            </w:pPr>
+            <w:r>
+              <w:rPr>
+                <w:rFonts w:ascii="Times New Roman" w:hAnsi="Times New Roman" w:cs="Times New Roman" w:eastAsia="Times New Roman"/>
+                <w:sz w:val="28"/>
+                <w:szCs w:val="28"/>
+              </w:rPr>
+              <w:t xml:space="preserve">The first United Nations resolution on human rights, sexual orientation, and gender identity, expressing grave concern over violence and discrimination on these grounds.</w:t>
             </w:r>
           </w:p>
         </w:tc>
@@ -4751,10 +4803,17 @@
           </w:tcPr>
           <w:p>
             <w:pPr>
-              <w:keepNext/>
-              <w:spacing w:before="0" w:after="0" w:line="240" w:lineRule="auto"/>
-              <w:jc w:val="left"/>
-            </w:pPr>
+              <w:spacing w:before="0" w:after="0" w:line="240" w:lineRule="auto"/>
+              <w:jc w:val="left"/>
+            </w:pPr>
+            <w:r>
+              <w:rPr>
+                <w:rFonts w:ascii="Times New Roman" w:hAnsi="Times New Roman" w:cs="Times New Roman" w:eastAsia="Times New Roman"/>
+                <w:sz w:val="28"/>
+                <w:szCs w:val="28"/>
+              </w:rPr>
+              <w:t xml:space="preserve">Persuasive</w:t>
+            </w:r>
           </w:p>
         </w:tc>
         <w:tc>
@@ -4763,10 +4822,17 @@
           </w:tcPr>
           <w:p>
             <w:pPr>
-              <w:keepNext/>
-              <w:spacing w:before="0" w:after="0" w:line="240" w:lineRule="auto"/>
-              <w:jc w:val="left"/>
-            </w:pPr>
+              <w:spacing w:before="0" w:after="0" w:line="240" w:lineRule="auto"/>
+              <w:jc w:val="left"/>
+            </w:pPr>
+            <w:r>
+              <w:rPr>
+                <w:rFonts w:ascii="Times New Roman" w:hAnsi="Times New Roman" w:cs="Times New Roman" w:eastAsia="Times New Roman"/>
+                <w:sz w:val="28"/>
+                <w:szCs w:val="28"/>
+              </w:rPr>
+              <w:t xml:space="preserve">UN Digital Library; OHCHR website (ohchr.org)</w:t>
+            </w:r>
           </w:p>
         </w:tc>
       </w:tr>
@@ -4789,7 +4855,7 @@
                 <w:sz w:val="28"/>
                 <w:szCs w:val="28"/>
               </w:rPr>
-              <w:t xml:space="preserve">1.</w:t>
+              <w:t xml:space="preserve">29.</w:t>
             </w:r>
           </w:p>
         </w:tc>
@@ -4805,20 +4871,10 @@
             <w:r>
               <w:rPr>
                 <w:rFonts w:ascii="Times New Roman" w:hAnsi="Times New Roman" w:cs="Times New Roman" w:eastAsia="Times New Roman"/>
-                <w:i/>
-                <w:iCs/>
-                <w:sz w:val="28"/>
-                <w:szCs w:val="28"/>
-              </w:rPr>
-              <w:t xml:space="preserve">In re</w:t>
-            </w:r>
-            <w:r>
-              <w:rPr>
-                <w:rFonts w:ascii="Times New Roman" w:hAnsi="Times New Roman" w:cs="Times New Roman" w:eastAsia="Times New Roman"/>
-                <w:sz w:val="28"/>
-                <w:szCs w:val="28"/>
-              </w:rPr>
-              <w:t xml:space="preserve"> Ang Ladlad LGBT Party, COMELEC SPP No. 09-228 (PL), November 11, 2009.</w:t>
+                <w:sz w:val="28"/>
+                <w:szCs w:val="28"/>
+              </w:rPr>
+              <w:t xml:space="preserve">Human Rights Council Res. 32/2, U.N. Doc. A/HRC/RES/32/2 (June 30, 2016).</w:t>
             </w:r>
           </w:p>
           <w:p>
@@ -4832,7 +4888,7 @@
                 <w:sz w:val="28"/>
                 <w:szCs w:val="28"/>
               </w:rPr>
-              <w:t xml:space="preserve">The COMELEC Second Division denied an LGBT group’s petition for party-list registration on moral grounds, citing Biblical and Koranic passages, a ruling the Supreme Court later set aside.</w:t>
+              <w:t xml:space="preserve">Created the mandate of the Independent Expert on protection against violence and discrimination based on sexual orientation and gender identity.</w:t>
             </w:r>
           </w:p>
         </w:tc>
@@ -4870,25 +4926,7 @@
                 <w:sz w:val="28"/>
                 <w:szCs w:val="28"/>
               </w:rPr>
-              <w:t xml:space="preserve">Commission on Elections (deciding agency); quoted in </w:t>
-            </w:r>
-            <w:r>
-              <w:rPr>
-                <w:rFonts w:ascii="Times New Roman" w:hAnsi="Times New Roman" w:cs="Times New Roman" w:eastAsia="Times New Roman"/>
-                <w:i/>
-                <w:iCs/>
-                <w:sz w:val="28"/>
-                <w:szCs w:val="28"/>
-              </w:rPr>
-              <w:t xml:space="preserve">Ang Ladlad</w:t>
-            </w:r>
-            <w:r>
-              <w:rPr>
-                <w:rFonts w:ascii="Times New Roman" w:hAnsi="Times New Roman" w:cs="Times New Roman" w:eastAsia="Times New Roman"/>
-                <w:sz w:val="28"/>
-                <w:szCs w:val="28"/>
-              </w:rPr>
-              <w:t xml:space="preserve"> (Supreme Court E-Library)</w:t>
+              <w:t xml:space="preserve">UN Digital Library; OHCHR website (ohchr.org)</w:t>
             </w:r>
           </w:p>
         </w:tc>
@@ -4903,16 +4941,19 @@
           </w:tcPr>
           <w:p>
             <w:pPr>
-              <w:spacing w:before="0" w:after="0" w:line="240" w:lineRule="auto"/>
-              <w:jc w:val="left"/>
-            </w:pPr>
-            <w:r>
-              <w:rPr>
-                <w:rFonts w:ascii="Times New Roman" w:hAnsi="Times New Roman" w:cs="Times New Roman" w:eastAsia="Times New Roman"/>
-                <w:sz w:val="28"/>
-                <w:szCs w:val="28"/>
-              </w:rPr>
-              <w:t xml:space="preserve">2.</w:t>
+              <w:keepNext/>
+              <w:spacing w:before="0" w:after="0" w:line="240" w:lineRule="auto"/>
+              <w:jc w:val="left"/>
+            </w:pPr>
+            <w:r>
+              <w:rPr>
+                <w:rFonts w:ascii="Times New Roman" w:hAnsi="Times New Roman" w:cs="Times New Roman" w:eastAsia="Times New Roman"/>
+                <w:b/>
+                <w:bCs/>
+                <w:sz w:val="28"/>
+                <w:szCs w:val="28"/>
+              </w:rPr>
+              <w:t xml:space="preserve">C.</w:t>
             </w:r>
           </w:p>
         </w:tc>
@@ -4922,40 +4963,19 @@
           </w:tcPr>
           <w:p>
             <w:pPr>
-              <w:spacing w:before="0" w:after="0" w:line="240" w:lineRule="auto"/>
-              <w:jc w:val="left"/>
-            </w:pPr>
-            <w:r>
-              <w:rPr>
-                <w:rFonts w:ascii="Times New Roman" w:hAnsi="Times New Roman" w:cs="Times New Roman" w:eastAsia="Times New Roman"/>
-                <w:i/>
-                <w:iCs/>
-                <w:sz w:val="28"/>
-                <w:szCs w:val="28"/>
-              </w:rPr>
-              <w:t xml:space="preserve">In re</w:t>
-            </w:r>
-            <w:r>
-              <w:rPr>
-                <w:rFonts w:ascii="Times New Roman" w:hAnsi="Times New Roman" w:cs="Times New Roman" w:eastAsia="Times New Roman"/>
-                <w:sz w:val="28"/>
-                <w:szCs w:val="28"/>
-              </w:rPr>
-              <w:t xml:space="preserve"> Ang Ladlad LGBT Party, COMELEC SPP No. 09-228 (PL), December 16, 2009.</w:t>
-            </w:r>
-          </w:p>
-          <w:p>
-            <w:pPr>
-              <w:spacing w:before="60" w:after="0" w:line="240" w:lineRule="auto"/>
-              <w:jc w:val="both"/>
-            </w:pPr>
-            <w:r>
-              <w:rPr>
-                <w:rFonts w:ascii="Times New Roman" w:hAnsi="Times New Roman" w:cs="Times New Roman" w:eastAsia="Times New Roman"/>
-                <w:sz w:val="28"/>
-                <w:szCs w:val="28"/>
-              </w:rPr>
-              <w:t xml:space="preserve">The COMELEC En Banc, in a divided vote, denied reconsideration, prompting the certiorari petition that produced the Supreme Court’s leading decision on LGBT equality.</w:t>
+              <w:keepNext/>
+              <w:spacing w:before="0" w:after="0" w:line="240" w:lineRule="auto"/>
+              <w:jc w:val="left"/>
+            </w:pPr>
+            <w:r>
+              <w:rPr>
+                <w:rFonts w:ascii="Times New Roman" w:hAnsi="Times New Roman" w:cs="Times New Roman" w:eastAsia="Times New Roman"/>
+                <w:b/>
+                <w:bCs/>
+                <w:sz w:val="28"/>
+                <w:szCs w:val="28"/>
+              </w:rPr>
+              <w:t xml:space="preserve">CONGRESSIONAL BILLS, RESOLUTIONS, AND COMMITTEE REPORTS</w:t>
             </w:r>
           </w:p>
         </w:tc>
@@ -4965,17 +4985,10 @@
           </w:tcPr>
           <w:p>
             <w:pPr>
-              <w:spacing w:before="0" w:after="0" w:line="240" w:lineRule="auto"/>
-              <w:jc w:val="left"/>
-            </w:pPr>
-            <w:r>
-              <w:rPr>
-                <w:rFonts w:ascii="Times New Roman" w:hAnsi="Times New Roman" w:cs="Times New Roman" w:eastAsia="Times New Roman"/>
-                <w:sz w:val="28"/>
-                <w:szCs w:val="28"/>
-              </w:rPr>
-              <w:t xml:space="preserve">Persuasive</w:t>
-            </w:r>
+              <w:keepNext/>
+              <w:spacing w:before="0" w:after="0" w:line="240" w:lineRule="auto"/>
+              <w:jc w:val="left"/>
+            </w:pPr>
           </w:p>
         </w:tc>
         <w:tc>
@@ -4984,35 +4997,10 @@
           </w:tcPr>
           <w:p>
             <w:pPr>
-              <w:spacing w:before="0" w:after="0" w:line="240" w:lineRule="auto"/>
-              <w:jc w:val="left"/>
-            </w:pPr>
-            <w:r>
-              <w:rPr>
-                <w:rFonts w:ascii="Times New Roman" w:hAnsi="Times New Roman" w:cs="Times New Roman" w:eastAsia="Times New Roman"/>
-                <w:sz w:val="28"/>
-                <w:szCs w:val="28"/>
-              </w:rPr>
-              <w:t xml:space="preserve">Commission on Elections (deciding agency); quoted in </w:t>
-            </w:r>
-            <w:r>
-              <w:rPr>
-                <w:rFonts w:ascii="Times New Roman" w:hAnsi="Times New Roman" w:cs="Times New Roman" w:eastAsia="Times New Roman"/>
-                <w:i/>
-                <w:iCs/>
-                <w:sz w:val="28"/>
-                <w:szCs w:val="28"/>
-              </w:rPr>
-              <w:t xml:space="preserve">Ang Ladlad</w:t>
-            </w:r>
-            <w:r>
-              <w:rPr>
-                <w:rFonts w:ascii="Times New Roman" w:hAnsi="Times New Roman" w:cs="Times New Roman" w:eastAsia="Times New Roman"/>
-                <w:sz w:val="28"/>
-                <w:szCs w:val="28"/>
-              </w:rPr>
-              <w:t xml:space="preserve"> (Supreme Court E-Library)</w:t>
-            </w:r>
+              <w:keepNext/>
+              <w:spacing w:before="0" w:after="0" w:line="240" w:lineRule="auto"/>
+              <w:jc w:val="left"/>
+            </w:pPr>
           </w:p>
         </w:tc>
       </w:tr>
@@ -5026,19 +5014,16 @@
           </w:tcPr>
           <w:p>
             <w:pPr>
-              <w:keepNext/>
-              <w:spacing w:before="0" w:after="0" w:line="240" w:lineRule="auto"/>
-              <w:jc w:val="left"/>
-            </w:pPr>
-            <w:r>
-              <w:rPr>
-                <w:rFonts w:ascii="Times New Roman" w:hAnsi="Times New Roman" w:cs="Times New Roman" w:eastAsia="Times New Roman"/>
-                <w:b/>
-                <w:bCs/>
-                <w:sz w:val="28"/>
-                <w:szCs w:val="28"/>
-              </w:rPr>
-              <w:t xml:space="preserve">F.</w:t>
+              <w:spacing w:before="0" w:after="0" w:line="240" w:lineRule="auto"/>
+              <w:jc w:val="left"/>
+            </w:pPr>
+            <w:r>
+              <w:rPr>
+                <w:rFonts w:ascii="Times New Roman" w:hAnsi="Times New Roman" w:cs="Times New Roman" w:eastAsia="Times New Roman"/>
+                <w:sz w:val="28"/>
+                <w:szCs w:val="28"/>
+              </w:rPr>
+              <w:t xml:space="preserve">1.</w:t>
             </w:r>
           </w:p>
         </w:tc>
@@ -5048,19 +5033,30 @@
           </w:tcPr>
           <w:p>
             <w:pPr>
-              <w:keepNext/>
-              <w:spacing w:before="0" w:after="0" w:line="240" w:lineRule="auto"/>
-              <w:jc w:val="left"/>
-            </w:pPr>
-            <w:r>
-              <w:rPr>
-                <w:rFonts w:ascii="Times New Roman" w:hAnsi="Times New Roman" w:cs="Times New Roman" w:eastAsia="Times New Roman"/>
-                <w:b/>
-                <w:bCs/>
-                <w:sz w:val="28"/>
-                <w:szCs w:val="28"/>
-              </w:rPr>
-              <w:t xml:space="preserve">JUDICIAL ISSUANCES (SUPREME COURT)</w:t>
+              <w:spacing w:before="0" w:after="0" w:line="240" w:lineRule="auto"/>
+              <w:jc w:val="left"/>
+            </w:pPr>
+            <w:r>
+              <w:rPr>
+                <w:rFonts w:ascii="Times New Roman" w:hAnsi="Times New Roman" w:cs="Times New Roman" w:eastAsia="Times New Roman"/>
+                <w:sz w:val="28"/>
+                <w:szCs w:val="28"/>
+              </w:rPr>
+              <w:t xml:space="preserve">S. No. 1600, 19th Cong., 1st Sess. (2022).</w:t>
+            </w:r>
+          </w:p>
+          <w:p>
+            <w:pPr>
+              <w:spacing w:before="60" w:after="0" w:line="240" w:lineRule="auto"/>
+              <w:jc w:val="both"/>
+            </w:pPr>
+            <w:r>
+              <w:rPr>
+                <w:rFonts w:ascii="Times New Roman" w:hAnsi="Times New Roman" w:cs="Times New Roman" w:eastAsia="Times New Roman"/>
+                <w:sz w:val="28"/>
+                <w:szCs w:val="28"/>
+              </w:rPr>
+              <w:t xml:space="preserve">The Senate’s consolidated “SOGIESC Equality Act,” which would penalize discrimination on the basis of sexual orientation, gender identity or expression, and sex characteristics, but which was never approved in plenary.</w:t>
             </w:r>
           </w:p>
         </w:tc>
@@ -5070,10 +5066,17 @@
           </w:tcPr>
           <w:p>
             <w:pPr>
-              <w:keepNext/>
-              <w:spacing w:before="0" w:after="0" w:line="240" w:lineRule="auto"/>
-              <w:jc w:val="left"/>
-            </w:pPr>
+              <w:spacing w:before="0" w:after="0" w:line="240" w:lineRule="auto"/>
+              <w:jc w:val="left"/>
+            </w:pPr>
+            <w:r>
+              <w:rPr>
+                <w:rFonts w:ascii="Times New Roman" w:hAnsi="Times New Roman" w:cs="Times New Roman" w:eastAsia="Times New Roman"/>
+                <w:sz w:val="28"/>
+                <w:szCs w:val="28"/>
+              </w:rPr>
+              <w:t xml:space="preserve">Persuasive</w:t>
+            </w:r>
           </w:p>
         </w:tc>
         <w:tc>
@@ -5082,10 +5085,17 @@
           </w:tcPr>
           <w:p>
             <w:pPr>
-              <w:keepNext/>
-              <w:spacing w:before="0" w:after="0" w:line="240" w:lineRule="auto"/>
-              <w:jc w:val="left"/>
-            </w:pPr>
+              <w:spacing w:before="0" w:after="0" w:line="240" w:lineRule="auto"/>
+              <w:jc w:val="left"/>
+            </w:pPr>
+            <w:r>
+              <w:rPr>
+                <w:rFonts w:ascii="Times New Roman" w:hAnsi="Times New Roman" w:cs="Times New Roman" w:eastAsia="Times New Roman"/>
+                <w:sz w:val="28"/>
+                <w:szCs w:val="28"/>
+              </w:rPr>
+              <w:t xml:space="preserve">Senate Legislative Information System (web.senate.gov.ph); Senate Legislative Reference Bureau</w:t>
+            </w:r>
           </w:p>
         </w:tc>
       </w:tr>
@@ -5108,7 +5118,7 @@
                 <w:sz w:val="28"/>
                 <w:szCs w:val="28"/>
               </w:rPr>
-              <w:t xml:space="preserve">1.</w:t>
+              <w:t xml:space="preserve">2.</w:t>
             </w:r>
           </w:p>
         </w:tc>
@@ -5124,19 +5134,10 @@
             <w:r>
               <w:rPr>
                 <w:rFonts w:ascii="Times New Roman" w:hAnsi="Times New Roman" w:cs="Times New Roman" w:eastAsia="Times New Roman"/>
-                <w:smallCaps/>
-                <w:sz w:val="28"/>
-                <w:szCs w:val="28"/>
-              </w:rPr>
-              <w:t xml:space="preserve">Rules of Court</w:t>
-            </w:r>
-            <w:r>
-              <w:rPr>
-                <w:rFonts w:ascii="Times New Roman" w:hAnsi="Times New Roman" w:cs="Times New Roman" w:eastAsia="Times New Roman"/>
-                <w:sz w:val="28"/>
-                <w:szCs w:val="28"/>
-              </w:rPr>
-              <w:t xml:space="preserve">, Rule 108.</w:t>
+                <w:sz w:val="28"/>
+                <w:szCs w:val="28"/>
+              </w:rPr>
+              <w:t xml:space="preserve">Comm. on Women, Children, Family Relations and Gender Equality &amp; Comm. on Finance, S. Rpt. 15, 19th Cong., 1st Sess. (2022).</w:t>
             </w:r>
           </w:p>
           <w:p>
@@ -5150,43 +5151,7 @@
                 <w:sz w:val="28"/>
                 <w:szCs w:val="28"/>
               </w:rPr>
-              <w:t xml:space="preserve">Provides the judicial procedure for the cancellation or correction of entries in the civil register, the remedy invoked in </w:t>
-            </w:r>
-            <w:r>
-              <w:rPr>
-                <w:rFonts w:ascii="Times New Roman" w:hAnsi="Times New Roman" w:cs="Times New Roman" w:eastAsia="Times New Roman"/>
-                <w:i/>
-                <w:iCs/>
-                <w:sz w:val="28"/>
-                <w:szCs w:val="28"/>
-              </w:rPr>
-              <w:t xml:space="preserve">Silverio</w:t>
-            </w:r>
-            <w:r>
-              <w:rPr>
-                <w:rFonts w:ascii="Times New Roman" w:hAnsi="Times New Roman" w:cs="Times New Roman" w:eastAsia="Times New Roman"/>
-                <w:sz w:val="28"/>
-                <w:szCs w:val="28"/>
-              </w:rPr>
-              <w:t xml:space="preserve"> and </w:t>
-            </w:r>
-            <w:r>
-              <w:rPr>
-                <w:rFonts w:ascii="Times New Roman" w:hAnsi="Times New Roman" w:cs="Times New Roman" w:eastAsia="Times New Roman"/>
-                <w:i/>
-                <w:iCs/>
-                <w:sz w:val="28"/>
-                <w:szCs w:val="28"/>
-              </w:rPr>
-              <w:t xml:space="preserve">Cagandahan</w:t>
-            </w:r>
-            <w:r>
-              <w:rPr>
-                <w:rFonts w:ascii="Times New Roman" w:hAnsi="Times New Roman" w:cs="Times New Roman" w:eastAsia="Times New Roman"/>
-                <w:sz w:val="28"/>
-                <w:szCs w:val="28"/>
-              </w:rPr>
-              <w:t xml:space="preserve"> to change the sex entry that determines capacity to marry under the Family Code.</w:t>
+              <w:t xml:space="preserve">The joint committee report recommending approval of S. No. 1600, signed by a majority of senators but referred back to the Committee on Rules after opposition from religious groups.</w:t>
             </w:r>
           </w:p>
         </w:tc>
@@ -5205,7 +5170,7 @@
                 <w:sz w:val="28"/>
                 <w:szCs w:val="28"/>
               </w:rPr>
-              <w:t xml:space="preserve">Mandatory</w:t>
+              <w:t xml:space="preserve">Persuasive</w:t>
             </w:r>
           </w:p>
         </w:tc>
@@ -5224,7 +5189,7 @@
                 <w:sz w:val="28"/>
                 <w:szCs w:val="28"/>
               </w:rPr>
-              <w:t xml:space="preserve">Supreme Court E-Library; Supreme Court website (sc.judiciary.gov.ph); Supreme Court Library</w:t>
+              <w:t xml:space="preserve">Senate Legislative Information System (web.senate.gov.ph); Senate Legislative Reference Bureau</w:t>
             </w:r>
           </w:p>
         </w:tc>
@@ -5248,7 +5213,7 @@
                 <w:sz w:val="28"/>
                 <w:szCs w:val="28"/>
               </w:rPr>
-              <w:t xml:space="preserve">2.</w:t>
+              <w:t xml:space="preserve">3.</w:t>
             </w:r>
           </w:p>
         </w:tc>
@@ -5264,19 +5229,10 @@
             <w:r>
               <w:rPr>
                 <w:rFonts w:ascii="Times New Roman" w:hAnsi="Times New Roman" w:cs="Times New Roman" w:eastAsia="Times New Roman"/>
-                <w:smallCaps/>
-                <w:sz w:val="28"/>
-                <w:szCs w:val="28"/>
-              </w:rPr>
-              <w:t xml:space="preserve">Void and Voidable Marriages Rule</w:t>
-            </w:r>
-            <w:r>
-              <w:rPr>
-                <w:rFonts w:ascii="Times New Roman" w:hAnsi="Times New Roman" w:cs="Times New Roman" w:eastAsia="Times New Roman"/>
-                <w:sz w:val="28"/>
-                <w:szCs w:val="28"/>
-              </w:rPr>
-              <w:t xml:space="preserve">, A.M. No. 02-11-10-SC, effective March 15, 2003.</w:t>
+                <w:sz w:val="28"/>
+                <w:szCs w:val="28"/>
+              </w:rPr>
+              <w:t xml:space="preserve">S. No. 449, 19th Cong., 1st Sess. (2022).</w:t>
             </w:r>
           </w:p>
           <w:p>
@@ -5290,7 +5246,7 @@
                 <w:sz w:val="28"/>
                 <w:szCs w:val="28"/>
               </w:rPr>
-              <w:t xml:space="preserve">Governs the procedure in petitions for declaration of nullity and annulment of marriage, including annulment actions grounded on the fraudulent concealment of homosexuality under Article 46 (4) of the Family Code.</w:t>
+              <w:t xml:space="preserve">Senator Robinhood Padilla’s bill “Institutionalizing Civil Unions of Same Sex Couples, Establishing Their Rights and Obligations,” which would grant same-sex civil partners the benefits and protections enjoyed by married couples.</w:t>
             </w:r>
           </w:p>
         </w:tc>
@@ -5309,7 +5265,7 @@
                 <w:sz w:val="28"/>
                 <w:szCs w:val="28"/>
               </w:rPr>
-              <w:t xml:space="preserve">Mandatory</w:t>
+              <w:t xml:space="preserve">Persuasive</w:t>
             </w:r>
           </w:p>
         </w:tc>
@@ -5328,7 +5284,7 @@
                 <w:sz w:val="28"/>
                 <w:szCs w:val="28"/>
               </w:rPr>
-              <w:t xml:space="preserve">Supreme Court E-Library; Supreme Court website (sc.judiciary.gov.ph); Supreme Court Library</w:t>
+              <w:t xml:space="preserve">Senate Legislative Information System (web.senate.gov.ph); Senate Legislative Reference Bureau</w:t>
             </w:r>
           </w:p>
         </w:tc>
@@ -5352,7 +5308,7 @@
                 <w:sz w:val="28"/>
                 <w:szCs w:val="28"/>
               </w:rPr>
-              <w:t xml:space="preserve">3.</w:t>
+              <w:t xml:space="preserve">4.</w:t>
             </w:r>
           </w:p>
         </w:tc>
@@ -5368,19 +5324,10 @@
             <w:r>
               <w:rPr>
                 <w:rFonts w:ascii="Times New Roman" w:hAnsi="Times New Roman" w:cs="Times New Roman" w:eastAsia="Times New Roman"/>
-                <w:smallCaps/>
-                <w:sz w:val="28"/>
-                <w:szCs w:val="28"/>
-              </w:rPr>
-              <w:t xml:space="preserve">Legal Separation Rule</w:t>
-            </w:r>
-            <w:r>
-              <w:rPr>
-                <w:rFonts w:ascii="Times New Roman" w:hAnsi="Times New Roman" w:cs="Times New Roman" w:eastAsia="Times New Roman"/>
-                <w:sz w:val="28"/>
-                <w:szCs w:val="28"/>
-              </w:rPr>
-              <w:t xml:space="preserve">, A.M. No. 02-11-11-SC, effective March 15, 2003.</w:t>
+                <w:sz w:val="28"/>
+                <w:szCs w:val="28"/>
+              </w:rPr>
+              <w:t xml:space="preserve">H. No. 1015, 19th Cong., 1st Sess. (2022).</w:t>
             </w:r>
           </w:p>
           <w:p>
@@ -5394,7 +5341,7 @@
                 <w:sz w:val="28"/>
                 <w:szCs w:val="28"/>
               </w:rPr>
-              <w:t xml:space="preserve">Governs petitions for legal separation, including those grounded on the lesbianism or homosexuality of the respondent under Article 55 (6) of the Family Code.</w:t>
+              <w:t xml:space="preserve">The “Civil Partnership Act,” which would allow couples of the same or opposite sex to enter into civil partnerships with rights such as designating partners as beneficiaries and inheriting from them by intestate succession.</w:t>
             </w:r>
           </w:p>
         </w:tc>
@@ -5413,7 +5360,7 @@
                 <w:sz w:val="28"/>
                 <w:szCs w:val="28"/>
               </w:rPr>
-              <w:t xml:space="preserve">Mandatory</w:t>
+              <w:t xml:space="preserve">Persuasive</w:t>
             </w:r>
           </w:p>
         </w:tc>
@@ -5432,7 +5379,7 @@
                 <w:sz w:val="28"/>
                 <w:szCs w:val="28"/>
               </w:rPr>
-              <w:t xml:space="preserve">Supreme Court E-Library; Supreme Court website (sc.judiciary.gov.ph); Supreme Court Library</w:t>
+              <w:t xml:space="preserve">House of Representatives Legislative Information System (congress.gov.ph)</w:t>
             </w:r>
           </w:p>
         </w:tc>
@@ -5456,7 +5403,7 @@
                 <w:sz w:val="28"/>
                 <w:szCs w:val="28"/>
               </w:rPr>
-              <w:t xml:space="preserve">4.</w:t>
+              <w:t xml:space="preserve">5.</w:t>
             </w:r>
           </w:p>
         </w:tc>
@@ -5475,7 +5422,7 @@
                 <w:sz w:val="28"/>
                 <w:szCs w:val="28"/>
               </w:rPr>
-              <w:t xml:space="preserve">New Code of Judicial Conduct for the Philippine Judiciary, A.M. No. 03-05-01-SC, Canon 5, secs. 1-2 (2004).</w:t>
+              <w:t xml:space="preserve">H. No. 2264, 18th Cong., 1st Sess. (2019).</w:t>
             </w:r>
           </w:p>
           <w:p>
@@ -5489,25 +5436,7 @@
                 <w:sz w:val="28"/>
                 <w:szCs w:val="28"/>
               </w:rPr>
-              <w:t xml:space="preserve">Requires judges to understand diversity in society and not to manifest bias or prejudice on irrelevant grounds, standards the Supreme Court enforced in </w:t>
-            </w:r>
-            <w:r>
-              <w:rPr>
-                <w:rFonts w:ascii="Times New Roman" w:hAnsi="Times New Roman" w:cs="Times New Roman" w:eastAsia="Times New Roman"/>
-                <w:i/>
-                <w:iCs/>
-                <w:sz w:val="28"/>
-                <w:szCs w:val="28"/>
-              </w:rPr>
-              <w:t xml:space="preserve">Espejon v. Lorredo</w:t>
-            </w:r>
-            <w:r>
-              <w:rPr>
-                <w:rFonts w:ascii="Times New Roman" w:hAnsi="Times New Roman" w:cs="Times New Roman" w:eastAsia="Times New Roman"/>
-                <w:sz w:val="28"/>
-                <w:szCs w:val="28"/>
-              </w:rPr>
-              <w:t xml:space="preserve"> against a judge who disparaged litigants’ same-sex relationship.</w:t>
+              <w:t xml:space="preserve">Representative Pantaleon Alvarez’s refiled Civil Partnership bill allowing couples of the same or opposite sex to form civil partnerships, which remained pending at the committee level.</w:t>
             </w:r>
           </w:p>
         </w:tc>
@@ -5526,7 +5455,7 @@
                 <w:sz w:val="28"/>
                 <w:szCs w:val="28"/>
               </w:rPr>
-              <w:t xml:space="preserve">Mandatory</w:t>
+              <w:t xml:space="preserve">Persuasive</w:t>
             </w:r>
           </w:p>
         </w:tc>
@@ -5545,7 +5474,7 @@
                 <w:sz w:val="28"/>
                 <w:szCs w:val="28"/>
               </w:rPr>
-              <w:t xml:space="preserve">Supreme Court E-Library; Supreme Court website (sc.judiciary.gov.ph); Supreme Court Library</w:t>
+              <w:t xml:space="preserve">House of Representatives Legislative Information System (congress.gov.ph)</w:t>
             </w:r>
           </w:p>
         </w:tc>
@@ -5569,7 +5498,7 @@
                 <w:sz w:val="28"/>
                 <w:szCs w:val="28"/>
               </w:rPr>
-              <w:t xml:space="preserve">5.</w:t>
+              <w:t xml:space="preserve">6.</w:t>
             </w:r>
           </w:p>
         </w:tc>
@@ -5588,7 +5517,7 @@
                 <w:sz w:val="28"/>
                 <w:szCs w:val="28"/>
               </w:rPr>
-              <w:t xml:space="preserve">Code of Professional Responsibility and Accountability, A.M. No. 22-09-01-SC, Canon V, sec. 1 (2023).</w:t>
+              <w:t xml:space="preserve">H. No. 6595, 17th Cong., 2d Sess. (2017).</w:t>
             </w:r>
           </w:p>
           <w:p>
@@ -5602,7 +5531,7 @@
                 <w:sz w:val="28"/>
                 <w:szCs w:val="28"/>
               </w:rPr>
-              <w:t xml:space="preserve">Prohibits a lawyer from declining to represent a person solely on account of sexual orientation or gender identity, among other grounds, securing access to counsel for same-sex couples asserting their rights.</w:t>
+              <w:t xml:space="preserve">The Civil Partnership Act filed by then Speaker Pantaleon Alvarez, proposing to extend the benefits and protections granted to spouses to same-sex and opposite-sex civil partners.</w:t>
             </w:r>
           </w:p>
         </w:tc>
@@ -5621,7 +5550,7 @@
                 <w:sz w:val="28"/>
                 <w:szCs w:val="28"/>
               </w:rPr>
-              <w:t xml:space="preserve">Mandatory</w:t>
+              <w:t xml:space="preserve">Persuasive</w:t>
             </w:r>
           </w:p>
         </w:tc>
@@ -5640,7 +5569,7 @@
                 <w:sz w:val="28"/>
                 <w:szCs w:val="28"/>
               </w:rPr>
-              <w:t xml:space="preserve">Supreme Court E-Library; Supreme Court website (sc.judiciary.gov.ph); Supreme Court Library</w:t>
+              <w:t xml:space="preserve">House of Representatives Legislative Information System (congress.gov.ph)</w:t>
             </w:r>
           </w:p>
         </w:tc>
@@ -5655,19 +5584,16 @@
           </w:tcPr>
           <w:p>
             <w:pPr>
-              <w:keepNext/>
-              <w:spacing w:before="0" w:after="0" w:line="240" w:lineRule="auto"/>
-              <w:jc w:val="left"/>
-            </w:pPr>
-            <w:r>
-              <w:rPr>
-                <w:rFonts w:ascii="Times New Roman" w:hAnsi="Times New Roman" w:cs="Times New Roman" w:eastAsia="Times New Roman"/>
-                <w:b/>
-                <w:bCs/>
-                <w:sz w:val="28"/>
-                <w:szCs w:val="28"/>
-              </w:rPr>
-              <w:t xml:space="preserve">G.</w:t>
+              <w:spacing w:before="0" w:after="0" w:line="240" w:lineRule="auto"/>
+              <w:jc w:val="left"/>
+            </w:pPr>
+            <w:r>
+              <w:rPr>
+                <w:rFonts w:ascii="Times New Roman" w:hAnsi="Times New Roman" w:cs="Times New Roman" w:eastAsia="Times New Roman"/>
+                <w:sz w:val="28"/>
+                <w:szCs w:val="28"/>
+              </w:rPr>
+              <w:t xml:space="preserve">7.</w:t>
             </w:r>
           </w:p>
         </w:tc>
@@ -5677,19 +5603,30 @@
           </w:tcPr>
           <w:p>
             <w:pPr>
-              <w:keepNext/>
-              <w:spacing w:before="0" w:after="0" w:line="240" w:lineRule="auto"/>
-              <w:jc w:val="left"/>
-            </w:pPr>
-            <w:r>
-              <w:rPr>
-                <w:rFonts w:ascii="Times New Roman" w:hAnsi="Times New Roman" w:cs="Times New Roman" w:eastAsia="Times New Roman"/>
-                <w:b/>
-                <w:bCs/>
-                <w:sz w:val="28"/>
-                <w:szCs w:val="28"/>
-              </w:rPr>
-              <w:t xml:space="preserve">JUDICIAL DECISIONS</w:t>
+              <w:spacing w:before="0" w:after="0" w:line="240" w:lineRule="auto"/>
+              <w:jc w:val="left"/>
+            </w:pPr>
+            <w:r>
+              <w:rPr>
+                <w:rFonts w:ascii="Times New Roman" w:hAnsi="Times New Roman" w:cs="Times New Roman" w:eastAsia="Times New Roman"/>
+                <w:sz w:val="28"/>
+                <w:szCs w:val="28"/>
+              </w:rPr>
+              <w:t xml:space="preserve">H. No. 4982, 17th Cong., 1st Sess. (2017).</w:t>
+            </w:r>
+          </w:p>
+          <w:p>
+            <w:pPr>
+              <w:spacing w:before="60" w:after="0" w:line="240" w:lineRule="auto"/>
+              <w:jc w:val="both"/>
+            </w:pPr>
+            <w:r>
+              <w:rPr>
+                <w:rFonts w:ascii="Times New Roman" w:hAnsi="Times New Roman" w:cs="Times New Roman" w:eastAsia="Times New Roman"/>
+                <w:sz w:val="28"/>
+                <w:szCs w:val="28"/>
+              </w:rPr>
+              <w:t xml:space="preserve">The SOGIE Equality Act, approved by the House of Representatives on third reading on September 20, 2017 by a vote of 198–0, but never enacted after stalling in the Senate.</w:t>
             </w:r>
           </w:p>
         </w:tc>
@@ -5699,10 +5636,17 @@
           </w:tcPr>
           <w:p>
             <w:pPr>
-              <w:keepNext/>
-              <w:spacing w:before="0" w:after="0" w:line="240" w:lineRule="auto"/>
-              <w:jc w:val="left"/>
-            </w:pPr>
+              <w:spacing w:before="0" w:after="0" w:line="240" w:lineRule="auto"/>
+              <w:jc w:val="left"/>
+            </w:pPr>
+            <w:r>
+              <w:rPr>
+                <w:rFonts w:ascii="Times New Roman" w:hAnsi="Times New Roman" w:cs="Times New Roman" w:eastAsia="Times New Roman"/>
+                <w:sz w:val="28"/>
+                <w:szCs w:val="28"/>
+              </w:rPr>
+              <w:t xml:space="preserve">Persuasive</w:t>
+            </w:r>
           </w:p>
         </w:tc>
         <w:tc>
@@ -5711,10 +5655,17 @@
           </w:tcPr>
           <w:p>
             <w:pPr>
-              <w:keepNext/>
-              <w:spacing w:before="0" w:after="0" w:line="240" w:lineRule="auto"/>
-              <w:jc w:val="left"/>
-            </w:pPr>
+              <w:spacing w:before="0" w:after="0" w:line="240" w:lineRule="auto"/>
+              <w:jc w:val="left"/>
+            </w:pPr>
+            <w:r>
+              <w:rPr>
+                <w:rFonts w:ascii="Times New Roman" w:hAnsi="Times New Roman" w:cs="Times New Roman" w:eastAsia="Times New Roman"/>
+                <w:sz w:val="28"/>
+                <w:szCs w:val="28"/>
+              </w:rPr>
+              <w:t xml:space="preserve">House of Representatives Legislative Information System (congress.gov.ph)</w:t>
+            </w:r>
           </w:p>
         </w:tc>
       </w:tr>
@@ -5728,16 +5679,19 @@
           </w:tcPr>
           <w:p>
             <w:pPr>
-              <w:spacing w:before="0" w:after="0" w:line="240" w:lineRule="auto"/>
-              <w:jc w:val="left"/>
-            </w:pPr>
-            <w:r>
-              <w:rPr>
-                <w:rFonts w:ascii="Times New Roman" w:hAnsi="Times New Roman" w:cs="Times New Roman" w:eastAsia="Times New Roman"/>
-                <w:sz w:val="28"/>
-                <w:szCs w:val="28"/>
-              </w:rPr>
-              <w:t xml:space="preserve">1.</w:t>
+              <w:keepNext/>
+              <w:spacing w:before="0" w:after="0" w:line="240" w:lineRule="auto"/>
+              <w:jc w:val="left"/>
+            </w:pPr>
+            <w:r>
+              <w:rPr>
+                <w:rFonts w:ascii="Times New Roman" w:hAnsi="Times New Roman" w:cs="Times New Roman" w:eastAsia="Times New Roman"/>
+                <w:b/>
+                <w:bCs/>
+                <w:sz w:val="28"/>
+                <w:szCs w:val="28"/>
+              </w:rPr>
+              <w:t xml:space="preserve">D.</w:t>
             </w:r>
           </w:p>
         </w:tc>
@@ -5747,30 +5701,19 @@
           </w:tcPr>
           <w:p>
             <w:pPr>
-              <w:spacing w:before="0" w:after="0" w:line="240" w:lineRule="auto"/>
-              <w:jc w:val="left"/>
-            </w:pPr>
-            <w:r>
-              <w:rPr>
-                <w:rFonts w:ascii="Times New Roman" w:hAnsi="Times New Roman" w:cs="Times New Roman" w:eastAsia="Times New Roman"/>
-                <w:sz w:val="28"/>
-                <w:szCs w:val="28"/>
-              </w:rPr>
-              <w:t xml:space="preserve">Falcis III v. Civil Registrar General, G.R. No. 217910, September 3, 2019.</w:t>
-            </w:r>
-          </w:p>
-          <w:p>
-            <w:pPr>
-              <w:spacing w:before="60" w:after="0" w:line="240" w:lineRule="auto"/>
-              <w:jc w:val="both"/>
-            </w:pPr>
-            <w:r>
-              <w:rPr>
-                <w:rFonts w:ascii="Times New Roman" w:hAnsi="Times New Roman" w:cs="Times New Roman" w:eastAsia="Times New Roman"/>
-                <w:sz w:val="28"/>
-                <w:szCs w:val="28"/>
-              </w:rPr>
-              <w:t xml:space="preserve">The Court En Banc dismissed the first petition to declare Family Code Articles 1, 2, 46 (4), and 55 (6) unconstitutional for lack of an actual case, lack of standing, and disregard of the hierarchy of courts, while noting that the Constitution does not restrict marriage on the basis of sex or sexual orientation and leaving the matter to Congress.</w:t>
+              <w:keepNext/>
+              <w:spacing w:before="0" w:after="0" w:line="240" w:lineRule="auto"/>
+              <w:jc w:val="left"/>
+            </w:pPr>
+            <w:r>
+              <w:rPr>
+                <w:rFonts w:ascii="Times New Roman" w:hAnsi="Times New Roman" w:cs="Times New Roman" w:eastAsia="Times New Roman"/>
+                <w:b/>
+                <w:bCs/>
+                <w:sz w:val="28"/>
+                <w:szCs w:val="28"/>
+              </w:rPr>
+              <w:t xml:space="preserve">EXECUTIVE AND ADMINISTRATIVE ISSUANCES (QUASI-LEGISLATIVE)</w:t>
             </w:r>
           </w:p>
         </w:tc>
@@ -5780,17 +5723,10 @@
           </w:tcPr>
           <w:p>
             <w:pPr>
-              <w:spacing w:before="0" w:after="0" w:line="240" w:lineRule="auto"/>
-              <w:jc w:val="left"/>
-            </w:pPr>
-            <w:r>
-              <w:rPr>
-                <w:rFonts w:ascii="Times New Roman" w:hAnsi="Times New Roman" w:cs="Times New Roman" w:eastAsia="Times New Roman"/>
-                <w:sz w:val="28"/>
-                <w:szCs w:val="28"/>
-              </w:rPr>
-              <w:t xml:space="preserve">Mandatory</w:t>
-            </w:r>
+              <w:keepNext/>
+              <w:spacing w:before="0" w:after="0" w:line="240" w:lineRule="auto"/>
+              <w:jc w:val="left"/>
+            </w:pPr>
           </w:p>
         </w:tc>
         <w:tc>
@@ -5799,17 +5735,10 @@
           </w:tcPr>
           <w:p>
             <w:pPr>
-              <w:spacing w:before="0" w:after="0" w:line="240" w:lineRule="auto"/>
-              <w:jc w:val="left"/>
-            </w:pPr>
-            <w:r>
-              <w:rPr>
-                <w:rFonts w:ascii="Times New Roman" w:hAnsi="Times New Roman" w:cs="Times New Roman" w:eastAsia="Times New Roman"/>
-                <w:sz w:val="28"/>
-                <w:szCs w:val="28"/>
-              </w:rPr>
-              <w:t xml:space="preserve">Supreme Court E-Library; Supreme Court website (sc.judiciary.gov.ph)</w:t>
-            </w:r>
+              <w:keepNext/>
+              <w:spacing w:before="0" w:after="0" w:line="240" w:lineRule="auto"/>
+              <w:jc w:val="left"/>
+            </w:pPr>
           </w:p>
         </w:tc>
       </w:tr>
@@ -5832,7 +5761,7 @@
                 <w:sz w:val="28"/>
                 <w:szCs w:val="28"/>
               </w:rPr>
-              <w:t xml:space="preserve">2.</w:t>
+              <w:t xml:space="preserve">1.</w:t>
             </w:r>
           </w:p>
         </w:tc>
@@ -5851,7 +5780,7 @@
                 <w:sz w:val="28"/>
                 <w:szCs w:val="28"/>
               </w:rPr>
-              <w:t xml:space="preserve">Garcia v. Drilon, G.R. No. 179267, June 25, 2013.</w:t>
+              <w:t xml:space="preserve">CSC Res. No. 01-0940 (2001).</w:t>
             </w:r>
           </w:p>
           <w:p>
@@ -5865,7 +5794,7 @@
                 <w:sz w:val="28"/>
                 <w:szCs w:val="28"/>
               </w:rPr>
-              <w:t xml:space="preserve">In upholding R.A. No. 9262, the Court En Banc recognized that the law’s gender-neutral term “any person” may cover a woman offender in a lesbian relationship, a point later applied in </w:t>
+              <w:t xml:space="preserve">The Administrative Disciplinary Rules on Sexual Harassment Cases classify degrading remarks or innuendoes directed at a person’s sexual orientation as an offense, a rule applied by the Supreme Court in </w:t>
             </w:r>
             <w:r>
               <w:rPr>
@@ -5875,15 +5804,15 @@
                 <w:sz w:val="28"/>
                 <w:szCs w:val="28"/>
               </w:rPr>
-              <w:t xml:space="preserve">Jacinto v. Fouts</w:t>
-            </w:r>
-            <w:r>
-              <w:rPr>
-                <w:rFonts w:ascii="Times New Roman" w:hAnsi="Times New Roman" w:cs="Times New Roman" w:eastAsia="Times New Roman"/>
-                <w:sz w:val="28"/>
-                <w:szCs w:val="28"/>
-              </w:rPr>
-              <w:t xml:space="preserve">.</w:t>
+              <w:t xml:space="preserve">Espejon v. Lorredo</w:t>
+            </w:r>
+            <w:r>
+              <w:rPr>
+                <w:rFonts w:ascii="Times New Roman" w:hAnsi="Times New Roman" w:cs="Times New Roman" w:eastAsia="Times New Roman"/>
+                <w:sz w:val="28"/>
+                <w:szCs w:val="28"/>
+              </w:rPr>
+              <w:t xml:space="preserve"> to a judge’s remarks against a same-sex couple.</w:t>
             </w:r>
           </w:p>
         </w:tc>
@@ -5921,7 +5850,7 @@
                 <w:sz w:val="28"/>
                 <w:szCs w:val="28"/>
               </w:rPr>
-              <w:t xml:space="preserve">Supreme Court E-Library; Supreme Court website (sc.judiciary.gov.ph)</w:t>
+              <w:t xml:space="preserve">Civil Service Commission (csc.gov.ph); Office of the National Administrative Register (ONAR), U.P. Law Center</w:t>
             </w:r>
           </w:p>
         </w:tc>
@@ -5936,16 +5865,19 @@
           </w:tcPr>
           <w:p>
             <w:pPr>
-              <w:spacing w:before="0" w:after="0" w:line="240" w:lineRule="auto"/>
-              <w:jc w:val="left"/>
-            </w:pPr>
-            <w:r>
-              <w:rPr>
-                <w:rFonts w:ascii="Times New Roman" w:hAnsi="Times New Roman" w:cs="Times New Roman" w:eastAsia="Times New Roman"/>
-                <w:sz w:val="28"/>
-                <w:szCs w:val="28"/>
-              </w:rPr>
-              <w:t xml:space="preserve">3.</w:t>
+              <w:keepNext/>
+              <w:spacing w:before="0" w:after="0" w:line="240" w:lineRule="auto"/>
+              <w:jc w:val="left"/>
+            </w:pPr>
+            <w:r>
+              <w:rPr>
+                <w:rFonts w:ascii="Times New Roman" w:hAnsi="Times New Roman" w:cs="Times New Roman" w:eastAsia="Times New Roman"/>
+                <w:b/>
+                <w:bCs/>
+                <w:sz w:val="28"/>
+                <w:szCs w:val="28"/>
+              </w:rPr>
+              <w:t xml:space="preserve">E.</w:t>
             </w:r>
           </w:p>
         </w:tc>
@@ -5955,48 +5887,19 @@
           </w:tcPr>
           <w:p>
             <w:pPr>
-              <w:spacing w:before="0" w:after="0" w:line="240" w:lineRule="auto"/>
-              <w:jc w:val="left"/>
-            </w:pPr>
-            <w:r>
-              <w:rPr>
-                <w:rFonts w:ascii="Times New Roman" w:hAnsi="Times New Roman" w:cs="Times New Roman" w:eastAsia="Times New Roman"/>
-                <w:sz w:val="28"/>
-                <w:szCs w:val="28"/>
-              </w:rPr>
-              <w:t xml:space="preserve">Ang Ladlad LGBT Party v. Commission on Elections, 632 Phil. 32 (2010).</w:t>
-            </w:r>
-          </w:p>
-          <w:p>
-            <w:pPr>
-              <w:spacing w:before="60" w:after="0" w:line="240" w:lineRule="auto"/>
-              <w:jc w:val="both"/>
-            </w:pPr>
-            <w:r>
-              <w:rPr>
-                <w:rFonts w:ascii="Times New Roman" w:hAnsi="Times New Roman" w:cs="Times New Roman" w:eastAsia="Times New Roman"/>
-                <w:sz w:val="28"/>
-                <w:szCs w:val="28"/>
-              </w:rPr>
-              <w:t xml:space="preserve">The Court held that denying party-list accreditation to an LGBT group on religious and moral grounds violated the non-establishment clause, equal protection, and freedom of expression and association, while describing the Yogyakarta Principles as at best </w:t>
-            </w:r>
-            <w:r>
-              <w:rPr>
-                <w:rFonts w:ascii="Times New Roman" w:hAnsi="Times New Roman" w:cs="Times New Roman" w:eastAsia="Times New Roman"/>
-                <w:i/>
-                <w:iCs/>
-                <w:sz w:val="28"/>
-                <w:szCs w:val="28"/>
-              </w:rPr>
-              <w:t xml:space="preserve">de lege ferenda</w:t>
-            </w:r>
-            <w:r>
-              <w:rPr>
-                <w:rFonts w:ascii="Times New Roman" w:hAnsi="Times New Roman" w:cs="Times New Roman" w:eastAsia="Times New Roman"/>
-                <w:sz w:val="28"/>
-                <w:szCs w:val="28"/>
-              </w:rPr>
-              <w:t xml:space="preserve">.</w:t>
+              <w:keepNext/>
+              <w:spacing w:before="0" w:after="0" w:line="240" w:lineRule="auto"/>
+              <w:jc w:val="left"/>
+            </w:pPr>
+            <w:r>
+              <w:rPr>
+                <w:rFonts w:ascii="Times New Roman" w:hAnsi="Times New Roman" w:cs="Times New Roman" w:eastAsia="Times New Roman"/>
+                <w:b/>
+                <w:bCs/>
+                <w:sz w:val="28"/>
+                <w:szCs w:val="28"/>
+              </w:rPr>
+              <w:t xml:space="preserve">EXECUTIVE AND ADMINISTRATIVE DECISIONS (QUASI-JUDICIAL)</w:t>
             </w:r>
           </w:p>
         </w:tc>
@@ -6006,17 +5909,10 @@
           </w:tcPr>
           <w:p>
             <w:pPr>
-              <w:spacing w:before="0" w:after="0" w:line="240" w:lineRule="auto"/>
-              <w:jc w:val="left"/>
-            </w:pPr>
-            <w:r>
-              <w:rPr>
-                <w:rFonts w:ascii="Times New Roman" w:hAnsi="Times New Roman" w:cs="Times New Roman" w:eastAsia="Times New Roman"/>
-                <w:sz w:val="28"/>
-                <w:szCs w:val="28"/>
-              </w:rPr>
-              <w:t xml:space="preserve">Mandatory</w:t>
-            </w:r>
+              <w:keepNext/>
+              <w:spacing w:before="0" w:after="0" w:line="240" w:lineRule="auto"/>
+              <w:jc w:val="left"/>
+            </w:pPr>
           </w:p>
         </w:tc>
         <w:tc>
@@ -6025,17 +5921,10 @@
           </w:tcPr>
           <w:p>
             <w:pPr>
-              <w:spacing w:before="0" w:after="0" w:line="240" w:lineRule="auto"/>
-              <w:jc w:val="left"/>
-            </w:pPr>
-            <w:r>
-              <w:rPr>
-                <w:rFonts w:ascii="Times New Roman" w:hAnsi="Times New Roman" w:cs="Times New Roman" w:eastAsia="Times New Roman"/>
-                <w:sz w:val="28"/>
-                <w:szCs w:val="28"/>
-              </w:rPr>
-              <w:t xml:space="preserve">Philippine Reports, vol. 632; Supreme Court E-Library</w:t>
-            </w:r>
+              <w:keepNext/>
+              <w:spacing w:before="0" w:after="0" w:line="240" w:lineRule="auto"/>
+              <w:jc w:val="left"/>
+            </w:pPr>
           </w:p>
         </w:tc>
       </w:tr>
@@ -6058,7 +5947,7 @@
                 <w:sz w:val="28"/>
                 <w:szCs w:val="28"/>
               </w:rPr>
-              <w:t xml:space="preserve">4.</w:t>
+              <w:t xml:space="preserve">1.</w:t>
             </w:r>
           </w:p>
         </w:tc>
@@ -6074,10 +5963,20 @@
             <w:r>
               <w:rPr>
                 <w:rFonts w:ascii="Times New Roman" w:hAnsi="Times New Roman" w:cs="Times New Roman" w:eastAsia="Times New Roman"/>
-                <w:sz w:val="28"/>
-                <w:szCs w:val="28"/>
-              </w:rPr>
-              <w:t xml:space="preserve">Estrada v. Escritor, 455 Phil. 411 (2003); 525 Phil. 110 (2006).</w:t>
+                <w:i/>
+                <w:iCs/>
+                <w:sz w:val="28"/>
+                <w:szCs w:val="28"/>
+              </w:rPr>
+              <w:t xml:space="preserve">In re</w:t>
+            </w:r>
+            <w:r>
+              <w:rPr>
+                <w:rFonts w:ascii="Times New Roman" w:hAnsi="Times New Roman" w:cs="Times New Roman" w:eastAsia="Times New Roman"/>
+                <w:sz w:val="28"/>
+                <w:szCs w:val="28"/>
+              </w:rPr>
+              <w:t xml:space="preserve"> Ang Ladlad LGBT Party, COMELEC SPP No. 09-228 (PL), November 11, 2009.</w:t>
             </w:r>
           </w:p>
           <w:p>
@@ -6091,7 +5990,7 @@
                 <w:sz w:val="28"/>
                 <w:szCs w:val="28"/>
               </w:rPr>
-              <w:t xml:space="preserve">Adopted benevolent neutrality and the compelling state interest test in resolving a religiously sanctioned non-marital union, the framework for weighing religious claims on both sides of the same-sex marriage debate.</w:t>
+              <w:t xml:space="preserve">The COMELEC Second Division denied an LGBT group’s petition for party-list registration on moral grounds, citing Biblical and Koranic passages, a ruling the Supreme Court later set aside.</w:t>
             </w:r>
           </w:p>
         </w:tc>
@@ -6110,7 +6009,7 @@
                 <w:sz w:val="28"/>
                 <w:szCs w:val="28"/>
               </w:rPr>
-              <w:t xml:space="preserve">Mandatory</w:t>
+              <w:t xml:space="preserve">Persuasive</w:t>
             </w:r>
           </w:p>
         </w:tc>
@@ -6129,7 +6028,25 @@
                 <w:sz w:val="28"/>
                 <w:szCs w:val="28"/>
               </w:rPr>
-              <w:t xml:space="preserve">Philippine Reports, vols. 455 &amp; 525; Supreme Court E-Library</w:t>
+              <w:t xml:space="preserve">Commission on Elections (deciding agency); quoted in </w:t>
+            </w:r>
+            <w:r>
+              <w:rPr>
+                <w:rFonts w:ascii="Times New Roman" w:hAnsi="Times New Roman" w:cs="Times New Roman" w:eastAsia="Times New Roman"/>
+                <w:i/>
+                <w:iCs/>
+                <w:sz w:val="28"/>
+                <w:szCs w:val="28"/>
+              </w:rPr>
+              <w:t xml:space="preserve">Ang Ladlad</w:t>
+            </w:r>
+            <w:r>
+              <w:rPr>
+                <w:rFonts w:ascii="Times New Roman" w:hAnsi="Times New Roman" w:cs="Times New Roman" w:eastAsia="Times New Roman"/>
+                <w:sz w:val="28"/>
+                <w:szCs w:val="28"/>
+              </w:rPr>
+              <w:t xml:space="preserve"> (Supreme Court E-Library)</w:t>
             </w:r>
           </w:p>
         </w:tc>
@@ -6153,7 +6070,7 @@
                 <w:sz w:val="28"/>
                 <w:szCs w:val="28"/>
               </w:rPr>
-              <w:t xml:space="preserve">5.</w:t>
+              <w:t xml:space="preserve">2.</w:t>
             </w:r>
           </w:p>
         </w:tc>
@@ -6169,10 +6086,20 @@
             <w:r>
               <w:rPr>
                 <w:rFonts w:ascii="Times New Roman" w:hAnsi="Times New Roman" w:cs="Times New Roman" w:eastAsia="Times New Roman"/>
-                <w:sz w:val="28"/>
-                <w:szCs w:val="28"/>
-              </w:rPr>
-              <w:t xml:space="preserve">Goitia v. Campos Rueda, 35 Phil. 252 (1916).</w:t>
+                <w:i/>
+                <w:iCs/>
+                <w:sz w:val="28"/>
+                <w:szCs w:val="28"/>
+              </w:rPr>
+              <w:t xml:space="preserve">In re</w:t>
+            </w:r>
+            <w:r>
+              <w:rPr>
+                <w:rFonts w:ascii="Times New Roman" w:hAnsi="Times New Roman" w:cs="Times New Roman" w:eastAsia="Times New Roman"/>
+                <w:sz w:val="28"/>
+                <w:szCs w:val="28"/>
+              </w:rPr>
+              <w:t xml:space="preserve"> Ang Ladlad LGBT Party, COMELEC SPP No. 09-228 (PL), December 16, 2009.</w:t>
             </w:r>
           </w:p>
           <w:p>
@@ -6186,7 +6113,7 @@
                 <w:sz w:val="28"/>
                 <w:szCs w:val="28"/>
               </w:rPr>
-              <w:t xml:space="preserve">Described marriage as “something more than a mere contract,” a relation whose rights and duties rest on the general law rather than on the parties’ agreement, a characterization central to whether the State may redefine who may marry.</w:t>
+              <w:t xml:space="preserve">The COMELEC En Banc, in a divided vote, denied reconsideration, prompting the certiorari petition that produced the Supreme Court’s leading decision on LGBT equality.</w:t>
             </w:r>
           </w:p>
         </w:tc>
@@ -6205,7 +6132,7 @@
                 <w:sz w:val="28"/>
                 <w:szCs w:val="28"/>
               </w:rPr>
-              <w:t xml:space="preserve">Mandatory</w:t>
+              <w:t xml:space="preserve">Persuasive</w:t>
             </w:r>
           </w:p>
         </w:tc>
@@ -6224,7 +6151,25 @@
                 <w:sz w:val="28"/>
                 <w:szCs w:val="28"/>
               </w:rPr>
-              <w:t xml:space="preserve">Philippine Reports, vol. 35; Supreme Court E-Library</w:t>
+              <w:t xml:space="preserve">Commission on Elections (deciding agency); quoted in </w:t>
+            </w:r>
+            <w:r>
+              <w:rPr>
+                <w:rFonts w:ascii="Times New Roman" w:hAnsi="Times New Roman" w:cs="Times New Roman" w:eastAsia="Times New Roman"/>
+                <w:i/>
+                <w:iCs/>
+                <w:sz w:val="28"/>
+                <w:szCs w:val="28"/>
+              </w:rPr>
+              <w:t xml:space="preserve">Ang Ladlad</w:t>
+            </w:r>
+            <w:r>
+              <w:rPr>
+                <w:rFonts w:ascii="Times New Roman" w:hAnsi="Times New Roman" w:cs="Times New Roman" w:eastAsia="Times New Roman"/>
+                <w:sz w:val="28"/>
+                <w:szCs w:val="28"/>
+              </w:rPr>
+              <w:t xml:space="preserve"> (Supreme Court E-Library)</w:t>
             </w:r>
           </w:p>
         </w:tc>
@@ -6239,16 +6184,19 @@
           </w:tcPr>
           <w:p>
             <w:pPr>
-              <w:spacing w:before="0" w:after="0" w:line="240" w:lineRule="auto"/>
-              <w:jc w:val="left"/>
-            </w:pPr>
-            <w:r>
-              <w:rPr>
-                <w:rFonts w:ascii="Times New Roman" w:hAnsi="Times New Roman" w:cs="Times New Roman" w:eastAsia="Times New Roman"/>
-                <w:sz w:val="28"/>
-                <w:szCs w:val="28"/>
-              </w:rPr>
-              <w:t xml:space="preserve">6.</w:t>
+              <w:keepNext/>
+              <w:spacing w:before="0" w:after="0" w:line="240" w:lineRule="auto"/>
+              <w:jc w:val="left"/>
+            </w:pPr>
+            <w:r>
+              <w:rPr>
+                <w:rFonts w:ascii="Times New Roman" w:hAnsi="Times New Roman" w:cs="Times New Roman" w:eastAsia="Times New Roman"/>
+                <w:b/>
+                <w:bCs/>
+                <w:sz w:val="28"/>
+                <w:szCs w:val="28"/>
+              </w:rPr>
+              <w:t xml:space="preserve">F.</w:t>
             </w:r>
           </w:p>
         </w:tc>
@@ -6258,30 +6206,19 @@
           </w:tcPr>
           <w:p>
             <w:pPr>
-              <w:spacing w:before="0" w:after="0" w:line="240" w:lineRule="auto"/>
-              <w:jc w:val="left"/>
-            </w:pPr>
-            <w:r>
-              <w:rPr>
-                <w:rFonts w:ascii="Times New Roman" w:hAnsi="Times New Roman" w:cs="Times New Roman" w:eastAsia="Times New Roman"/>
-                <w:sz w:val="28"/>
-                <w:szCs w:val="28"/>
-              </w:rPr>
-              <w:t xml:space="preserve">Josef v. Ursua, G.R. No. 267469, February 5, 2025.</w:t>
-            </w:r>
-          </w:p>
-          <w:p>
-            <w:pPr>
-              <w:spacing w:before="60" w:after="0" w:line="240" w:lineRule="auto"/>
-              <w:jc w:val="both"/>
-            </w:pPr>
-            <w:r>
-              <w:rPr>
-                <w:rFonts w:ascii="Times New Roman" w:hAnsi="Times New Roman" w:cs="Times New Roman" w:eastAsia="Times New Roman"/>
-                <w:sz w:val="28"/>
-                <w:szCs w:val="28"/>
-              </w:rPr>
-              <w:t xml:space="preserve">The Court held that the property relations of cohabiting same-sex partners are governed by Article 148 of the Family Code, so that a partner who proves actual contribution is a co-owner, while stating that broader protection for same-sex couples is for Congress to provide.</w:t>
+              <w:keepNext/>
+              <w:spacing w:before="0" w:after="0" w:line="240" w:lineRule="auto"/>
+              <w:jc w:val="left"/>
+            </w:pPr>
+            <w:r>
+              <w:rPr>
+                <w:rFonts w:ascii="Times New Roman" w:hAnsi="Times New Roman" w:cs="Times New Roman" w:eastAsia="Times New Roman"/>
+                <w:b/>
+                <w:bCs/>
+                <w:sz w:val="28"/>
+                <w:szCs w:val="28"/>
+              </w:rPr>
+              <w:t xml:space="preserve">JUDICIAL ISSUANCES (SUPREME COURT)</w:t>
             </w:r>
           </w:p>
         </w:tc>
@@ -6291,17 +6228,10 @@
           </w:tcPr>
           <w:p>
             <w:pPr>
-              <w:spacing w:before="0" w:after="0" w:line="240" w:lineRule="auto"/>
-              <w:jc w:val="left"/>
-            </w:pPr>
-            <w:r>
-              <w:rPr>
-                <w:rFonts w:ascii="Times New Roman" w:hAnsi="Times New Roman" w:cs="Times New Roman" w:eastAsia="Times New Roman"/>
-                <w:sz w:val="28"/>
-                <w:szCs w:val="28"/>
-              </w:rPr>
-              <w:t xml:space="preserve">Mandatory</w:t>
-            </w:r>
+              <w:keepNext/>
+              <w:spacing w:before="0" w:after="0" w:line="240" w:lineRule="auto"/>
+              <w:jc w:val="left"/>
+            </w:pPr>
           </w:p>
         </w:tc>
         <w:tc>
@@ -6310,17 +6240,10 @@
           </w:tcPr>
           <w:p>
             <w:pPr>
-              <w:spacing w:before="0" w:after="0" w:line="240" w:lineRule="auto"/>
-              <w:jc w:val="left"/>
-            </w:pPr>
-            <w:r>
-              <w:rPr>
-                <w:rFonts w:ascii="Times New Roman" w:hAnsi="Times New Roman" w:cs="Times New Roman" w:eastAsia="Times New Roman"/>
-                <w:sz w:val="28"/>
-                <w:szCs w:val="28"/>
-              </w:rPr>
-              <w:t xml:space="preserve">Supreme Court E-Library; Supreme Court website (sc.judiciary.gov.ph)</w:t>
-            </w:r>
+              <w:keepNext/>
+              <w:spacing w:before="0" w:after="0" w:line="240" w:lineRule="auto"/>
+              <w:jc w:val="left"/>
+            </w:pPr>
           </w:p>
         </w:tc>
       </w:tr>
@@ -6343,7 +6266,7 @@
                 <w:sz w:val="28"/>
                 <w:szCs w:val="28"/>
               </w:rPr>
-              <w:t xml:space="preserve">7.</w:t>
+              <w:t xml:space="preserve">1.</w:t>
             </w:r>
           </w:p>
         </w:tc>
@@ -6359,10 +6282,19 @@
             <w:r>
               <w:rPr>
                 <w:rFonts w:ascii="Times New Roman" w:hAnsi="Times New Roman" w:cs="Times New Roman" w:eastAsia="Times New Roman"/>
-                <w:sz w:val="28"/>
-                <w:szCs w:val="28"/>
-              </w:rPr>
-              <w:t xml:space="preserve">Salva-Roldan v. Roldan, G.R. No. 268109, March 3, 2025.</w:t>
+                <w:smallCaps/>
+                <w:sz w:val="28"/>
+                <w:szCs w:val="28"/>
+              </w:rPr>
+              <w:t xml:space="preserve">Rules of Court</w:t>
+            </w:r>
+            <w:r>
+              <w:rPr>
+                <w:rFonts w:ascii="Times New Roman" w:hAnsi="Times New Roman" w:cs="Times New Roman" w:eastAsia="Times New Roman"/>
+                <w:sz w:val="28"/>
+                <w:szCs w:val="28"/>
+              </w:rPr>
+              <w:t xml:space="preserve">, Rule 108.</w:t>
             </w:r>
           </w:p>
           <w:p>
@@ -6376,7 +6308,43 @@
                 <w:sz w:val="28"/>
                 <w:szCs w:val="28"/>
               </w:rPr>
-              <w:t xml:space="preserve">The Court annulled a marriage on the ground of the husband’s fraudulent concealment of his homosexuality under Article 45 (3) in relation to Article 46 (4), reiterating that concealment, not homosexuality itself, vitiates consent.</w:t>
+              <w:t xml:space="preserve">Provides the judicial procedure for the cancellation or correction of entries in the civil register, the remedy invoked in </w:t>
+            </w:r>
+            <w:r>
+              <w:rPr>
+                <w:rFonts w:ascii="Times New Roman" w:hAnsi="Times New Roman" w:cs="Times New Roman" w:eastAsia="Times New Roman"/>
+                <w:i/>
+                <w:iCs/>
+                <w:sz w:val="28"/>
+                <w:szCs w:val="28"/>
+              </w:rPr>
+              <w:t xml:space="preserve">Silverio</w:t>
+            </w:r>
+            <w:r>
+              <w:rPr>
+                <w:rFonts w:ascii="Times New Roman" w:hAnsi="Times New Roman" w:cs="Times New Roman" w:eastAsia="Times New Roman"/>
+                <w:sz w:val="28"/>
+                <w:szCs w:val="28"/>
+              </w:rPr>
+              <w:t xml:space="preserve"> and </w:t>
+            </w:r>
+            <w:r>
+              <w:rPr>
+                <w:rFonts w:ascii="Times New Roman" w:hAnsi="Times New Roman" w:cs="Times New Roman" w:eastAsia="Times New Roman"/>
+                <w:i/>
+                <w:iCs/>
+                <w:sz w:val="28"/>
+                <w:szCs w:val="28"/>
+              </w:rPr>
+              <w:t xml:space="preserve">Cagandahan</w:t>
+            </w:r>
+            <w:r>
+              <w:rPr>
+                <w:rFonts w:ascii="Times New Roman" w:hAnsi="Times New Roman" w:cs="Times New Roman" w:eastAsia="Times New Roman"/>
+                <w:sz w:val="28"/>
+                <w:szCs w:val="28"/>
+              </w:rPr>
+              <w:t xml:space="preserve"> to change the sex entry that determines capacity to marry under the Family Code.</w:t>
             </w:r>
           </w:p>
         </w:tc>
@@ -6414,7 +6382,7 @@
                 <w:sz w:val="28"/>
                 <w:szCs w:val="28"/>
               </w:rPr>
-              <w:t xml:space="preserve">Supreme Court E-Library; Supreme Court website (sc.judiciary.gov.ph)</w:t>
+              <w:t xml:space="preserve">Supreme Court E-Library; Supreme Court website (sc.judiciary.gov.ph); Supreme Court Library</w:t>
             </w:r>
           </w:p>
         </w:tc>
@@ -6438,7 +6406,7 @@
                 <w:sz w:val="28"/>
                 <w:szCs w:val="28"/>
               </w:rPr>
-              <w:t xml:space="preserve">8.</w:t>
+              <w:t xml:space="preserve">2.</w:t>
             </w:r>
           </w:p>
         </w:tc>
@@ -6454,10 +6422,19 @@
             <w:r>
               <w:rPr>
                 <w:rFonts w:ascii="Times New Roman" w:hAnsi="Times New Roman" w:cs="Times New Roman" w:eastAsia="Times New Roman"/>
-                <w:sz w:val="28"/>
-                <w:szCs w:val="28"/>
-              </w:rPr>
-              <w:t xml:space="preserve">Jacinto v. Fouts, G.R. No. 250627 (Resolution), December 7, 2022.</w:t>
+                <w:smallCaps/>
+                <w:sz w:val="28"/>
+                <w:szCs w:val="28"/>
+              </w:rPr>
+              <w:t xml:space="preserve">Void and Voidable Marriages Rule</w:t>
+            </w:r>
+            <w:r>
+              <w:rPr>
+                <w:rFonts w:ascii="Times New Roman" w:hAnsi="Times New Roman" w:cs="Times New Roman" w:eastAsia="Times New Roman"/>
+                <w:sz w:val="28"/>
+                <w:szCs w:val="28"/>
+              </w:rPr>
+              <w:t xml:space="preserve">, A.M. No. 02-11-10-SC, effective March 15, 2003.</w:t>
             </w:r>
           </w:p>
           <w:p>
@@ -6471,25 +6448,7 @@
                 <w:sz w:val="28"/>
                 <w:szCs w:val="28"/>
               </w:rPr>
-              <w:t xml:space="preserve">The Court sustained a prosecution under R.A. No. 9262 between former female live-in partners, holding that the law’s application to lesbian relationships had already been settled in </w:t>
-            </w:r>
-            <w:r>
-              <w:rPr>
-                <w:rFonts w:ascii="Times New Roman" w:hAnsi="Times New Roman" w:cs="Times New Roman" w:eastAsia="Times New Roman"/>
-                <w:i/>
-                <w:iCs/>
-                <w:sz w:val="28"/>
-                <w:szCs w:val="28"/>
-              </w:rPr>
-              <w:t xml:space="preserve">Garcia v. Drilon</w:t>
-            </w:r>
-            <w:r>
-              <w:rPr>
-                <w:rFonts w:ascii="Times New Roman" w:hAnsi="Times New Roman" w:cs="Times New Roman" w:eastAsia="Times New Roman"/>
-                <w:sz w:val="28"/>
-                <w:szCs w:val="28"/>
-              </w:rPr>
-              <w:t xml:space="preserve">.</w:t>
+              <w:t xml:space="preserve">Governs the procedure in petitions for declaration of nullity and annulment of marriage, including annulment actions grounded on the fraudulent concealment of homosexuality under Article 46 (4) of the Family Code.</w:t>
             </w:r>
           </w:p>
         </w:tc>
@@ -6527,7 +6486,7 @@
                 <w:sz w:val="28"/>
                 <w:szCs w:val="28"/>
               </w:rPr>
-              <w:t xml:space="preserve">Supreme Court E-Library; Supreme Court website (sc.judiciary.gov.ph)</w:t>
+              <w:t xml:space="preserve">Supreme Court E-Library; Supreme Court website (sc.judiciary.gov.ph); Supreme Court Library</w:t>
             </w:r>
           </w:p>
         </w:tc>
@@ -6551,7 +6510,7 @@
                 <w:sz w:val="28"/>
                 <w:szCs w:val="28"/>
               </w:rPr>
-              <w:t xml:space="preserve">9.</w:t>
+              <w:t xml:space="preserve">3.</w:t>
             </w:r>
           </w:p>
         </w:tc>
@@ -6567,10 +6526,19 @@
             <w:r>
               <w:rPr>
                 <w:rFonts w:ascii="Times New Roman" w:hAnsi="Times New Roman" w:cs="Times New Roman" w:eastAsia="Times New Roman"/>
-                <w:sz w:val="28"/>
-                <w:szCs w:val="28"/>
-              </w:rPr>
-              <w:t xml:space="preserve">Espejon v. Lorredo, A.M. No. MTJ-22-007, March 9, 2022.</w:t>
+                <w:smallCaps/>
+                <w:sz w:val="28"/>
+                <w:szCs w:val="28"/>
+              </w:rPr>
+              <w:t xml:space="preserve">Legal Separation Rule</w:t>
+            </w:r>
+            <w:r>
+              <w:rPr>
+                <w:rFonts w:ascii="Times New Roman" w:hAnsi="Times New Roman" w:cs="Times New Roman" w:eastAsia="Times New Roman"/>
+                <w:sz w:val="28"/>
+                <w:szCs w:val="28"/>
+              </w:rPr>
+              <w:t xml:space="preserve">, A.M. No. 02-11-11-SC, effective March 15, 2003.</w:t>
             </w:r>
           </w:p>
           <w:p>
@@ -6584,7 +6552,7 @@
                 <w:sz w:val="28"/>
                 <w:szCs w:val="28"/>
               </w:rPr>
-              <w:t xml:space="preserve">The Court suspended and fined a judge for homophobic remarks against litigants on account of their perceived same-sex relationship, finding a violation of the New Code of Judicial Conduct and work-related sexual harassment.</w:t>
+              <w:t xml:space="preserve">Governs petitions for legal separation, including those grounded on the lesbianism or homosexuality of the respondent under Article 55 (6) of the Family Code.</w:t>
             </w:r>
           </w:p>
         </w:tc>
@@ -6622,7 +6590,7 @@
                 <w:sz w:val="28"/>
                 <w:szCs w:val="28"/>
               </w:rPr>
-              <w:t xml:space="preserve">Supreme Court E-Library; Supreme Court website (sc.judiciary.gov.ph)</w:t>
+              <w:t xml:space="preserve">Supreme Court E-Library; Supreme Court website (sc.judiciary.gov.ph); Supreme Court Library</w:t>
             </w:r>
           </w:p>
         </w:tc>
@@ -6646,7 +6614,7 @@
                 <w:sz w:val="28"/>
                 <w:szCs w:val="28"/>
               </w:rPr>
-              <w:t xml:space="preserve">10.</w:t>
+              <w:t xml:space="preserve">4.</w:t>
             </w:r>
           </w:p>
         </w:tc>
@@ -6665,7 +6633,7 @@
                 <w:sz w:val="28"/>
                 <w:szCs w:val="28"/>
               </w:rPr>
-              <w:t xml:space="preserve">Republic v. Cagandahan, 586 Phil. 637 (2008).</w:t>
+              <w:t xml:space="preserve">New Code of Judicial Conduct for the Philippine Judiciary, A.M. No. 03-05-01-SC, Canon 5, secs. 1-2 (2004).</w:t>
             </w:r>
           </w:p>
           <w:p>
@@ -6679,7 +6647,25 @@
                 <w:sz w:val="28"/>
                 <w:szCs w:val="28"/>
               </w:rPr>
-              <w:t xml:space="preserve">The Court allowed an intersex person with congenital adrenal hyperplasia to change the registered sex from female to male and the registered name, bearing on how “male” and “female” are determined for purposes of capacity to marry.</w:t>
+              <w:t xml:space="preserve">Requires judges to understand diversity in society and not to manifest bias or prejudice on irrelevant grounds, standards the Supreme Court enforced in </w:t>
+            </w:r>
+            <w:r>
+              <w:rPr>
+                <w:rFonts w:ascii="Times New Roman" w:hAnsi="Times New Roman" w:cs="Times New Roman" w:eastAsia="Times New Roman"/>
+                <w:i/>
+                <w:iCs/>
+                <w:sz w:val="28"/>
+                <w:szCs w:val="28"/>
+              </w:rPr>
+              <w:t xml:space="preserve">Espejon v. Lorredo</w:t>
+            </w:r>
+            <w:r>
+              <w:rPr>
+                <w:rFonts w:ascii="Times New Roman" w:hAnsi="Times New Roman" w:cs="Times New Roman" w:eastAsia="Times New Roman"/>
+                <w:sz w:val="28"/>
+                <w:szCs w:val="28"/>
+              </w:rPr>
+              <w:t xml:space="preserve"> against a judge who disparaged litigants’ same-sex relationship.</w:t>
             </w:r>
           </w:p>
         </w:tc>
@@ -6717,7 +6703,7 @@
                 <w:sz w:val="28"/>
                 <w:szCs w:val="28"/>
               </w:rPr>
-              <w:t xml:space="preserve">Philippine Reports, vol. 586; Supreme Court E-Library</w:t>
+              <w:t xml:space="preserve">Supreme Court E-Library; Supreme Court website (sc.judiciary.gov.ph); Supreme Court Library</w:t>
             </w:r>
           </w:p>
         </w:tc>
@@ -6741,7 +6727,7 @@
                 <w:sz w:val="28"/>
                 <w:szCs w:val="28"/>
               </w:rPr>
-              <w:t xml:space="preserve">11.</w:t>
+              <w:t xml:space="preserve">5.</w:t>
             </w:r>
           </w:p>
         </w:tc>
@@ -6760,7 +6746,7 @@
                 <w:sz w:val="28"/>
                 <w:szCs w:val="28"/>
               </w:rPr>
-              <w:t xml:space="preserve">Almelor v. Regional Trial Court of Las Piñas City, G.R. No. 179620, August 26, 2008.</w:t>
+              <w:t xml:space="preserve">Code of Professional Responsibility and Accountability, A.M. No. 22-09-01-SC, Canon V, sec. 1 (2023).</w:t>
             </w:r>
           </w:p>
           <w:p>
@@ -6774,25 +6760,7 @@
                 <w:sz w:val="28"/>
                 <w:szCs w:val="28"/>
               </w:rPr>
-              <w:t xml:space="preserve">The Court ruled that it is the concealment of homosexuality, not homosexuality </w:t>
-            </w:r>
-            <w:r>
-              <w:rPr>
-                <w:rFonts w:ascii="Times New Roman" w:hAnsi="Times New Roman" w:cs="Times New Roman" w:eastAsia="Times New Roman"/>
-                <w:i/>
-                <w:iCs/>
-                <w:sz w:val="28"/>
-                <w:szCs w:val="28"/>
-              </w:rPr>
-              <w:t xml:space="preserve">per se</w:t>
-            </w:r>
-            <w:r>
-              <w:rPr>
-                <w:rFonts w:ascii="Times New Roman" w:hAnsi="Times New Roman" w:cs="Times New Roman" w:eastAsia="Times New Roman"/>
-                <w:sz w:val="28"/>
-                <w:szCs w:val="28"/>
-              </w:rPr>
-              <w:t xml:space="preserve">, that constitutes fraud under Article 46 (4), and found the evidence insufficient to annul the marriage.</w:t>
+              <w:t xml:space="preserve">Prohibits a lawyer from declining to represent a person solely on account of sexual orientation or gender identity, among other grounds, securing access to counsel for same-sex couples asserting their rights.</w:t>
             </w:r>
           </w:p>
         </w:tc>
@@ -6830,7 +6798,7 @@
                 <w:sz w:val="28"/>
                 <w:szCs w:val="28"/>
               </w:rPr>
-              <w:t xml:space="preserve">Supreme Court E-Library; Supreme Court website (sc.judiciary.gov.ph)</w:t>
+              <w:t xml:space="preserve">Supreme Court E-Library; Supreme Court website (sc.judiciary.gov.ph); Supreme Court Library</w:t>
             </w:r>
           </w:p>
         </w:tc>
@@ -6845,16 +6813,19 @@
           </w:tcPr>
           <w:p>
             <w:pPr>
-              <w:spacing w:before="0" w:after="0" w:line="240" w:lineRule="auto"/>
-              <w:jc w:val="left"/>
-            </w:pPr>
-            <w:r>
-              <w:rPr>
-                <w:rFonts w:ascii="Times New Roman" w:hAnsi="Times New Roman" w:cs="Times New Roman" w:eastAsia="Times New Roman"/>
-                <w:sz w:val="28"/>
-                <w:szCs w:val="28"/>
-              </w:rPr>
-              <w:t xml:space="preserve">12.</w:t>
+              <w:keepNext/>
+              <w:spacing w:before="0" w:after="0" w:line="240" w:lineRule="auto"/>
+              <w:jc w:val="left"/>
+            </w:pPr>
+            <w:r>
+              <w:rPr>
+                <w:rFonts w:ascii="Times New Roman" w:hAnsi="Times New Roman" w:cs="Times New Roman" w:eastAsia="Times New Roman"/>
+                <w:b/>
+                <w:bCs/>
+                <w:sz w:val="28"/>
+                <w:szCs w:val="28"/>
+              </w:rPr>
+              <w:t xml:space="preserve">G.</w:t>
             </w:r>
           </w:p>
         </w:tc>
@@ -6864,30 +6835,19 @@
           </w:tcPr>
           <w:p>
             <w:pPr>
-              <w:spacing w:before="0" w:after="0" w:line="240" w:lineRule="auto"/>
-              <w:jc w:val="left"/>
-            </w:pPr>
-            <w:r>
-              <w:rPr>
-                <w:rFonts w:ascii="Times New Roman" w:hAnsi="Times New Roman" w:cs="Times New Roman" w:eastAsia="Times New Roman"/>
-                <w:sz w:val="28"/>
-                <w:szCs w:val="28"/>
-              </w:rPr>
-              <w:t xml:space="preserve">Silverio v. Republic, 562 Phil. 953 (2007).</w:t>
-            </w:r>
-          </w:p>
-          <w:p>
-            <w:pPr>
-              <w:spacing w:before="60" w:after="0" w:line="240" w:lineRule="auto"/>
-              <w:jc w:val="both"/>
-            </w:pPr>
-            <w:r>
-              <w:rPr>
-                <w:rFonts w:ascii="Times New Roman" w:hAnsi="Times New Roman" w:cs="Times New Roman" w:eastAsia="Times New Roman"/>
-                <w:sz w:val="28"/>
-                <w:szCs w:val="28"/>
-              </w:rPr>
-              <w:t xml:space="preserve">The Court denied a transsexual woman’s petition to change the name and sex entries in her birth certificate, reasoning that no law allows it and that granting it would permit a union between two persons of the same birth sex despite marriage being between a man and a woman.</w:t>
+              <w:keepNext/>
+              <w:spacing w:before="0" w:after="0" w:line="240" w:lineRule="auto"/>
+              <w:jc w:val="left"/>
+            </w:pPr>
+            <w:r>
+              <w:rPr>
+                <w:rFonts w:ascii="Times New Roman" w:hAnsi="Times New Roman" w:cs="Times New Roman" w:eastAsia="Times New Roman"/>
+                <w:b/>
+                <w:bCs/>
+                <w:sz w:val="28"/>
+                <w:szCs w:val="28"/>
+              </w:rPr>
+              <w:t xml:space="preserve">JUDICIAL DECISIONS</w:t>
             </w:r>
           </w:p>
         </w:tc>
@@ -6897,17 +6857,10 @@
           </w:tcPr>
           <w:p>
             <w:pPr>
-              <w:spacing w:before="0" w:after="0" w:line="240" w:lineRule="auto"/>
-              <w:jc w:val="left"/>
-            </w:pPr>
-            <w:r>
-              <w:rPr>
-                <w:rFonts w:ascii="Times New Roman" w:hAnsi="Times New Roman" w:cs="Times New Roman" w:eastAsia="Times New Roman"/>
-                <w:sz w:val="28"/>
-                <w:szCs w:val="28"/>
-              </w:rPr>
-              <w:t xml:space="preserve">Mandatory</w:t>
-            </w:r>
+              <w:keepNext/>
+              <w:spacing w:before="0" w:after="0" w:line="240" w:lineRule="auto"/>
+              <w:jc w:val="left"/>
+            </w:pPr>
           </w:p>
         </w:tc>
         <w:tc>
@@ -6916,17 +6869,10 @@
           </w:tcPr>
           <w:p>
             <w:pPr>
-              <w:spacing w:before="0" w:after="0" w:line="240" w:lineRule="auto"/>
-              <w:jc w:val="left"/>
-            </w:pPr>
-            <w:r>
-              <w:rPr>
-                <w:rFonts w:ascii="Times New Roman" w:hAnsi="Times New Roman" w:cs="Times New Roman" w:eastAsia="Times New Roman"/>
-                <w:sz w:val="28"/>
-                <w:szCs w:val="28"/>
-              </w:rPr>
-              <w:t xml:space="preserve">Philippine Reports, vol. 562; Supreme Court E-Library</w:t>
-            </w:r>
+              <w:keepNext/>
+              <w:spacing w:before="0" w:after="0" w:line="240" w:lineRule="auto"/>
+              <w:jc w:val="left"/>
+            </w:pPr>
           </w:p>
         </w:tc>
       </w:tr>
@@ -6940,19 +6886,16 @@
           </w:tcPr>
           <w:p>
             <w:pPr>
-              <w:keepNext/>
-              <w:spacing w:before="0" w:after="0" w:line="240" w:lineRule="auto"/>
-              <w:jc w:val="left"/>
-            </w:pPr>
-            <w:r>
-              <w:rPr>
-                <w:rFonts w:ascii="Times New Roman" w:hAnsi="Times New Roman" w:cs="Times New Roman" w:eastAsia="Times New Roman"/>
-                <w:b/>
-                <w:bCs/>
-                <w:sz w:val="28"/>
-                <w:szCs w:val="28"/>
-              </w:rPr>
-              <w:t xml:space="preserve">H.</w:t>
+              <w:spacing w:before="0" w:after="0" w:line="240" w:lineRule="auto"/>
+              <w:jc w:val="left"/>
+            </w:pPr>
+            <w:r>
+              <w:rPr>
+                <w:rFonts w:ascii="Times New Roman" w:hAnsi="Times New Roman" w:cs="Times New Roman" w:eastAsia="Times New Roman"/>
+                <w:sz w:val="28"/>
+                <w:szCs w:val="28"/>
+              </w:rPr>
+              <w:t xml:space="preserve">1.</w:t>
             </w:r>
           </w:p>
         </w:tc>
@@ -6962,19 +6905,30 @@
           </w:tcPr>
           <w:p>
             <w:pPr>
-              <w:keepNext/>
-              <w:spacing w:before="0" w:after="0" w:line="240" w:lineRule="auto"/>
-              <w:jc w:val="left"/>
-            </w:pPr>
-            <w:r>
-              <w:rPr>
-                <w:rFonts w:ascii="Times New Roman" w:hAnsi="Times New Roman" w:cs="Times New Roman" w:eastAsia="Times New Roman"/>
-                <w:b/>
-                <w:bCs/>
-                <w:sz w:val="28"/>
-                <w:szCs w:val="28"/>
-              </w:rPr>
-              <w:t xml:space="preserve">LOCAL ORDINANCES AND RESOLUTIONS</w:t>
+              <w:spacing w:before="0" w:after="0" w:line="240" w:lineRule="auto"/>
+              <w:jc w:val="left"/>
+            </w:pPr>
+            <w:r>
+              <w:rPr>
+                <w:rFonts w:ascii="Times New Roman" w:hAnsi="Times New Roman" w:cs="Times New Roman" w:eastAsia="Times New Roman"/>
+                <w:sz w:val="28"/>
+                <w:szCs w:val="28"/>
+              </w:rPr>
+              <w:t xml:space="preserve">Falcis III v. Civil Registrar General, G.R. No. 217910, September 3, 2019.</w:t>
+            </w:r>
+          </w:p>
+          <w:p>
+            <w:pPr>
+              <w:spacing w:before="60" w:after="0" w:line="240" w:lineRule="auto"/>
+              <w:jc w:val="both"/>
+            </w:pPr>
+            <w:r>
+              <w:rPr>
+                <w:rFonts w:ascii="Times New Roman" w:hAnsi="Times New Roman" w:cs="Times New Roman" w:eastAsia="Times New Roman"/>
+                <w:sz w:val="28"/>
+                <w:szCs w:val="28"/>
+              </w:rPr>
+              <w:t xml:space="preserve">The Court En Banc dismissed the first petition to declare Family Code Articles 1, 2, 46 (4), and 55 (6) unconstitutional for lack of an actual case, lack of standing, and disregard of the hierarchy of courts, while noting that the Constitution does not restrict marriage on the basis of sex or sexual orientation and leaving the matter to Congress.</w:t>
             </w:r>
           </w:p>
         </w:tc>
@@ -6984,10 +6938,17 @@
           </w:tcPr>
           <w:p>
             <w:pPr>
-              <w:keepNext/>
-              <w:spacing w:before="0" w:after="0" w:line="240" w:lineRule="auto"/>
-              <w:jc w:val="left"/>
-            </w:pPr>
+              <w:spacing w:before="0" w:after="0" w:line="240" w:lineRule="auto"/>
+              <w:jc w:val="left"/>
+            </w:pPr>
+            <w:r>
+              <w:rPr>
+                <w:rFonts w:ascii="Times New Roman" w:hAnsi="Times New Roman" w:cs="Times New Roman" w:eastAsia="Times New Roman"/>
+                <w:sz w:val="28"/>
+                <w:szCs w:val="28"/>
+              </w:rPr>
+              <w:t xml:space="preserve">Mandatory</w:t>
+            </w:r>
           </w:p>
         </w:tc>
         <w:tc>
@@ -6996,10 +6957,17 @@
           </w:tcPr>
           <w:p>
             <w:pPr>
-              <w:keepNext/>
-              <w:spacing w:before="0" w:after="0" w:line="240" w:lineRule="auto"/>
-              <w:jc w:val="left"/>
-            </w:pPr>
+              <w:spacing w:before="0" w:after="0" w:line="240" w:lineRule="auto"/>
+              <w:jc w:val="left"/>
+            </w:pPr>
+            <w:r>
+              <w:rPr>
+                <w:rFonts w:ascii="Times New Roman" w:hAnsi="Times New Roman" w:cs="Times New Roman" w:eastAsia="Times New Roman"/>
+                <w:sz w:val="28"/>
+                <w:szCs w:val="28"/>
+              </w:rPr>
+              <w:t xml:space="preserve">Supreme Court E-Library; Supreme Court website (sc.judiciary.gov.ph)</w:t>
+            </w:r>
           </w:p>
         </w:tc>
       </w:tr>
@@ -7022,7 +6990,7 @@
                 <w:sz w:val="28"/>
                 <w:szCs w:val="28"/>
               </w:rPr>
-              <w:t xml:space="preserve">1.</w:t>
+              <w:t xml:space="preserve">2.</w:t>
             </w:r>
           </w:p>
         </w:tc>
@@ -7041,7 +7009,7 @@
                 <w:sz w:val="28"/>
                 <w:szCs w:val="28"/>
               </w:rPr>
-              <w:t xml:space="preserve">Quezon City Ordinance No. SP-3221, S-2023, September 25, 2023.</w:t>
+              <w:t xml:space="preserve">Garcia v. Drilon, G.R. No. 179267, June 25, 2013.</w:t>
             </w:r>
           </w:p>
           <w:p>
@@ -7055,7 +7023,25 @@
                 <w:sz w:val="28"/>
                 <w:szCs w:val="28"/>
               </w:rPr>
-              <w:t xml:space="preserve">Requires health facilities in Quezon City to recognize health care proxies, institutionalizing the “Right to Care” card that allows same-sex partners to make medical decisions for each other through a special power of attorney.</w:t>
+              <w:t xml:space="preserve">In upholding R.A. No. 9262, the Court En Banc recognized that the law’s gender-neutral term “any person” may cover a woman offender in a lesbian relationship, a point later applied in </w:t>
+            </w:r>
+            <w:r>
+              <w:rPr>
+                <w:rFonts w:ascii="Times New Roman" w:hAnsi="Times New Roman" w:cs="Times New Roman" w:eastAsia="Times New Roman"/>
+                <w:i/>
+                <w:iCs/>
+                <w:sz w:val="28"/>
+                <w:szCs w:val="28"/>
+              </w:rPr>
+              <w:t xml:space="preserve">Jacinto v. Fouts</w:t>
+            </w:r>
+            <w:r>
+              <w:rPr>
+                <w:rFonts w:ascii="Times New Roman" w:hAnsi="Times New Roman" w:cs="Times New Roman" w:eastAsia="Times New Roman"/>
+                <w:sz w:val="28"/>
+                <w:szCs w:val="28"/>
+              </w:rPr>
+              <w:t xml:space="preserve">.</w:t>
             </w:r>
           </w:p>
         </w:tc>
@@ -7093,7 +7079,7 @@
                 <w:sz w:val="28"/>
                 <w:szCs w:val="28"/>
               </w:rPr>
-              <w:t xml:space="preserve">Sangguniang Panlungsod ng Quezon City; Quezon City Public Library digital repository (LIBROS)</w:t>
+              <w:t xml:space="preserve">Supreme Court E-Library; Supreme Court website (sc.judiciary.gov.ph)</w:t>
             </w:r>
           </w:p>
         </w:tc>
@@ -7117,7 +7103,7 @@
                 <w:sz w:val="28"/>
                 <w:szCs w:val="28"/>
               </w:rPr>
-              <w:t xml:space="preserve">2.</w:t>
+              <w:t xml:space="preserve">3.</w:t>
             </w:r>
           </w:p>
         </w:tc>
@@ -7136,7 +7122,7 @@
                 <w:sz w:val="28"/>
                 <w:szCs w:val="28"/>
               </w:rPr>
-              <w:t xml:space="preserve">San Juan City Ordinance No. 16, S-2025 (2025).</w:t>
+              <w:t xml:space="preserve">Ang Ladlad LGBT Party v. Commission on Elections, 632 Phil. 32 (2010).</w:t>
             </w:r>
           </w:p>
           <w:p>
@@ -7150,7 +7136,25 @@
                 <w:sz w:val="28"/>
                 <w:szCs w:val="28"/>
               </w:rPr>
-              <w:t xml:space="preserve">San Juan’s “Right to Care” Ordinance requires public and private health facilities in the city to honor the Right to Care Card, through which LGBTQIA+ partners may make medical decisions for one another.</w:t>
+              <w:t xml:space="preserve">The Court held that denying party-list accreditation to an LGBT group on religious and moral grounds violated the non-establishment clause, equal protection, and freedom of expression and association, while describing the Yogyakarta Principles as at best </w:t>
+            </w:r>
+            <w:r>
+              <w:rPr>
+                <w:rFonts w:ascii="Times New Roman" w:hAnsi="Times New Roman" w:cs="Times New Roman" w:eastAsia="Times New Roman"/>
+                <w:i/>
+                <w:iCs/>
+                <w:sz w:val="28"/>
+                <w:szCs w:val="28"/>
+              </w:rPr>
+              <w:t xml:space="preserve">de lege ferenda</w:t>
+            </w:r>
+            <w:r>
+              <w:rPr>
+                <w:rFonts w:ascii="Times New Roman" w:hAnsi="Times New Roman" w:cs="Times New Roman" w:eastAsia="Times New Roman"/>
+                <w:sz w:val="28"/>
+                <w:szCs w:val="28"/>
+              </w:rPr>
+              <w:t xml:space="preserve">.</w:t>
             </w:r>
           </w:p>
         </w:tc>
@@ -7188,7 +7192,7 @@
                 <w:sz w:val="28"/>
                 <w:szCs w:val="28"/>
               </w:rPr>
-              <w:t xml:space="preserve">Sangguniang Panlungsod ng San Juan City</w:t>
+              <w:t xml:space="preserve">Philippine Reports, vol. 632; Supreme Court E-Library</w:t>
             </w:r>
           </w:p>
         </w:tc>
@@ -7212,7 +7216,7 @@
                 <w:sz w:val="28"/>
                 <w:szCs w:val="28"/>
               </w:rPr>
-              <w:t xml:space="preserve">3.</w:t>
+              <w:t xml:space="preserve">4.</w:t>
             </w:r>
           </w:p>
         </w:tc>
@@ -7231,7 +7235,7 @@
                 <w:sz w:val="28"/>
                 <w:szCs w:val="28"/>
               </w:rPr>
-              <w:t xml:space="preserve">Quezon City Ordinance No. SP-3417, S-2025, June 16, 2025.</w:t>
+              <w:t xml:space="preserve">Estrada v. Escritor, 455 Phil. 411 (2003); 525 Phil. 110 (2006).</w:t>
             </w:r>
           </w:p>
           <w:p>
@@ -7245,7 +7249,7 @@
                 <w:sz w:val="28"/>
                 <w:szCs w:val="28"/>
               </w:rPr>
-              <w:t xml:space="preserve">Revises the Quezon City Gender-Fair Ordinance into a comprehensive anti-discrimination policy on the basis of sexual orientation, gender identity and expression, and sex characteristics (SOGIESC).</w:t>
+              <w:t xml:space="preserve">Adopted benevolent neutrality and the compelling state interest test in resolving a religiously sanctioned non-marital union, the framework for weighing religious claims on both sides of the same-sex marriage debate.</w:t>
             </w:r>
           </w:p>
         </w:tc>
@@ -7283,7 +7287,7 @@
                 <w:sz w:val="28"/>
                 <w:szCs w:val="28"/>
               </w:rPr>
-              <w:t xml:space="preserve">Sangguniang Panlungsod ng Quezon City; Quezon City Public Library digital repository (LIBROS)</w:t>
+              <w:t xml:space="preserve">Philippine Reports, vols. 455 &amp; 525; Supreme Court E-Library</w:t>
             </w:r>
           </w:p>
         </w:tc>
@@ -7307,7 +7311,7 @@
                 <w:sz w:val="28"/>
                 <w:szCs w:val="28"/>
               </w:rPr>
-              <w:t xml:space="preserve">4.</w:t>
+              <w:t xml:space="preserve">5.</w:t>
             </w:r>
           </w:p>
         </w:tc>
@@ -7326,7 +7330,7 @@
                 <w:sz w:val="28"/>
                 <w:szCs w:val="28"/>
               </w:rPr>
-              <w:t xml:space="preserve">Quezon City Ordinance No. SP-2357, S-2014, November 28, 2014.</w:t>
+              <w:t xml:space="preserve">Goitia v. Campos Rueda, 35 Phil. 252 (1916).</w:t>
             </w:r>
           </w:p>
           <w:p>
@@ -7340,7 +7344,7 @@
                 <w:sz w:val="28"/>
                 <w:szCs w:val="28"/>
               </w:rPr>
-              <w:t xml:space="preserve">The Quezon City Gender-Fair Ordinance prohibits discrimination on the basis of sexual orientation and gender identity and expression in employment, education, accommodation, and the delivery of goods and services.</w:t>
+              <w:t xml:space="preserve">Described marriage as “something more than a mere contract,” a relation whose rights and duties rest on the general law rather than on the parties’ agreement, a characterization central to whether the State may redefine who may marry.</w:t>
             </w:r>
           </w:p>
         </w:tc>
@@ -7378,7 +7382,7 @@
                 <w:sz w:val="28"/>
                 <w:szCs w:val="28"/>
               </w:rPr>
-              <w:t xml:space="preserve">Sangguniang Panlungsod ng Quezon City; Quezon City Public Library digital repository (LIBROS)</w:t>
+              <w:t xml:space="preserve">Philippine Reports, vol. 35; Supreme Court E-Library</w:t>
             </w:r>
           </w:p>
         </w:tc>
@@ -7402,7 +7406,7 @@
                 <w:sz w:val="28"/>
                 <w:szCs w:val="28"/>
               </w:rPr>
-              <w:t xml:space="preserve">5.</w:t>
+              <w:t xml:space="preserve">6.</w:t>
             </w:r>
           </w:p>
         </w:tc>
@@ -7421,7 +7425,7 @@
                 <w:sz w:val="28"/>
                 <w:szCs w:val="28"/>
               </w:rPr>
-              <w:t xml:space="preserve">Quezon City Ordinance No. SP-1309, S-2003.</w:t>
+              <w:t xml:space="preserve">Josef v. Ursua, G.R. No. 267469, February 5, 2025.</w:t>
             </w:r>
           </w:p>
           <w:p>
@@ -7435,7 +7439,7 @@
                 <w:sz w:val="28"/>
                 <w:szCs w:val="28"/>
               </w:rPr>
-              <w:t xml:space="preserve">An early local ordinance prohibiting discrimination against homosexuals in the workplace, later expanded by the Gender-Fair Ordinance.</w:t>
+              <w:t xml:space="preserve">The Court held that the property relations of cohabiting same-sex partners are governed by Article 148 of the Family Code, so that a partner who proves actual contribution is a co-owner, while stating that broader protection for same-sex couples is for Congress to provide.</w:t>
             </w:r>
           </w:p>
         </w:tc>
@@ -7473,7 +7477,7 @@
                 <w:sz w:val="28"/>
                 <w:szCs w:val="28"/>
               </w:rPr>
-              <w:t xml:space="preserve">Sangguniang Panlungsod ng Quezon City</w:t>
+              <w:t xml:space="preserve">Supreme Court E-Library; Supreme Court website (sc.judiciary.gov.ph)</w:t>
             </w:r>
           </w:p>
         </w:tc>
@@ -7497,7 +7501,7 @@
                 <w:sz w:val="28"/>
                 <w:szCs w:val="28"/>
               </w:rPr>
-              <w:t xml:space="preserve">6.</w:t>
+              <w:t xml:space="preserve">7.</w:t>
             </w:r>
           </w:p>
         </w:tc>
@@ -7516,7 +7520,7 @@
                 <w:sz w:val="28"/>
                 <w:szCs w:val="28"/>
               </w:rPr>
-              <w:t xml:space="preserve">Davao City Ordinance No. 0417-12 (2012).</w:t>
+              <w:t xml:space="preserve">Salva-Roldan v. Roldan, G.R. No. 268109, March 3, 2025.</w:t>
             </w:r>
           </w:p>
           <w:p>
@@ -7530,7 +7534,7 @@
                 <w:sz w:val="28"/>
                 <w:szCs w:val="28"/>
               </w:rPr>
-              <w:t xml:space="preserve">Davao City’s Anti-Discrimination Ordinance declares unlawful acts of discrimination based on, among others, sex, gender identity, and sexual orientation.</w:t>
+              <w:t xml:space="preserve">The Court annulled a marriage on the ground of the husband’s fraudulent concealment of his homosexuality under Article 45 (3) in relation to Article 46 (4), reiterating that concealment, not homosexuality itself, vitiates consent.</w:t>
             </w:r>
           </w:p>
         </w:tc>
@@ -7568,7 +7572,7 @@
                 <w:sz w:val="28"/>
                 <w:szCs w:val="28"/>
               </w:rPr>
-              <w:t xml:space="preserve">Sangguniang Panlungsod ng Davao City</w:t>
+              <w:t xml:space="preserve">Supreme Court E-Library; Supreme Court website (sc.judiciary.gov.ph)</w:t>
             </w:r>
           </w:p>
         </w:tc>
@@ -7592,7 +7596,7 @@
                 <w:sz w:val="28"/>
                 <w:szCs w:val="28"/>
               </w:rPr>
-              <w:t xml:space="preserve">7.</w:t>
+              <w:t xml:space="preserve">8.</w:t>
             </w:r>
           </w:p>
         </w:tc>
@@ -7611,7 +7615,7 @@
                 <w:sz w:val="28"/>
                 <w:szCs w:val="28"/>
               </w:rPr>
-              <w:t xml:space="preserve">Cebu City Ordinance No. 2339 (2012).</w:t>
+              <w:t xml:space="preserve">Jacinto v. Fouts, G.R. No. 250627 (Resolution), December 7, 2022.</w:t>
             </w:r>
           </w:p>
           <w:p>
@@ -7625,7 +7629,25 @@
                 <w:sz w:val="28"/>
                 <w:szCs w:val="28"/>
               </w:rPr>
-              <w:t xml:space="preserve">Prohibits discrimination on the basis of, among others, sexual orientation and gender identity, illustrating how LGBT protection has developed through local legislation in the absence of a national law.</w:t>
+              <w:t xml:space="preserve">The Court sustained a prosecution under R.A. No. 9262 between former female live-in partners, holding that the law’s application to lesbian relationships had already been settled in </w:t>
+            </w:r>
+            <w:r>
+              <w:rPr>
+                <w:rFonts w:ascii="Times New Roman" w:hAnsi="Times New Roman" w:cs="Times New Roman" w:eastAsia="Times New Roman"/>
+                <w:i/>
+                <w:iCs/>
+                <w:sz w:val="28"/>
+                <w:szCs w:val="28"/>
+              </w:rPr>
+              <w:t xml:space="preserve">Garcia v. Drilon</w:t>
+            </w:r>
+            <w:r>
+              <w:rPr>
+                <w:rFonts w:ascii="Times New Roman" w:hAnsi="Times New Roman" w:cs="Times New Roman" w:eastAsia="Times New Roman"/>
+                <w:sz w:val="28"/>
+                <w:szCs w:val="28"/>
+              </w:rPr>
+              <w:t xml:space="preserve">.</w:t>
             </w:r>
           </w:p>
         </w:tc>
@@ -7663,7 +7685,7 @@
                 <w:sz w:val="28"/>
                 <w:szCs w:val="28"/>
               </w:rPr>
-              <w:t xml:space="preserve">Sangguniang Panlungsod ng Cebu City</w:t>
+              <w:t xml:space="preserve">Supreme Court E-Library; Supreme Court website (sc.judiciary.gov.ph)</w:t>
             </w:r>
           </w:p>
         </w:tc>
@@ -7678,19 +7700,16 @@
           </w:tcPr>
           <w:p>
             <w:pPr>
-              <w:keepNext/>
-              <w:spacing w:before="0" w:after="0" w:line="240" w:lineRule="auto"/>
-              <w:jc w:val="left"/>
-            </w:pPr>
-            <w:r>
-              <w:rPr>
-                <w:rFonts w:ascii="Times New Roman" w:hAnsi="Times New Roman" w:cs="Times New Roman" w:eastAsia="Times New Roman"/>
-                <w:b/>
-                <w:bCs/>
-                <w:sz w:val="28"/>
-                <w:szCs w:val="28"/>
-              </w:rPr>
-              <w:t xml:space="preserve">I.</w:t>
+              <w:spacing w:before="0" w:after="0" w:line="240" w:lineRule="auto"/>
+              <w:jc w:val="left"/>
+            </w:pPr>
+            <w:r>
+              <w:rPr>
+                <w:rFonts w:ascii="Times New Roman" w:hAnsi="Times New Roman" w:cs="Times New Roman" w:eastAsia="Times New Roman"/>
+                <w:sz w:val="28"/>
+                <w:szCs w:val="28"/>
+              </w:rPr>
+              <w:t xml:space="preserve">9.</w:t>
             </w:r>
           </w:p>
         </w:tc>
@@ -7700,19 +7719,30 @@
           </w:tcPr>
           <w:p>
             <w:pPr>
-              <w:keepNext/>
-              <w:spacing w:before="0" w:after="0" w:line="240" w:lineRule="auto"/>
-              <w:jc w:val="left"/>
-            </w:pPr>
-            <w:r>
-              <w:rPr>
-                <w:rFonts w:ascii="Times New Roman" w:hAnsi="Times New Roman" w:cs="Times New Roman" w:eastAsia="Times New Roman"/>
-                <w:b/>
-                <w:bCs/>
-                <w:sz w:val="28"/>
-                <w:szCs w:val="28"/>
-              </w:rPr>
-              <w:t xml:space="preserve">INTERNATIONAL LAW (CONVENTIONS, DECLARATIONS, AND DECISIONS OF INTERNATIONAL BODIES)</w:t>
+              <w:spacing w:before="0" w:after="0" w:line="240" w:lineRule="auto"/>
+              <w:jc w:val="left"/>
+            </w:pPr>
+            <w:r>
+              <w:rPr>
+                <w:rFonts w:ascii="Times New Roman" w:hAnsi="Times New Roman" w:cs="Times New Roman" w:eastAsia="Times New Roman"/>
+                <w:sz w:val="28"/>
+                <w:szCs w:val="28"/>
+              </w:rPr>
+              <w:t xml:space="preserve">Espejon v. Lorredo, A.M. No. MTJ-22-007, March 9, 2022.</w:t>
+            </w:r>
+          </w:p>
+          <w:p>
+            <w:pPr>
+              <w:spacing w:before="60" w:after="0" w:line="240" w:lineRule="auto"/>
+              <w:jc w:val="both"/>
+            </w:pPr>
+            <w:r>
+              <w:rPr>
+                <w:rFonts w:ascii="Times New Roman" w:hAnsi="Times New Roman" w:cs="Times New Roman" w:eastAsia="Times New Roman"/>
+                <w:sz w:val="28"/>
+                <w:szCs w:val="28"/>
+              </w:rPr>
+              <w:t xml:space="preserve">The Court suspended and fined a judge for homophobic remarks against litigants on account of their perceived same-sex relationship, finding a violation of the New Code of Judicial Conduct and work-related sexual harassment.</w:t>
             </w:r>
           </w:p>
         </w:tc>
@@ -7722,10 +7752,17 @@
           </w:tcPr>
           <w:p>
             <w:pPr>
-              <w:keepNext/>
-              <w:spacing w:before="0" w:after="0" w:line="240" w:lineRule="auto"/>
-              <w:jc w:val="left"/>
-            </w:pPr>
+              <w:spacing w:before="0" w:after="0" w:line="240" w:lineRule="auto"/>
+              <w:jc w:val="left"/>
+            </w:pPr>
+            <w:r>
+              <w:rPr>
+                <w:rFonts w:ascii="Times New Roman" w:hAnsi="Times New Roman" w:cs="Times New Roman" w:eastAsia="Times New Roman"/>
+                <w:sz w:val="28"/>
+                <w:szCs w:val="28"/>
+              </w:rPr>
+              <w:t xml:space="preserve">Mandatory</w:t>
+            </w:r>
           </w:p>
         </w:tc>
         <w:tc>
@@ -7734,10 +7771,17 @@
           </w:tcPr>
           <w:p>
             <w:pPr>
-              <w:keepNext/>
-              <w:spacing w:before="0" w:after="0" w:line="240" w:lineRule="auto"/>
-              <w:jc w:val="left"/>
-            </w:pPr>
+              <w:spacing w:before="0" w:after="0" w:line="240" w:lineRule="auto"/>
+              <w:jc w:val="left"/>
+            </w:pPr>
+            <w:r>
+              <w:rPr>
+                <w:rFonts w:ascii="Times New Roman" w:hAnsi="Times New Roman" w:cs="Times New Roman" w:eastAsia="Times New Roman"/>
+                <w:sz w:val="28"/>
+                <w:szCs w:val="28"/>
+              </w:rPr>
+              <w:t xml:space="preserve">Supreme Court E-Library; Supreme Court website (sc.judiciary.gov.ph)</w:t>
+            </w:r>
           </w:p>
         </w:tc>
       </w:tr>
@@ -7760,7 +7804,7 @@
                 <w:sz w:val="28"/>
                 <w:szCs w:val="28"/>
               </w:rPr>
-              <w:t xml:space="preserve">1.</w:t>
+              <w:t xml:space="preserve">10.</w:t>
             </w:r>
           </w:p>
         </w:tc>
@@ -7779,7 +7823,7 @@
                 <w:sz w:val="28"/>
                 <w:szCs w:val="28"/>
               </w:rPr>
-              <w:t xml:space="preserve">International Covenant on Civil and Political Rights, December 19, 1966 (1976), 999 U.N.T.S. 171, art. 23.</w:t>
+              <w:t xml:space="preserve">Republic v. Cagandahan, 586 Phil. 637 (2008).</w:t>
             </w:r>
           </w:p>
           <w:p>
@@ -7793,25 +7837,7 @@
                 <w:sz w:val="28"/>
                 <w:szCs w:val="28"/>
               </w:rPr>
-              <w:t xml:space="preserve">Protects the family and recognizes “the right of men and women of marriageable age to marry,” gendered wording that the Human Rights Committee in </w:t>
-            </w:r>
-            <w:r>
-              <w:rPr>
-                <w:rFonts w:ascii="Times New Roman" w:hAnsi="Times New Roman" w:cs="Times New Roman" w:eastAsia="Times New Roman"/>
-                <w:i/>
-                <w:iCs/>
-                <w:sz w:val="28"/>
-                <w:szCs w:val="28"/>
-              </w:rPr>
-              <w:t xml:space="preserve">Joslin</w:t>
-            </w:r>
-            <w:r>
-              <w:rPr>
-                <w:rFonts w:ascii="Times New Roman" w:hAnsi="Times New Roman" w:cs="Times New Roman" w:eastAsia="Times New Roman"/>
-                <w:sz w:val="28"/>
-                <w:szCs w:val="28"/>
-              </w:rPr>
-              <w:t xml:space="preserve"> read as not requiring States to open marriage to same-sex couples.</w:t>
+              <w:t xml:space="preserve">The Court allowed an intersex person with congenital adrenal hyperplasia to change the registered sex from female to male and the registered name, bearing on how “male” and “female” are determined for purposes of capacity to marry.</w:t>
             </w:r>
           </w:p>
         </w:tc>
@@ -7849,7 +7875,7 @@
                 <w:sz w:val="28"/>
                 <w:szCs w:val="28"/>
               </w:rPr>
-              <w:t xml:space="preserve">United Nations Treaty Collection (treaties.un.org); OHCHR website (ohchr.org)</w:t>
+              <w:t xml:space="preserve">Philippine Reports, vol. 586; Supreme Court E-Library</w:t>
             </w:r>
           </w:p>
         </w:tc>
@@ -7873,7 +7899,7 @@
                 <w:sz w:val="28"/>
                 <w:szCs w:val="28"/>
               </w:rPr>
-              <w:t xml:space="preserve">2.</w:t>
+              <w:t xml:space="preserve">11.</w:t>
             </w:r>
           </w:p>
         </w:tc>
@@ -7892,7 +7918,7 @@
                 <w:sz w:val="28"/>
                 <w:szCs w:val="28"/>
               </w:rPr>
-              <w:t xml:space="preserve">International Covenant on Civil and Political Rights, December 19, 1966 (1976), 999 U.N.T.S. 171, arts. 2 (1), 17, 26.</w:t>
+              <w:t xml:space="preserve">Almelor v. Regional Trial Court of Las Piñas City, G.R. No. 179620, August 26, 2008.</w:t>
             </w:r>
           </w:p>
           <w:p>
@@ -7906,7 +7932,25 @@
                 <w:sz w:val="28"/>
                 <w:szCs w:val="28"/>
               </w:rPr>
-              <w:t xml:space="preserve">Guarantees non-discrimination, equality before the law, and protection against interference with privacy and family, which the Human Rights Committee has read to prohibit discrimination based on sexual orientation.</w:t>
+              <w:t xml:space="preserve">The Court ruled that it is the concealment of homosexuality, not homosexuality </w:t>
+            </w:r>
+            <w:r>
+              <w:rPr>
+                <w:rFonts w:ascii="Times New Roman" w:hAnsi="Times New Roman" w:cs="Times New Roman" w:eastAsia="Times New Roman"/>
+                <w:i/>
+                <w:iCs/>
+                <w:sz w:val="28"/>
+                <w:szCs w:val="28"/>
+              </w:rPr>
+              <w:t xml:space="preserve">per se</w:t>
+            </w:r>
+            <w:r>
+              <w:rPr>
+                <w:rFonts w:ascii="Times New Roman" w:hAnsi="Times New Roman" w:cs="Times New Roman" w:eastAsia="Times New Roman"/>
+                <w:sz w:val="28"/>
+                <w:szCs w:val="28"/>
+              </w:rPr>
+              <w:t xml:space="preserve">, that constitutes fraud under Article 46 (4), and found the evidence insufficient to annul the marriage.</w:t>
             </w:r>
           </w:p>
         </w:tc>
@@ -7944,7 +7988,7 @@
                 <w:sz w:val="28"/>
                 <w:szCs w:val="28"/>
               </w:rPr>
-              <w:t xml:space="preserve">United Nations Treaty Collection (treaties.un.org); OHCHR website (ohchr.org)</w:t>
+              <w:t xml:space="preserve">Supreme Court E-Library; Supreme Court website (sc.judiciary.gov.ph)</w:t>
             </w:r>
           </w:p>
         </w:tc>
@@ -7968,7 +8012,7 @@
                 <w:sz w:val="28"/>
                 <w:szCs w:val="28"/>
               </w:rPr>
-              <w:t xml:space="preserve">3.</w:t>
+              <w:t xml:space="preserve">12.</w:t>
             </w:r>
           </w:p>
         </w:tc>
@@ -7987,7 +8031,7 @@
                 <w:sz w:val="28"/>
                 <w:szCs w:val="28"/>
               </w:rPr>
-              <w:t xml:space="preserve">International Covenant on Economic, Social and Cultural Rights, December 19, 1966 (1976), 993 U.N.T.S. 3, art. 10 (1).</w:t>
+              <w:t xml:space="preserve">Silverio v. Republic, 562 Phil. 953 (2007).</w:t>
             </w:r>
           </w:p>
           <w:p>
@@ -8001,7 +8045,7 @@
                 <w:sz w:val="28"/>
                 <w:szCs w:val="28"/>
               </w:rPr>
-              <w:t xml:space="preserve">Accords “the widest possible protection and assistance” to the family and requires that marriage be entered into with the free consent of the intending spouses, without specifying the sex of the spouses.</w:t>
+              <w:t xml:space="preserve">The Court denied a transsexual woman’s petition to change the name and sex entries in her birth certificate, reasoning that no law allows it and that granting it would permit a union between two persons of the same birth sex despite marriage being between a man and a woman.</w:t>
             </w:r>
           </w:p>
         </w:tc>
@@ -8039,7 +8083,7 @@
                 <w:sz w:val="28"/>
                 <w:szCs w:val="28"/>
               </w:rPr>
-              <w:t xml:space="preserve">United Nations Treaty Collection (treaties.un.org); OHCHR website (ohchr.org)</w:t>
+              <w:t xml:space="preserve">Philippine Reports, vol. 562; Supreme Court E-Library</w:t>
             </w:r>
           </w:p>
         </w:tc>
@@ -8054,16 +8098,19 @@
           </w:tcPr>
           <w:p>
             <w:pPr>
-              <w:spacing w:before="0" w:after="0" w:line="240" w:lineRule="auto"/>
-              <w:jc w:val="left"/>
-            </w:pPr>
-            <w:r>
-              <w:rPr>
-                <w:rFonts w:ascii="Times New Roman" w:hAnsi="Times New Roman" w:cs="Times New Roman" w:eastAsia="Times New Roman"/>
-                <w:sz w:val="28"/>
-                <w:szCs w:val="28"/>
-              </w:rPr>
-              <w:t xml:space="preserve">4.</w:t>
+              <w:keepNext/>
+              <w:spacing w:before="0" w:after="0" w:line="240" w:lineRule="auto"/>
+              <w:jc w:val="left"/>
+            </w:pPr>
+            <w:r>
+              <w:rPr>
+                <w:rFonts w:ascii="Times New Roman" w:hAnsi="Times New Roman" w:cs="Times New Roman" w:eastAsia="Times New Roman"/>
+                <w:b/>
+                <w:bCs/>
+                <w:sz w:val="28"/>
+                <w:szCs w:val="28"/>
+              </w:rPr>
+              <w:t xml:space="preserve">H.</w:t>
             </w:r>
           </w:p>
         </w:tc>
@@ -8073,30 +8120,19 @@
           </w:tcPr>
           <w:p>
             <w:pPr>
-              <w:spacing w:before="0" w:after="0" w:line="240" w:lineRule="auto"/>
-              <w:jc w:val="left"/>
-            </w:pPr>
-            <w:r>
-              <w:rPr>
-                <w:rFonts w:ascii="Times New Roman" w:hAnsi="Times New Roman" w:cs="Times New Roman" w:eastAsia="Times New Roman"/>
-                <w:sz w:val="28"/>
-                <w:szCs w:val="28"/>
-              </w:rPr>
-              <w:t xml:space="preserve">Convention on the Elimination of All Forms of Discrimination against Women, July 15, 1980 (1981), 1249 U.N.T.S. 13, art. 16.</w:t>
-            </w:r>
-          </w:p>
-          <w:p>
-            <w:pPr>
-              <w:spacing w:before="60" w:after="0" w:line="240" w:lineRule="auto"/>
-              <w:jc w:val="both"/>
-            </w:pPr>
-            <w:r>
-              <w:rPr>
-                <w:rFonts w:ascii="Times New Roman" w:hAnsi="Times New Roman" w:cs="Times New Roman" w:eastAsia="Times New Roman"/>
-                <w:sz w:val="28"/>
-                <w:szCs w:val="28"/>
-              </w:rPr>
-              <w:t xml:space="preserve">Obliges States to eliminate discrimination against women in matters relating to marriage and family relations on a basis of equality of men and women, the source of the Magna Carta of Women’s marriage provisions.</w:t>
+              <w:keepNext/>
+              <w:spacing w:before="0" w:after="0" w:line="240" w:lineRule="auto"/>
+              <w:jc w:val="left"/>
+            </w:pPr>
+            <w:r>
+              <w:rPr>
+                <w:rFonts w:ascii="Times New Roman" w:hAnsi="Times New Roman" w:cs="Times New Roman" w:eastAsia="Times New Roman"/>
+                <w:b/>
+                <w:bCs/>
+                <w:sz w:val="28"/>
+                <w:szCs w:val="28"/>
+              </w:rPr>
+              <w:t xml:space="preserve">LOCAL ORDINANCES AND RESOLUTIONS</w:t>
             </w:r>
           </w:p>
         </w:tc>
@@ -8106,17 +8142,10 @@
           </w:tcPr>
           <w:p>
             <w:pPr>
-              <w:spacing w:before="0" w:after="0" w:line="240" w:lineRule="auto"/>
-              <w:jc w:val="left"/>
-            </w:pPr>
-            <w:r>
-              <w:rPr>
-                <w:rFonts w:ascii="Times New Roman" w:hAnsi="Times New Roman" w:cs="Times New Roman" w:eastAsia="Times New Roman"/>
-                <w:sz w:val="28"/>
-                <w:szCs w:val="28"/>
-              </w:rPr>
-              <w:t xml:space="preserve">Mandatory</w:t>
-            </w:r>
+              <w:keepNext/>
+              <w:spacing w:before="0" w:after="0" w:line="240" w:lineRule="auto"/>
+              <w:jc w:val="left"/>
+            </w:pPr>
           </w:p>
         </w:tc>
         <w:tc>
@@ -8125,17 +8154,10 @@
           </w:tcPr>
           <w:p>
             <w:pPr>
-              <w:spacing w:before="0" w:after="0" w:line="240" w:lineRule="auto"/>
-              <w:jc w:val="left"/>
-            </w:pPr>
-            <w:r>
-              <w:rPr>
-                <w:rFonts w:ascii="Times New Roman" w:hAnsi="Times New Roman" w:cs="Times New Roman" w:eastAsia="Times New Roman"/>
-                <w:sz w:val="28"/>
-                <w:szCs w:val="28"/>
-              </w:rPr>
-              <w:t xml:space="preserve">United Nations Treaty Collection (treaties.un.org); OHCHR website (ohchr.org)</w:t>
-            </w:r>
+              <w:keepNext/>
+              <w:spacing w:before="0" w:after="0" w:line="240" w:lineRule="auto"/>
+              <w:jc w:val="left"/>
+            </w:pPr>
           </w:p>
         </w:tc>
       </w:tr>
@@ -8158,7 +8180,7 @@
                 <w:sz w:val="28"/>
                 <w:szCs w:val="28"/>
               </w:rPr>
-              <w:t xml:space="preserve">5.</w:t>
+              <w:t xml:space="preserve">1.</w:t>
             </w:r>
           </w:p>
         </w:tc>
@@ -8177,7 +8199,7 @@
                 <w:sz w:val="28"/>
                 <w:szCs w:val="28"/>
               </w:rPr>
-              <w:t xml:space="preserve">Universal Declaration of Human Rights, G.A. Res. 217 (III) A, U.N. Doc. A/RES/217(III), art. 16 (December 10, 1948).</w:t>
+              <w:t xml:space="preserve">Quezon City Ordinance No. SP-3221, S-2023, September 25, 2023.</w:t>
             </w:r>
           </w:p>
           <w:p>
@@ -8191,7 +8213,7 @@
                 <w:sz w:val="28"/>
                 <w:szCs w:val="28"/>
               </w:rPr>
-              <w:t xml:space="preserve">Declares that “men and women of full age” have the right to marry and to found a family, the model for the marriage provisions of later human rights treaties.</w:t>
+              <w:t xml:space="preserve">Requires health facilities in Quezon City to recognize health care proxies, institutionalizing the “Right to Care” card that allows same-sex partners to make medical decisions for each other through a special power of attorney.</w:t>
             </w:r>
           </w:p>
         </w:tc>
@@ -8210,7 +8232,7 @@
                 <w:sz w:val="28"/>
                 <w:szCs w:val="28"/>
               </w:rPr>
-              <w:t xml:space="preserve">Persuasive</w:t>
+              <w:t xml:space="preserve">Mandatory</w:t>
             </w:r>
           </w:p>
         </w:tc>
@@ -8229,7 +8251,7 @@
                 <w:sz w:val="28"/>
                 <w:szCs w:val="28"/>
               </w:rPr>
-              <w:t xml:space="preserve">United Nations website (un.org); UN Digital Library</w:t>
+              <w:t xml:space="preserve">Sangguniang Panlungsod ng Quezon City; Quezon City Public Library digital repository (LIBROS)</w:t>
             </w:r>
           </w:p>
         </w:tc>
@@ -8253,7 +8275,7 @@
                 <w:sz w:val="28"/>
                 <w:szCs w:val="28"/>
               </w:rPr>
-              <w:t xml:space="preserve">6.</w:t>
+              <w:t xml:space="preserve">2.</w:t>
             </w:r>
           </w:p>
         </w:tc>
@@ -8272,7 +8294,7 @@
                 <w:sz w:val="28"/>
                 <w:szCs w:val="28"/>
               </w:rPr>
-              <w:t xml:space="preserve">Toonen v. Australia, Communication No. 488/1992, U.N. Doc. CCPR/C/50/D/488/1992 (Human Rights Comm., March 31, 1994).</w:t>
+              <w:t xml:space="preserve">San Juan City Ordinance No. 16, S-2025 (2025).</w:t>
             </w:r>
           </w:p>
           <w:p>
@@ -8286,7 +8308,7 @@
                 <w:sz w:val="28"/>
                 <w:szCs w:val="28"/>
               </w:rPr>
-              <w:t xml:space="preserve">The Human Rights Committee held that the reference to “sex” in Articles 2 (1) and 26 of the ICCPR includes sexual orientation, laying the foundation for sexual-orientation equality claims under the Covenant.</w:t>
+              <w:t xml:space="preserve">San Juan’s “Right to Care” Ordinance requires public and private health facilities in the city to honor the Right to Care Card, through which LGBTQIA+ partners may make medical decisions for one another.</w:t>
             </w:r>
           </w:p>
         </w:tc>
@@ -8305,7 +8327,7 @@
                 <w:sz w:val="28"/>
                 <w:szCs w:val="28"/>
               </w:rPr>
-              <w:t xml:space="preserve">Persuasive</w:t>
+              <w:t xml:space="preserve">Mandatory</w:t>
             </w:r>
           </w:p>
         </w:tc>
@@ -8324,7 +8346,7 @@
                 <w:sz w:val="28"/>
                 <w:szCs w:val="28"/>
               </w:rPr>
-              <w:t xml:space="preserve">OHCHR Jurisprudence Database (juris.ohchr.org); UN Treaty Body Database</w:t>
+              <w:t xml:space="preserve">Sangguniang Panlungsod ng San Juan City</w:t>
             </w:r>
           </w:p>
         </w:tc>
@@ -8348,7 +8370,7 @@
                 <w:sz w:val="28"/>
                 <w:szCs w:val="28"/>
               </w:rPr>
-              <w:t xml:space="preserve">7.</w:t>
+              <w:t xml:space="preserve">3.</w:t>
             </w:r>
           </w:p>
         </w:tc>
@@ -8367,7 +8389,7 @@
                 <w:sz w:val="28"/>
                 <w:szCs w:val="28"/>
               </w:rPr>
-              <w:t xml:space="preserve">Joslin v. New Zealand, Communication No. 902/1999, U.N. Doc. CCPR/C/75/D/902/1999 (Human Rights Comm., July 17, 2002).</w:t>
+              <w:t xml:space="preserve">Quezon City Ordinance No. SP-3417, S-2025, June 16, 2025.</w:t>
             </w:r>
           </w:p>
           <w:p>
@@ -8381,7 +8403,7 @@
                 <w:sz w:val="28"/>
                 <w:szCs w:val="28"/>
               </w:rPr>
-              <w:t xml:space="preserve">The Committee held that a State’s refusal to allow same-sex couples to marry does not violate the ICCPR because Article 23 (2) refers specifically to “men and women.”</w:t>
+              <w:t xml:space="preserve">Revises the Quezon City Gender-Fair Ordinance into a comprehensive anti-discrimination policy on the basis of sexual orientation, gender identity and expression, and sex characteristics (SOGIESC).</w:t>
             </w:r>
           </w:p>
         </w:tc>
@@ -8400,7 +8422,7 @@
                 <w:sz w:val="28"/>
                 <w:szCs w:val="28"/>
               </w:rPr>
-              <w:t xml:space="preserve">Persuasive</w:t>
+              <w:t xml:space="preserve">Mandatory</w:t>
             </w:r>
           </w:p>
         </w:tc>
@@ -8419,7 +8441,7 @@
                 <w:sz w:val="28"/>
                 <w:szCs w:val="28"/>
               </w:rPr>
-              <w:t xml:space="preserve">OHCHR Jurisprudence Database (juris.ohchr.org); UN Treaty Body Database</w:t>
+              <w:t xml:space="preserve">Sangguniang Panlungsod ng Quezon City; Quezon City Public Library digital repository (LIBROS)</w:t>
             </w:r>
           </w:p>
         </w:tc>
@@ -8443,7 +8465,7 @@
                 <w:sz w:val="28"/>
                 <w:szCs w:val="28"/>
               </w:rPr>
-              <w:t xml:space="preserve">8.</w:t>
+              <w:t xml:space="preserve">4.</w:t>
             </w:r>
           </w:p>
         </w:tc>
@@ -8462,7 +8484,7 @@
                 <w:sz w:val="28"/>
                 <w:szCs w:val="28"/>
               </w:rPr>
-              <w:t xml:space="preserve">Young v. Australia, Communication No. 941/2000, U.N. Doc. CCPR/C/78/D/941/2000 (Human Rights Comm., August 6, 2003).</w:t>
+              <w:t xml:space="preserve">Quezon City Ordinance No. SP-2357, S-2014, November 28, 2014.</w:t>
             </w:r>
           </w:p>
           <w:p>
@@ -8476,7 +8498,7 @@
                 <w:sz w:val="28"/>
                 <w:szCs w:val="28"/>
               </w:rPr>
-              <w:t xml:space="preserve">The Committee found that denying a veterans’ pension to the surviving same-sex partner of a veteran violated the equality guarantee of Article 26.</w:t>
+              <w:t xml:space="preserve">The Quezon City Gender-Fair Ordinance prohibits discrimination on the basis of sexual orientation and gender identity and expression in employment, education, accommodation, and the delivery of goods and services.</w:t>
             </w:r>
           </w:p>
         </w:tc>
@@ -8495,7 +8517,7 @@
                 <w:sz w:val="28"/>
                 <w:szCs w:val="28"/>
               </w:rPr>
-              <w:t xml:space="preserve">Persuasive</w:t>
+              <w:t xml:space="preserve">Mandatory</w:t>
             </w:r>
           </w:p>
         </w:tc>
@@ -8514,7 +8536,7 @@
                 <w:sz w:val="28"/>
                 <w:szCs w:val="28"/>
               </w:rPr>
-              <w:t xml:space="preserve">OHCHR Jurisprudence Database (juris.ohchr.org); UN Treaty Body Database</w:t>
+              <w:t xml:space="preserve">Sangguniang Panlungsod ng Quezon City; Quezon City Public Library digital repository (LIBROS)</w:t>
             </w:r>
           </w:p>
         </w:tc>
@@ -8538,7 +8560,7 @@
                 <w:sz w:val="28"/>
                 <w:szCs w:val="28"/>
               </w:rPr>
-              <w:t xml:space="preserve">9.</w:t>
+              <w:t xml:space="preserve">5.</w:t>
             </w:r>
           </w:p>
         </w:tc>
@@ -8557,7 +8579,7 @@
                 <w:sz w:val="28"/>
                 <w:szCs w:val="28"/>
               </w:rPr>
-              <w:t xml:space="preserve">X v. Colombia, Communication No. 1361/2005, U.N. Doc. CCPR/C/89/D/1361/2005 (Human Rights Comm., March 30, 2007).</w:t>
+              <w:t xml:space="preserve">Quezon City Ordinance No. SP-1309, S-2003.</w:t>
             </w:r>
           </w:p>
           <w:p>
@@ -8571,7 +8593,7 @@
                 <w:sz w:val="28"/>
                 <w:szCs w:val="28"/>
               </w:rPr>
-              <w:t xml:space="preserve">The Committee held that denying a pension to the surviving partner of a same-sex union, where unmarried heterosexual partners were entitled, was discrimination based on sexual orientation under Article 26.</w:t>
+              <w:t xml:space="preserve">An early local ordinance prohibiting discrimination against homosexuals in the workplace, later expanded by the Gender-Fair Ordinance.</w:t>
             </w:r>
           </w:p>
         </w:tc>
@@ -8590,7 +8612,7 @@
                 <w:sz w:val="28"/>
                 <w:szCs w:val="28"/>
               </w:rPr>
-              <w:t xml:space="preserve">Persuasive</w:t>
+              <w:t xml:space="preserve">Mandatory</w:t>
             </w:r>
           </w:p>
         </w:tc>
@@ -8609,7 +8631,7 @@
                 <w:sz w:val="28"/>
                 <w:szCs w:val="28"/>
               </w:rPr>
-              <w:t xml:space="preserve">OHCHR Jurisprudence Database (juris.ohchr.org); UN Treaty Body Database</w:t>
+              <w:t xml:space="preserve">Sangguniang Panlungsod ng Quezon City</w:t>
             </w:r>
           </w:p>
         </w:tc>
@@ -8633,7 +8655,7 @@
                 <w:sz w:val="28"/>
                 <w:szCs w:val="28"/>
               </w:rPr>
-              <w:t xml:space="preserve">10.</w:t>
+              <w:t xml:space="preserve">6.</w:t>
             </w:r>
           </w:p>
         </w:tc>
@@ -8652,7 +8674,7 @@
                 <w:sz w:val="28"/>
                 <w:szCs w:val="28"/>
               </w:rPr>
-              <w:t xml:space="preserve">Human Rights Comm., Concluding Observations: Philippines, U.N. Doc. CCPR/C/PHL/CO/4 (November 13, 2012).</w:t>
+              <w:t xml:space="preserve">Davao City Ordinance No. 0417-12 (2012).</w:t>
             </w:r>
           </w:p>
           <w:p>
@@ -8666,7 +8688,7 @@
                 <w:sz w:val="28"/>
                 <w:szCs w:val="28"/>
               </w:rPr>
-              <w:t xml:space="preserve">The Committee urged the Philippines to adopt a comprehensive anti-discrimination law that covers sexual orientation and gender identity, noting that the pending bill had not been passed.</w:t>
+              <w:t xml:space="preserve">Davao City’s Anti-Discrimination Ordinance declares unlawful acts of discrimination based on, among others, sex, gender identity, and sexual orientation.</w:t>
             </w:r>
           </w:p>
         </w:tc>
@@ -8685,7 +8707,7 @@
                 <w:sz w:val="28"/>
                 <w:szCs w:val="28"/>
               </w:rPr>
-              <w:t xml:space="preserve">Persuasive</w:t>
+              <w:t xml:space="preserve">Mandatory</w:t>
             </w:r>
           </w:p>
         </w:tc>
@@ -8704,7 +8726,7 @@
                 <w:sz w:val="28"/>
                 <w:szCs w:val="28"/>
               </w:rPr>
-              <w:t xml:space="preserve">UN Treaty Body Database (tbinternet.ohchr.org); UN Digital Library</w:t>
+              <w:t xml:space="preserve">Sangguniang Panlungsod ng Davao City</w:t>
             </w:r>
           </w:p>
         </w:tc>
@@ -8728,7 +8750,7 @@
                 <w:sz w:val="28"/>
                 <w:szCs w:val="28"/>
               </w:rPr>
-              <w:t xml:space="preserve">11.</w:t>
+              <w:t xml:space="preserve">7.</w:t>
             </w:r>
           </w:p>
         </w:tc>
@@ -8747,7 +8769,7 @@
                 <w:sz w:val="28"/>
                 <w:szCs w:val="28"/>
               </w:rPr>
-              <w:t xml:space="preserve">Human Rights Council Res. 17/19, U.N. Doc. A/HRC/RES/17/19 (June 17, 2011).</w:t>
+              <w:t xml:space="preserve">Cebu City Ordinance No. 2339 (2012).</w:t>
             </w:r>
           </w:p>
           <w:p>
@@ -8761,7 +8783,7 @@
                 <w:sz w:val="28"/>
                 <w:szCs w:val="28"/>
               </w:rPr>
-              <w:t xml:space="preserve">The first United Nations resolution on human rights, sexual orientation, and gender identity, expressing grave concern over violence and discrimination on these grounds.</w:t>
+              <w:t xml:space="preserve">Prohibits discrimination on the basis of, among others, sexual orientation and gender identity, illustrating how LGBT protection has developed through local legislation in the absence of a national law.</w:t>
             </w:r>
           </w:p>
         </w:tc>
@@ -8780,7 +8802,7 @@
                 <w:sz w:val="28"/>
                 <w:szCs w:val="28"/>
               </w:rPr>
-              <w:t xml:space="preserve">Persuasive</w:t>
+              <w:t xml:space="preserve">Mandatory</w:t>
             </w:r>
           </w:p>
         </w:tc>
@@ -8799,7 +8821,7 @@
                 <w:sz w:val="28"/>
                 <w:szCs w:val="28"/>
               </w:rPr>
-              <w:t xml:space="preserve">UN Digital Library; OHCHR website (ohchr.org)</w:t>
+              <w:t xml:space="preserve">Sangguniang Panlungsod ng Cebu City</w:t>
             </w:r>
           </w:p>
         </w:tc>
@@ -8814,16 +8836,19 @@
           </w:tcPr>
           <w:p>
             <w:pPr>
-              <w:spacing w:before="0" w:after="0" w:line="240" w:lineRule="auto"/>
-              <w:jc w:val="left"/>
-            </w:pPr>
-            <w:r>
-              <w:rPr>
-                <w:rFonts w:ascii="Times New Roman" w:hAnsi="Times New Roman" w:cs="Times New Roman" w:eastAsia="Times New Roman"/>
-                <w:sz w:val="28"/>
-                <w:szCs w:val="28"/>
-              </w:rPr>
-              <w:t xml:space="preserve">12.</w:t>
+              <w:keepNext/>
+              <w:spacing w:before="0" w:after="0" w:line="240" w:lineRule="auto"/>
+              <w:jc w:val="left"/>
+            </w:pPr>
+            <w:r>
+              <w:rPr>
+                <w:rFonts w:ascii="Times New Roman" w:hAnsi="Times New Roman" w:cs="Times New Roman" w:eastAsia="Times New Roman"/>
+                <w:b/>
+                <w:bCs/>
+                <w:sz w:val="28"/>
+                <w:szCs w:val="28"/>
+              </w:rPr>
+              <w:t xml:space="preserve">I.</w:t>
             </w:r>
           </w:p>
         </w:tc>
@@ -8833,30 +8858,19 @@
           </w:tcPr>
           <w:p>
             <w:pPr>
-              <w:spacing w:before="0" w:after="0" w:line="240" w:lineRule="auto"/>
-              <w:jc w:val="left"/>
-            </w:pPr>
-            <w:r>
-              <w:rPr>
-                <w:rFonts w:ascii="Times New Roman" w:hAnsi="Times New Roman" w:cs="Times New Roman" w:eastAsia="Times New Roman"/>
-                <w:sz w:val="28"/>
-                <w:szCs w:val="28"/>
-              </w:rPr>
-              <w:t xml:space="preserve">Human Rights Council Res. 32/2, U.N. Doc. A/HRC/RES/32/2 (June 30, 2016).</w:t>
-            </w:r>
-          </w:p>
-          <w:p>
-            <w:pPr>
-              <w:spacing w:before="60" w:after="0" w:line="240" w:lineRule="auto"/>
-              <w:jc w:val="both"/>
-            </w:pPr>
-            <w:r>
-              <w:rPr>
-                <w:rFonts w:ascii="Times New Roman" w:hAnsi="Times New Roman" w:cs="Times New Roman" w:eastAsia="Times New Roman"/>
-                <w:sz w:val="28"/>
-                <w:szCs w:val="28"/>
-              </w:rPr>
-              <w:t xml:space="preserve">Created the mandate of the Independent Expert on protection against violence and discrimination based on sexual orientation and gender identity.</w:t>
+              <w:keepNext/>
+              <w:spacing w:before="0" w:after="0" w:line="240" w:lineRule="auto"/>
+              <w:jc w:val="left"/>
+            </w:pPr>
+            <w:r>
+              <w:rPr>
+                <w:rFonts w:ascii="Times New Roman" w:hAnsi="Times New Roman" w:cs="Times New Roman" w:eastAsia="Times New Roman"/>
+                <w:b/>
+                <w:bCs/>
+                <w:sz w:val="28"/>
+                <w:szCs w:val="28"/>
+              </w:rPr>
+              <w:t xml:space="preserve">REGIONAL SOURCES OF LAW</w:t>
             </w:r>
           </w:p>
         </w:tc>
@@ -8866,17 +8880,10 @@
           </w:tcPr>
           <w:p>
             <w:pPr>
-              <w:spacing w:before="0" w:after="0" w:line="240" w:lineRule="auto"/>
-              <w:jc w:val="left"/>
-            </w:pPr>
-            <w:r>
-              <w:rPr>
-                <w:rFonts w:ascii="Times New Roman" w:hAnsi="Times New Roman" w:cs="Times New Roman" w:eastAsia="Times New Roman"/>
-                <w:sz w:val="28"/>
-                <w:szCs w:val="28"/>
-              </w:rPr>
-              <w:t xml:space="preserve">Persuasive</w:t>
-            </w:r>
+              <w:keepNext/>
+              <w:spacing w:before="0" w:after="0" w:line="240" w:lineRule="auto"/>
+              <w:jc w:val="left"/>
+            </w:pPr>
           </w:p>
         </w:tc>
         <w:tc>
@@ -8885,17 +8892,10 @@
           </w:tcPr>
           <w:p>
             <w:pPr>
-              <w:spacing w:before="0" w:after="0" w:line="240" w:lineRule="auto"/>
-              <w:jc w:val="left"/>
-            </w:pPr>
-            <w:r>
-              <w:rPr>
-                <w:rFonts w:ascii="Times New Roman" w:hAnsi="Times New Roman" w:cs="Times New Roman" w:eastAsia="Times New Roman"/>
-                <w:sz w:val="28"/>
-                <w:szCs w:val="28"/>
-              </w:rPr>
-              <w:t xml:space="preserve">UN Digital Library; OHCHR website (ohchr.org)</w:t>
-            </w:r>
+              <w:keepNext/>
+              <w:spacing w:before="0" w:after="0" w:line="240" w:lineRule="auto"/>
+              <w:jc w:val="left"/>
+            </w:pPr>
           </w:p>
         </w:tc>
       </w:tr>
@@ -8909,19 +8909,16 @@
           </w:tcPr>
           <w:p>
             <w:pPr>
-              <w:keepNext/>
-              <w:spacing w:before="0" w:after="0" w:line="240" w:lineRule="auto"/>
-              <w:jc w:val="left"/>
-            </w:pPr>
-            <w:r>
-              <w:rPr>
-                <w:rFonts w:ascii="Times New Roman" w:hAnsi="Times New Roman" w:cs="Times New Roman" w:eastAsia="Times New Roman"/>
-                <w:b/>
-                <w:bCs/>
-                <w:sz w:val="28"/>
-                <w:szCs w:val="28"/>
-              </w:rPr>
-              <w:t xml:space="preserve">J.</w:t>
+              <w:spacing w:before="0" w:after="0" w:line="240" w:lineRule="auto"/>
+              <w:jc w:val="left"/>
+            </w:pPr>
+            <w:r>
+              <w:rPr>
+                <w:rFonts w:ascii="Times New Roman" w:hAnsi="Times New Roman" w:cs="Times New Roman" w:eastAsia="Times New Roman"/>
+                <w:sz w:val="28"/>
+                <w:szCs w:val="28"/>
+              </w:rPr>
+              <w:t xml:space="preserve">1.</w:t>
             </w:r>
           </w:p>
         </w:tc>
@@ -8931,19 +8928,30 @@
           </w:tcPr>
           <w:p>
             <w:pPr>
-              <w:keepNext/>
-              <w:spacing w:before="0" w:after="0" w:line="240" w:lineRule="auto"/>
-              <w:jc w:val="left"/>
-            </w:pPr>
-            <w:r>
-              <w:rPr>
-                <w:rFonts w:ascii="Times New Roman" w:hAnsi="Times New Roman" w:cs="Times New Roman" w:eastAsia="Times New Roman"/>
-                <w:b/>
-                <w:bCs/>
-                <w:sz w:val="28"/>
-                <w:szCs w:val="28"/>
-              </w:rPr>
-              <w:t xml:space="preserve">REGIONAL SOURCES OF LAW</w:t>
+              <w:spacing w:before="0" w:after="0" w:line="240" w:lineRule="auto"/>
+              <w:jc w:val="left"/>
+            </w:pPr>
+            <w:r>
+              <w:rPr>
+                <w:rFonts w:ascii="Times New Roman" w:hAnsi="Times New Roman" w:cs="Times New Roman" w:eastAsia="Times New Roman"/>
+                <w:sz w:val="28"/>
+                <w:szCs w:val="28"/>
+              </w:rPr>
+              <w:t xml:space="preserve">ASEAN Human Rights Declaration, art. 19 (November 18, 2012).</w:t>
+            </w:r>
+          </w:p>
+          <w:p>
+            <w:pPr>
+              <w:spacing w:before="60" w:after="0" w:line="240" w:lineRule="auto"/>
+              <w:jc w:val="both"/>
+            </w:pPr>
+            <w:r>
+              <w:rPr>
+                <w:rFonts w:ascii="Times New Roman" w:hAnsi="Times New Roman" w:cs="Times New Roman" w:eastAsia="Times New Roman"/>
+                <w:sz w:val="28"/>
+                <w:szCs w:val="28"/>
+              </w:rPr>
+              <w:t xml:space="preserve">Adopted by ASEAN leaders including the Philippines, it recognizes the right of “men and women of full age” to marry and found a family “as prescribed by law,” deferring to national law on the definition of marriage.</w:t>
             </w:r>
           </w:p>
         </w:tc>
@@ -8953,10 +8961,17 @@
           </w:tcPr>
           <w:p>
             <w:pPr>
-              <w:keepNext/>
-              <w:spacing w:before="0" w:after="0" w:line="240" w:lineRule="auto"/>
-              <w:jc w:val="left"/>
-            </w:pPr>
+              <w:spacing w:before="0" w:after="0" w:line="240" w:lineRule="auto"/>
+              <w:jc w:val="left"/>
+            </w:pPr>
+            <w:r>
+              <w:rPr>
+                <w:rFonts w:ascii="Times New Roman" w:hAnsi="Times New Roman" w:cs="Times New Roman" w:eastAsia="Times New Roman"/>
+                <w:sz w:val="28"/>
+                <w:szCs w:val="28"/>
+              </w:rPr>
+              <w:t xml:space="preserve">Persuasive</w:t>
+            </w:r>
           </w:p>
         </w:tc>
         <w:tc>
@@ -8965,10 +8980,17 @@
           </w:tcPr>
           <w:p>
             <w:pPr>
-              <w:keepNext/>
-              <w:spacing w:before="0" w:after="0" w:line="240" w:lineRule="auto"/>
-              <w:jc w:val="left"/>
-            </w:pPr>
+              <w:spacing w:before="0" w:after="0" w:line="240" w:lineRule="auto"/>
+              <w:jc w:val="left"/>
+            </w:pPr>
+            <w:r>
+              <w:rPr>
+                <w:rFonts w:ascii="Times New Roman" w:hAnsi="Times New Roman" w:cs="Times New Roman" w:eastAsia="Times New Roman"/>
+                <w:sz w:val="28"/>
+                <w:szCs w:val="28"/>
+              </w:rPr>
+              <w:t xml:space="preserve">ASEAN Secretariat website (asean.org)</w:t>
+            </w:r>
           </w:p>
         </w:tc>
       </w:tr>
@@ -8991,7 +9013,7 @@
                 <w:sz w:val="28"/>
                 <w:szCs w:val="28"/>
               </w:rPr>
-              <w:t xml:space="preserve">1.</w:t>
+              <w:t xml:space="preserve">2.</w:t>
             </w:r>
           </w:p>
         </w:tc>
@@ -9010,7 +9032,7 @@
                 <w:sz w:val="28"/>
                 <w:szCs w:val="28"/>
               </w:rPr>
-              <w:t xml:space="preserve">ASEAN Human Rights Declaration, art. 19 (November 18, 2012).</w:t>
+              <w:t xml:space="preserve">Convention for the Protection of Human Rights and Fundamental Freedoms, November 4, 1950 (1953), 213 U.N.T.S. 221, arts. 8, 12, 14.</w:t>
             </w:r>
           </w:p>
           <w:p>
@@ -9024,7 +9046,7 @@
                 <w:sz w:val="28"/>
                 <w:szCs w:val="28"/>
               </w:rPr>
-              <w:t xml:space="preserve">Adopted by ASEAN leaders including the Philippines, it recognizes the right of “men and women of full age” to marry and found a family “as prescribed by law,” deferring to national law on the definition of marriage.</w:t>
+              <w:t xml:space="preserve">The European Convention’s guarantees of private and family life, the right to marry, and non-discrimination, through which the European Court of Human Rights developed its case law on same-sex couples.</w:t>
             </w:r>
           </w:p>
         </w:tc>
@@ -9062,7 +9084,7 @@
                 <w:sz w:val="28"/>
                 <w:szCs w:val="28"/>
               </w:rPr>
-              <w:t xml:space="preserve">ASEAN Secretariat website (asean.org)</w:t>
+              <w:t xml:space="preserve">Council of Europe Treaty Office (coe.int); United Nations Treaty Series</w:t>
             </w:r>
           </w:p>
         </w:tc>
@@ -9086,7 +9108,7 @@
                 <w:sz w:val="28"/>
                 <w:szCs w:val="28"/>
               </w:rPr>
-              <w:t xml:space="preserve">2.</w:t>
+              <w:t xml:space="preserve">3.</w:t>
             </w:r>
           </w:p>
         </w:tc>
@@ -9105,7 +9127,7 @@
                 <w:sz w:val="28"/>
                 <w:szCs w:val="28"/>
               </w:rPr>
-              <w:t xml:space="preserve">Convention for the Protection of Human Rights and Fundamental Freedoms, November 4, 1950 (1953), 213 U.N.T.S. 221, arts. 8, 12, 14.</w:t>
+              <w:t xml:space="preserve">Schalk &amp; Kopf v. Austria, App. No. 30141/04, Eur. Ct. H.R. (June 24, 2010).</w:t>
             </w:r>
           </w:p>
           <w:p>
@@ -9119,7 +9141,7 @@
                 <w:sz w:val="28"/>
                 <w:szCs w:val="28"/>
               </w:rPr>
-              <w:t xml:space="preserve">The European Convention’s guarantees of private and family life, the right to marry, and non-discrimination, through which the European Court of Human Rights developed its case law on same-sex couples.</w:t>
+              <w:t xml:space="preserve">Held that the European Convention does not oblige States to open marriage to same-sex couples, while recognizing that a cohabiting same-sex couple enjoys “family life.”</w:t>
             </w:r>
           </w:p>
         </w:tc>
@@ -9157,7 +9179,7 @@
                 <w:sz w:val="28"/>
                 <w:szCs w:val="28"/>
               </w:rPr>
-              <w:t xml:space="preserve">Council of Europe Treaty Office (coe.int); United Nations Treaty Series</w:t>
+              <w:t xml:space="preserve">HUDOC database of the European Court of Human Rights (hudoc.echr.coe.int)</w:t>
             </w:r>
           </w:p>
         </w:tc>
@@ -9181,7 +9203,7 @@
                 <w:sz w:val="28"/>
                 <w:szCs w:val="28"/>
               </w:rPr>
-              <w:t xml:space="preserve">3.</w:t>
+              <w:t xml:space="preserve">4.</w:t>
             </w:r>
           </w:p>
         </w:tc>
@@ -9200,7 +9222,7 @@
                 <w:sz w:val="28"/>
                 <w:szCs w:val="28"/>
               </w:rPr>
-              <w:t xml:space="preserve">Schalk &amp; Kopf v. Austria, App. No. 30141/04, Eur. Ct. H.R. (June 24, 2010).</w:t>
+              <w:t xml:space="preserve">Oliari v. Italy, App. Nos. 18766/11 &amp; 36030/11, Eur. Ct. H.R. (July 21, 2015).</w:t>
             </w:r>
           </w:p>
           <w:p>
@@ -9214,7 +9236,7 @@
                 <w:sz w:val="28"/>
                 <w:szCs w:val="28"/>
               </w:rPr>
-              <w:t xml:space="preserve">Held that the European Convention does not oblige States to open marriage to same-sex couples, while recognizing that a cohabiting same-sex couple enjoys “family life.”</w:t>
+              <w:t xml:space="preserve">Found that Italy violated Article 8 by failing to provide any legal framework recognizing and protecting same-sex unions.</w:t>
             </w:r>
           </w:p>
         </w:tc>
@@ -9276,7 +9298,7 @@
                 <w:sz w:val="28"/>
                 <w:szCs w:val="28"/>
               </w:rPr>
-              <w:t xml:space="preserve">4.</w:t>
+              <w:t xml:space="preserve">5.</w:t>
             </w:r>
           </w:p>
         </w:tc>
@@ -9295,7 +9317,7 @@
                 <w:sz w:val="28"/>
                 <w:szCs w:val="28"/>
               </w:rPr>
-              <w:t xml:space="preserve">Oliari v. Italy, App. Nos. 18766/11 &amp; 36030/11, Eur. Ct. H.R. (July 21, 2015).</w:t>
+              <w:t xml:space="preserve">Orlandi v. Italy, App. No. 26431/12, Eur. Ct. H.R. (December 14, 2017).</w:t>
             </w:r>
           </w:p>
           <w:p>
@@ -9309,7 +9331,7 @@
                 <w:sz w:val="28"/>
                 <w:szCs w:val="28"/>
               </w:rPr>
-              <w:t xml:space="preserve">Found that Italy violated Article 8 by failing to provide any legal framework recognizing and protecting same-sex unions.</w:t>
+              <w:t xml:space="preserve">Held that Italy’s refusal to give any form of recognition to same-sex marriages its nationals contracted abroad violated Article 8, a parallel to Filipino same-sex couples married abroad.</w:t>
             </w:r>
           </w:p>
         </w:tc>
@@ -9371,7 +9393,7 @@
                 <w:sz w:val="28"/>
                 <w:szCs w:val="28"/>
               </w:rPr>
-              <w:t xml:space="preserve">5.</w:t>
+              <w:t xml:space="preserve">6.</w:t>
             </w:r>
           </w:p>
         </w:tc>
@@ -9390,7 +9412,7 @@
                 <w:sz w:val="28"/>
                 <w:szCs w:val="28"/>
               </w:rPr>
-              <w:t xml:space="preserve">Orlandi v. Italy, App. No. 26431/12, Eur. Ct. H.R. (December 14, 2017).</w:t>
+              <w:t xml:space="preserve">Fedotova v. Russia, App. Nos. 40792/10, 30538/14 &amp; 43439/14, Eur. Ct. H.R. (Grand Chamber, January 17, 2023).</w:t>
             </w:r>
           </w:p>
           <w:p>
@@ -9404,7 +9426,7 @@
                 <w:sz w:val="28"/>
                 <w:szCs w:val="28"/>
               </w:rPr>
-              <w:t xml:space="preserve">Held that Italy’s refusal to give any form of recognition to same-sex marriages its nationals contracted abroad violated Article 8, a parallel to Filipino same-sex couples married abroad.</w:t>
+              <w:t xml:space="preserve">The Grand Chamber held that Article 8 imposes a positive obligation on States to provide a legal framework for the recognition and protection of same-sex couples.</w:t>
             </w:r>
           </w:p>
         </w:tc>
@@ -9466,7 +9488,7 @@
                 <w:sz w:val="28"/>
                 <w:szCs w:val="28"/>
               </w:rPr>
-              <w:t xml:space="preserve">6.</w:t>
+              <w:t xml:space="preserve">7.</w:t>
             </w:r>
           </w:p>
         </w:tc>
@@ -9485,7 +9507,7 @@
                 <w:sz w:val="28"/>
                 <w:szCs w:val="28"/>
               </w:rPr>
-              <w:t xml:space="preserve">Fedotova v. Russia, App. Nos. 40792/10, 30538/14 &amp; 43439/14, Eur. Ct. H.R. (Grand Chamber, January 17, 2023).</w:t>
+              <w:t xml:space="preserve">Case C-673/16, Coman v. Inspectoratul General pentru Imigrări, ECLI:EU:C:2018:385 (June 5, 2018).</w:t>
             </w:r>
           </w:p>
           <w:p>
@@ -9499,7 +9521,7 @@
                 <w:sz w:val="28"/>
                 <w:szCs w:val="28"/>
               </w:rPr>
-              <w:t xml:space="preserve">The Grand Chamber held that Article 8 imposes a positive obligation on States to provide a legal framework for the recognition and protection of same-sex couples.</w:t>
+              <w:t xml:space="preserve">The Court of Justice of the European Union held that the term “spouse” in EU free-movement law includes a same-sex spouse, even in a Member State that does not allow same-sex marriage.</w:t>
             </w:r>
           </w:p>
         </w:tc>
@@ -9537,7 +9559,7 @@
                 <w:sz w:val="28"/>
                 <w:szCs w:val="28"/>
               </w:rPr>
-              <w:t xml:space="preserve">HUDOC database of the European Court of Human Rights (hudoc.echr.coe.int)</w:t>
+              <w:t xml:space="preserve">CURIA (curia.europa.eu); EUR-Lex (eur-lex.europa.eu)</w:t>
             </w:r>
           </w:p>
         </w:tc>
@@ -9561,7 +9583,7 @@
                 <w:sz w:val="28"/>
                 <w:szCs w:val="28"/>
               </w:rPr>
-              <w:t xml:space="preserve">7.</w:t>
+              <w:t xml:space="preserve">8.</w:t>
             </w:r>
           </w:p>
         </w:tc>
@@ -9580,7 +9602,7 @@
                 <w:sz w:val="28"/>
                 <w:szCs w:val="28"/>
               </w:rPr>
-              <w:t xml:space="preserve">Case C-673/16, Coman v. Inspectoratul General pentru Imigrări, ECLI:EU:C:2018:385 (June 5, 2018).</w:t>
+              <w:t xml:space="preserve">Gender Identity, and Equality and Non-Discrimination of Same-Sex Couples, Advisory Opinion OC-24/17, Inter-Am. Ct. H.R. (ser. A) No. 24 (November 24, 2017).</w:t>
             </w:r>
           </w:p>
           <w:p>
@@ -9594,7 +9616,7 @@
                 <w:sz w:val="28"/>
                 <w:szCs w:val="28"/>
               </w:rPr>
-              <w:t xml:space="preserve">The Court of Justice of the European Union held that the term “spouse” in EU free-movement law includes a same-sex spouse, even in a Member State that does not allow same-sex marriage.</w:t>
+              <w:t xml:space="preserve">The Inter-American Court of Human Rights opined that States must recognize and protect same-sex couples, including access to marriage, without discrimination.</w:t>
             </w:r>
           </w:p>
         </w:tc>
@@ -9632,7 +9654,7 @@
                 <w:sz w:val="28"/>
                 <w:szCs w:val="28"/>
               </w:rPr>
-              <w:t xml:space="preserve">CURIA (curia.europa.eu); EUR-Lex (eur-lex.europa.eu)</w:t>
+              <w:t xml:space="preserve">Inter-American Court of Human Rights website (corteidh.or.cr)</w:t>
             </w:r>
           </w:p>
         </w:tc>
@@ -9656,7 +9678,7 @@
                 <w:sz w:val="28"/>
                 <w:szCs w:val="28"/>
               </w:rPr>
-              <w:t xml:space="preserve">8.</w:t>
+              <w:t xml:space="preserve">9.</w:t>
             </w:r>
           </w:p>
         </w:tc>
@@ -9675,7 +9697,7 @@
                 <w:sz w:val="28"/>
                 <w:szCs w:val="28"/>
               </w:rPr>
-              <w:t xml:space="preserve">Gender Identity, and Equality and Non-Discrimination of Same-Sex Couples, Advisory Opinion OC-24/17, Inter-Am. Ct. H.R. (ser. A) No. 24 (November 24, 2017).</w:t>
+              <w:t xml:space="preserve">Atala Riffo &amp; Daughters v. Chile, Merits, Reparations and Costs, Inter-Am. Ct. H.R. (ser. C) No. 239 (February 24, 2012).</w:t>
             </w:r>
           </w:p>
           <w:p>
@@ -9689,7 +9711,7 @@
                 <w:sz w:val="28"/>
                 <w:szCs w:val="28"/>
               </w:rPr>
-              <w:t xml:space="preserve">The Inter-American Court of Human Rights opined that States must recognize and protect same-sex couples, including access to marriage, without discrimination.</w:t>
+              <w:t xml:space="preserve">Held that denying a lesbian mother custody of her daughters because of her sexual orientation and her cohabitation with a same-sex partner violated the American Convention on Human Rights.</w:t>
             </w:r>
           </w:p>
         </w:tc>
@@ -9742,101 +9764,6 @@
           </w:tcPr>
           <w:p>
             <w:pPr>
-              <w:spacing w:before="0" w:after="0" w:line="240" w:lineRule="auto"/>
-              <w:jc w:val="left"/>
-            </w:pPr>
-            <w:r>
-              <w:rPr>
-                <w:rFonts w:ascii="Times New Roman" w:hAnsi="Times New Roman" w:cs="Times New Roman" w:eastAsia="Times New Roman"/>
-                <w:sz w:val="28"/>
-                <w:szCs w:val="28"/>
-              </w:rPr>
-              <w:t xml:space="preserve">9.</w:t>
-            </w:r>
-          </w:p>
-        </w:tc>
-        <w:tc>
-          <w:tcPr>
-            <w:tcW w:w="9800" w:type="dxa"/>
-          </w:tcPr>
-          <w:p>
-            <w:pPr>
-              <w:spacing w:before="0" w:after="0" w:line="240" w:lineRule="auto"/>
-              <w:jc w:val="left"/>
-            </w:pPr>
-            <w:r>
-              <w:rPr>
-                <w:rFonts w:ascii="Times New Roman" w:hAnsi="Times New Roman" w:cs="Times New Roman" w:eastAsia="Times New Roman"/>
-                <w:sz w:val="28"/>
-                <w:szCs w:val="28"/>
-              </w:rPr>
-              <w:t xml:space="preserve">Atala Riffo &amp; Daughters v. Chile, Merits, Reparations and Costs, Inter-Am. Ct. H.R. (ser. C) No. 239 (February 24, 2012).</w:t>
-            </w:r>
-          </w:p>
-          <w:p>
-            <w:pPr>
-              <w:spacing w:before="60" w:after="0" w:line="240" w:lineRule="auto"/>
-              <w:jc w:val="both"/>
-            </w:pPr>
-            <w:r>
-              <w:rPr>
-                <w:rFonts w:ascii="Times New Roman" w:hAnsi="Times New Roman" w:cs="Times New Roman" w:eastAsia="Times New Roman"/>
-                <w:sz w:val="28"/>
-                <w:szCs w:val="28"/>
-              </w:rPr>
-              <w:t xml:space="preserve">Held that denying a lesbian mother custody of her daughters because of her sexual orientation and her cohabitation with a same-sex partner violated the American Convention on Human Rights.</w:t>
-            </w:r>
-          </w:p>
-        </w:tc>
-        <w:tc>
-          <w:tcPr>
-            <w:tcW w:w="2400" w:type="dxa"/>
-          </w:tcPr>
-          <w:p>
-            <w:pPr>
-              <w:spacing w:before="0" w:after="0" w:line="240" w:lineRule="auto"/>
-              <w:jc w:val="left"/>
-            </w:pPr>
-            <w:r>
-              <w:rPr>
-                <w:rFonts w:ascii="Times New Roman" w:hAnsi="Times New Roman" w:cs="Times New Roman" w:eastAsia="Times New Roman"/>
-                <w:sz w:val="28"/>
-                <w:szCs w:val="28"/>
-              </w:rPr>
-              <w:t xml:space="preserve">Persuasive</w:t>
-            </w:r>
-          </w:p>
-        </w:tc>
-        <w:tc>
-          <w:tcPr>
-            <w:tcW w:w="4225" w:type="dxa"/>
-          </w:tcPr>
-          <w:p>
-            <w:pPr>
-              <w:spacing w:before="0" w:after="0" w:line="240" w:lineRule="auto"/>
-              <w:jc w:val="left"/>
-            </w:pPr>
-            <w:r>
-              <w:rPr>
-                <w:rFonts w:ascii="Times New Roman" w:hAnsi="Times New Roman" w:cs="Times New Roman" w:eastAsia="Times New Roman"/>
-                <w:sz w:val="28"/>
-                <w:szCs w:val="28"/>
-              </w:rPr>
-              <w:t xml:space="preserve">Inter-American Court of Human Rights website (corteidh.or.cr)</w:t>
-            </w:r>
-          </w:p>
-        </w:tc>
-      </w:tr>
-      <w:tr>
-        <w:trPr>
-          <w:cantSplit/>
-        </w:trPr>
-        <w:tc>
-          <w:tcPr>
-            <w:tcW w:w="760" w:type="dxa"/>
-          </w:tcPr>
-          <w:p>
-            <w:pPr>
               <w:keepNext/>
               <w:spacing w:before="0" w:after="0" w:line="240" w:lineRule="auto"/>
               <w:jc w:val="left"/>
@@ -9849,7 +9776,7 @@
                 <w:sz w:val="28"/>
                 <w:szCs w:val="28"/>
               </w:rPr>
-              <w:t xml:space="preserve">K.</w:t>
+              <w:t xml:space="preserve">J.</w:t>
             </w:r>
           </w:p>
         </w:tc>

</xml_diff>